<commit_message>
Update manuscript text and formatting
- Add a table describing category assignments to the Results branch of the manuscript
- Update text of manuscript and figure references throughout
- Set `notebook-view` and `notebook-links` options to false in `nature-pdf` configuration
- Adjust LaTeX imports in corresponding JSON execution files and regenerate manuscripts
</commit_message>
<xml_diff>
--- a/manuscript/_manuscript/manuscript.docx
+++ b/manuscript/_manuscript/manuscript.docx
@@ -56,7 +56,7 @@
         <w:t xml:space="preserve"> </w:t>
       </w:r>
       <w:r>
-        <w:t xml:space="preserve">KU Leuven, Microbiology, Immunology and Transplantation, Clincial and Epidemiological Virology, Herestraat 49, box 1040, Leuven, 3000, Belgium</w:t>
+        <w:t xml:space="preserve">KU Leuven, Microbiology, Immunology and Transplantation, Clinical and Epidemiological Virology, Herestraat 49, box 1040, Leuven, 3000, Belgium</w:t>
       </w:r>
       <w:r>
         <w:br/>
@@ -204,7 +204,7 @@
         </w:numPr>
       </w:pPr>
       <w:r>
-        <w:t xml:space="preserve">TODO: which conversions from hypothetical protein to informative (phages?)</w:t>
+        <w:t xml:space="preserve">TODO: which conversions from hypothetical protein to informative</w:t>
       </w:r>
     </w:p>
     <w:p>
@@ -240,7 +240,7 @@
         </w:numPr>
       </w:pPr>
       <w:r>
-        <w:t xml:space="preserve">☐ TODO: add recall, precision and F1 plots</w:t>
+        <w:t xml:space="preserve">☐ TODO: add recall, precision and F1 plots -&gt; see also Figure 3C</w:t>
       </w:r>
     </w:p>
     <w:p>
@@ -276,7 +276,7 @@
         </w:numPr>
       </w:pPr>
       <w:r>
-        <w:t xml:space="preserve">☐ TODO: look at p-value for Reseek and see if this improves annotations</w:t>
+        <w:t xml:space="preserve">☒ TODO: look at p-value for Reseek and see if this improves annotations -&gt; still very lenient (p&lt;0.05)</w:t>
       </w:r>
     </w:p>
     <w:p>
@@ -336,7 +336,19 @@
         <w:pStyle w:val="FirstParagraph"/>
       </w:pPr>
       <w:r>
-        <w:t xml:space="preserve">The advent of protein language models (pLMs) and structural prediction promises new avenues for protein annotation through structure homology. Earlier work (eg. Phold) has shown protein strucural homology annotation works well for prokaryotic viruses. To leverage these new techniques for protein annotation of eukaryotic viruses, we benchmarked four recent embedding- and structure-based methods in comparison with the gold standard of sequence-based annotation. We selected 10% of the entries in ICTV’s VMR v40.2 that did not have bacteria or archaea as designated host (n=1,054), and subsequently retrieved all associated proteins from NCBI (n=11,360). Boltz-2 structure prediction of these proteins produced generally high-quality models (median pLDDT 71.3). Using the structures and protein sequences of the entries in the Big Fantastic Virus Database (BFVD), we queried the VMR proteins with Blastp, Diamond, and MMseqs2 (sequence), TEA and ProstT5-3Di (embedding) and Foldseek and Reseek (structure). Sequence homology-based methods showed a high overlap in hits, whereas the other methods had low intra- and inter-method agreement in hits between themselves and the sequence-based methods. Additionally, all methods improved the number of informative categories (ie. not “hypothetical protein”) for the VMR proteins, with embedding and structure methods producing the largest increases. However, when evaluated against proteins with informative GenBank annotations as ground truth (n=2,938), embedding- and structure-based methods agreed less often with the ground truth than sequence-based methods (~67% and ~76% vs ~83%, respectively). Overall, sequence homology remains the most accurate approach for protein annotation of eukaryotic viruses at present.</w:t>
+        <w:t xml:space="preserve">The advent of protein language models (pLMs) and structural prediction promises new avenues for protein annotation through structure homology. Earlier work (eg. Phold) has shown protein strucural homology annotation works well for prokaryotic viruses. To leverage these new techniques for protein annotation of eukaryotic viruses, we benchmarked four recent embedding- and structure-based methods in comparison with the gold standard of sequence-based annotation. We selected 10% of the entries in ICTV’s VMR v40.2 that did not have bacteria or archaea as designated host (n=1,054), and subsequently retrieved all associated proteins from NCBI (n=11,360). Boltz-2 structure prediction of these proteins produced generally high-quality models (median pLDDT 71.3). Using the structures and protein sequences of the entries in the Big Fantastic Virus Database (BFVD), we queried the VMR proteins with Blastp, Diamond, and MMseqs2 (sequence); TEA and ProstT5-3Di (embedding); and Foldseek and Reseek (structure). Sequence homology-based methods showed a high overlap in hits, whereas the other methods had low intra- and inter-method agreement in hits between themselves and the sequence-based methods. Additionally, all methods improved the number of informative categories (ie. not “hypothetical protein”) for the VMR proteins, with embedding and structure methods producing the largest increases. However, when evaluated against proteins with informative GenBank annotations as ground truth (n=2,938), embedding- and structure-based methods agreed less often with the</w:t>
+      </w:r>
+      <w:r>
+        <w:t xml:space="preserve"> </w:t>
+      </w:r>
+      <w:r>
+        <w:t xml:space="preserve">“ground truth”</w:t>
+      </w:r>
+      <w:r>
+        <w:t xml:space="preserve"> </w:t>
+      </w:r>
+      <w:r>
+        <w:t xml:space="preserve">than sequence-based methods (~67% and ~76% vs ~83%, respectively). Overall, sequence homology remains the most accurate approach for protein annotation of eukaryotic viruses at present.</w:t>
       </w:r>
     </w:p>
     <w:bookmarkEnd w:id="11"/>
@@ -350,7 +362,7 @@
       </w:r>
     </w:p>
     <w:bookmarkEnd w:id="12"/>
-    <w:bookmarkStart w:id="33" w:name="results-discussion"/>
+    <w:bookmarkStart w:id="35" w:name="results-discussion"/>
     <w:p>
       <w:pPr>
         <w:pStyle w:val="Heading1"/>
@@ -552,7 +564,7 @@
         <w:pStyle w:val="FirstParagraph"/>
       </w:pPr>
       <w:r>
-        <w:t xml:space="preserve">We started by evaluating how many of the proteins in our test set got a hit against the BFVD for each method (see</w:t>
+        <w:t xml:space="preserve">We started by evaluating how many of the proteins in our test produced at least one match against the BFVD for each method (see</w:t>
       </w:r>
       <w:r>
         <w:t xml:space="preserve"> </w:t>
@@ -566,7 +578,30 @@
         </w:r>
       </w:hyperlink>
       <w:r>
-        <w:t xml:space="preserve">A). In addition, we also filtered the results of each method on an E-value lower than 1e-03 to see how this affected the number of hits for each test protein, which decreased the number of test proteins with a hit on average with 25% for the structure methods. The methods relying on structure homology clearly had a lower number of test proteins with hits against the BFVD compared to the sequence homology-based methods. In contrast, TEA, as only non-protein sequence based method, had a comparable number of test proteins with a hit to the sequence based methods, almost reaching the total number of test proteins (n=11,354). However, analyzing the total number of hits at different E-value thresholds shows that TEA will result in a very high number of hits across all E-value thresholds, signifying a high number of false positives (see</w:t>
+        <w:t xml:space="preserve">A). In addition, we also filtered the results of each method on an E-value lower than 1e-03 to see how this affected the number of hits for each test protein. This decreased the number of test proteins with a hit on average with 25% for the structure methods. The methods relying on structure homology clearly had less matches compared to the sequence homology-based methods. This suggests that sequence based methods are still more sensitive in detecting homology for eukaryotic viruses than structure based methods, despite the promising results for bacteriophages</w:t>
+      </w:r>
+      <w:r>
+        <w:rPr>
+          <w:vertAlign w:val="superscript"/>
+        </w:rPr>
+        <w:t xml:space="preserve">1</w:t>
+      </w:r>
+      <w:r>
+        <w:t xml:space="preserve">. As the quality of our structure predictions was rather high (see</w:t>
+      </w:r>
+      <w:r>
+        <w:t xml:space="preserve"> </w:t>
+      </w:r>
+      <w:hyperlink w:anchor="fig-overview">
+        <w:r>
+          <w:rPr>
+            <w:rStyle w:val="Hyperlink"/>
+          </w:rPr>
+          <w:t xml:space="preserve">Figure 1</w:t>
+        </w:r>
+      </w:hyperlink>
+      <w:r>
+        <w:t xml:space="preserve">B), this lower sensitivity is likely not due to poor structure predictions. In contrast, TEA, as only non-protein sequence based method, had a comparable number of test proteins with a match to the sequence based methods, almost reaching the total number of test proteins (n=11,354). However, analyzing the total number of hits at different E-value thresholds shows that TEA will result in a very high number of matches across all E-value thresholds, signifying a high number of false positives (see</w:t>
       </w:r>
       <w:r>
         <w:t xml:space="preserve"> </w:t>
@@ -580,13 +615,13 @@
         </w:r>
       </w:hyperlink>
       <w:r>
-        <w:t xml:space="preserve">B). A similar pattern is observed for the other structure based methods which at high E-values tend to find too many hits. Reseek was less affected by this, due to a combination of already calculating E-values more accurately</w:t>
+        <w:t xml:space="preserve">B). A similar pattern is observed for the other structure based methods, which tend to find too many hits at high E-values. Reseek was less affected by this, due to a combination of already calculating E-values more accurately</w:t>
       </w:r>
       <w:r>
         <w:rPr>
           <w:vertAlign w:val="superscript"/>
         </w:rPr>
-        <w:t xml:space="preserve">1,2</w:t>
+        <w:t xml:space="preserve">2,3</w:t>
       </w:r>
       <w:r>
         <w:t xml:space="preserve"> </w:t>
@@ -606,30 +641,7 @@
         </w:r>
       </w:hyperlink>
       <w:r>
-        <w:t xml:space="preserve">). On the other hand, the three sequence based methods had a similar number of test proteins with a hit (BLASTp=11,359; MMseqs2=11,255 and Diamond=11,224), but don’t show this inflation of total hits at higher E-values (BLASTp has a slight increase towards larger E-values). This suggests that sequence based methods are still more sensitive in detecting homology for eukaryotic viruses than structure based methods, despite the promising results for bacteriophages</w:t>
-      </w:r>
-      <w:r>
-        <w:rPr>
-          <w:vertAlign w:val="superscript"/>
-        </w:rPr>
-        <w:t xml:space="preserve">3</w:t>
-      </w:r>
-      <w:r>
-        <w:t xml:space="preserve">. As the quality of our structure predictions was rather high (see</w:t>
-      </w:r>
-      <w:r>
-        <w:t xml:space="preserve"> </w:t>
-      </w:r>
-      <w:hyperlink w:anchor="fig-overview">
-        <w:r>
-          <w:rPr>
-            <w:rStyle w:val="Hyperlink"/>
-          </w:rPr>
-          <w:t xml:space="preserve">Figure 1</w:t>
-        </w:r>
-      </w:hyperlink>
-      <w:r>
-        <w:t xml:space="preserve">B), this lower sensitivity is likely not due to poor structure predictions.</w:t>
+        <w:t xml:space="preserve">). On the other hand, the three sequence based methods had a similar number of test proteins with a hit (BLASTp=11,359; MMseqs2=11,255 and Diamond=11,224), but don’t show this inflation of total hits at higher E-values (BLASTp has a slight increase towards larger E-values).</w:t>
       </w:r>
     </w:p>
     <w:p>
@@ -637,7 +649,7 @@
         <w:pStyle w:val="BodyText"/>
       </w:pPr>
       <w:r>
-        <w:t xml:space="preserve">When comparing the BFVD hits yielded by all methods against each other (see</w:t>
+        <w:t xml:space="preserve">When comparing the BFVD matches yielded by all methods against each other (see</w:t>
       </w:r>
       <w:r>
         <w:t xml:space="preserve"> </w:t>
@@ -665,7 +677,7 @@
         </w:r>
       </w:hyperlink>
       <w:r>
-        <w:t xml:space="preserve">), we observed as expected that the sequence homology-based methods had a high overlap in shared hits. This was true when comparing the best 25 hits for each test protein, the best 25 hits afterwards filtered on E-value and only the top hits (see</w:t>
+        <w:t xml:space="preserve">), we observed as expected that the sequence homology-based methods had a high overlap in shared hits. This was true when comparing the best 25 hits for each test protein (only the comparison of diamond and mmseqs2 against blastp had a low overlap because of the higher amount of hits for blastp), the best 25 hits afterwards filtered on E-value and only the top hits (see</w:t>
       </w:r>
       <w:r>
         <w:t xml:space="preserve"> </w:t>
@@ -693,7 +705,7 @@
         </w:r>
       </w:hyperlink>
       <w:r>
-        <w:t xml:space="preserve">). In contrast, the embedding and structure homology based methods had low intra-method agreement in resulting hits (~25% between the embedding methods and ~40-75% for the structure methods on the best 25 hits). The percentage of overlapping hits did increase when only looking at the top hits but stayed well below the percentage of overlap between the sequence based methods. It is worth noting that Reseek seemed to perform worse in this metric when looking at the filtered results (see</w:t>
+        <w:t xml:space="preserve">). In contrast, the embedding and structure homology based methods had low intra-method agreement in resulting hits (~25% between the embedding methods and ~40-75% for the structure methods on the best 25 hits). The percentage of overlapping hits did increase when only looking at the top hits, but stayed well below the percentage of overlap between the sequence based methods. It is worth noting that Reseek seemed to perform worse in this metric when looking at the filtered results (see</w:t>
       </w:r>
       <w:r>
         <w:t xml:space="preserve"> </w:t>
@@ -707,64 +719,16 @@
         </w:r>
       </w:hyperlink>
       <w:r>
-        <w:t xml:space="preserve">B), however this is due to the large reduction in number of hits after filtering. This reduction is due to the more stringent E-value calculations in Reseek compared to Foldseek</w:t>
+        <w:t xml:space="preserve">B), however this is due to the large reduction in number of matches after filtering. This reduction is due to the more stringent E-value calculations in Reseek compared to Foldseek</w:t>
       </w:r>
       <w:r>
         <w:rPr>
           <w:vertAlign w:val="superscript"/>
         </w:rPr>
-        <w:t xml:space="preserve">1,2</w:t>
-      </w:r>
-      <w:r>
-        <w:t xml:space="preserve">. Notably, while ProstT5 was the worst performer across the three datasets compared to the sequence methods, TEA performed better in the top hits comparison and was on par with the structure based methods.</w:t>
-      </w:r>
-    </w:p>
-    <w:p>
-      <w:pPr>
-        <w:pStyle w:val="BodyText"/>
-      </w:pPr>
-      <w:r>
-        <w:t xml:space="preserve">Overall, the embedding and structure based methods, that should be better to detect remote homologs, had low agreement on shared hits among each other. And although they did find more hits for the test proteins (see y-axis</w:t>
-      </w:r>
-      <w:r>
-        <w:t xml:space="preserve"> </w:t>
-      </w:r>
-      <w:hyperlink w:anchor="fig-overlap">
-        <w:r>
-          <w:rPr>
-            <w:rStyle w:val="Hyperlink"/>
-          </w:rPr>
-          <w:t xml:space="preserve">Figure 2</w:t>
-        </w:r>
-      </w:hyperlink>
-      <w:r>
-        <w:t xml:space="preserve">B), this was almost entirely removed after filtering the hits on E-value (see y-axis</w:t>
-      </w:r>
-      <w:r>
-        <w:t xml:space="preserve"> </w:t>
-      </w:r>
-      <w:hyperlink w:anchor="fig-overlap">
-        <w:r>
-          <w:rPr>
-            <w:rStyle w:val="Hyperlink"/>
-          </w:rPr>
-          <w:t xml:space="preserve">Figure 2</w:t>
-        </w:r>
-      </w:hyperlink>
-      <w:r>
-        <w:t xml:space="preserve">C). This effect was most pronounced for Reseek, which claims to calculate the most correct E-values</w:t>
-      </w:r>
-      <w:r>
-        <w:rPr>
-          <w:vertAlign w:val="superscript"/>
-        </w:rPr>
-        <w:t xml:space="preserve">1</w:t>
-      </w:r>
-      <w:r>
-        <w:t xml:space="preserve"> </w:t>
-      </w:r>
-      <w:r>
-        <w:t xml:space="preserve">and thus leaving the question if the Foldseek searches do not report too many false positives.</w:t>
+        <w:t xml:space="preserve">2,3</w:t>
+      </w:r>
+      <w:r>
+        <w:t xml:space="preserve">. Notably, while ProstT5 was the worst performer across the three datasets compared to the sequence methods, TEA performed better in the top hits comparison and was on par with the structure based methods. Overall, the embedding and structure based methods, that should be better to detect remote homologs, had low agreement on shared hits among each other.</w:t>
       </w:r>
     </w:p>
     <w:tbl>
@@ -847,7 +811,7 @@
       </w:tr>
     </w:tbl>
     <w:bookmarkEnd w:id="22"/>
-    <w:bookmarkStart w:id="27" w:name="functional-annotation-comparison"/>
+    <w:bookmarkStart w:id="29" w:name="functional-annotation-comparison"/>
     <w:p>
       <w:pPr>
         <w:pStyle w:val="Heading2"/>
@@ -875,15 +839,7 @@
         </w:r>
       </w:hyperlink>
       <w:r>
-        <w:t xml:space="preserve">). This showed that</w:t>
-      </w:r>
-    </w:p>
-    <w:p>
-      <w:pPr>
-        <w:pStyle w:val="BodyText"/>
-      </w:pPr>
-      <w:r>
-        <w:t xml:space="preserve">To evaluate the accuracy of the benchmarked methods, we considered the test proteins with an informative annotation (n=2,938) as the ground truth to compare our results to. All methods improved the number of informative categories (see</w:t>
+        <w:t xml:space="preserve">). To evaluate the accuracy of the benchmarked methods, we considered the test proteins with an originally informative annotation (n=2,938) as the ground truth to compare our results to. All methods improved the number of informative categories (see</w:t>
       </w:r>
       <w:r>
         <w:t xml:space="preserve"> </w:t>
@@ -897,7 +853,7 @@
         </w:r>
       </w:hyperlink>
       <w:r>
-        <w:t xml:space="preserve">A), with the sequence based methods, together with TEA and Foldseek, improving the number of informative assignments the most. However, when comparing the functional annotations to the</w:t>
+        <w:t xml:space="preserve">A), with the sequence based methods, together with TEA and Boltz-Foldseek, improving the number of informative assignments the most. However, when comparing the functional annotations to the</w:t>
       </w:r>
       <w:r>
         <w:t xml:space="preserve"> </w:t>
@@ -906,7 +862,7 @@
         <w:t xml:space="preserve">“ground truth”</w:t>
       </w:r>
       <w:r>
-        <w:t xml:space="preserve">, all embedding and structure based methods underperformed compared to the sequence based methods (maximum ~67% and ~76% vs ~83% agreement with ground truth; see</w:t>
+        <w:t xml:space="preserve">, all embedding and structure based methods underperformed compared to the sequence based methods (maximum ~67% and ~78% vs ~84% agreement with ground truth; see</w:t>
       </w:r>
       <w:r>
         <w:t xml:space="preserve"> </w:t>
@@ -921,6 +877,92 @@
       </w:hyperlink>
       <w:r>
         <w:t xml:space="preserve">B).</w:t>
+      </w:r>
+    </w:p>
+    <w:p>
+      <w:pPr>
+        <w:pStyle w:val="BodyText"/>
+      </w:pPr>
+      <w:r>
+        <w:t xml:space="preserve">Although TEA made the largest improvements in assigning previous uninformative proteins to informative categories, it also showed the greatest inconsistencies between assigned informative categories that were already informative in the original test set (see</w:t>
+      </w:r>
+      <w:r>
+        <w:t xml:space="preserve"> </w:t>
+      </w:r>
+      <w:hyperlink w:anchor="fig-annotation">
+        <w:r>
+          <w:rPr>
+            <w:rStyle w:val="Hyperlink"/>
+          </w:rPr>
+          <w:t xml:space="preserve">Figure 3</w:t>
+        </w:r>
+      </w:hyperlink>
+      <w:r>
+        <w:t xml:space="preserve">C). In addition, it also has 387 queries that were changed from an informative function to a non-informative one, which is almost double the amount compared to blastp which had the second highest informative-to-uninformative reassignments (see</w:t>
+      </w:r>
+      <w:r>
+        <w:t xml:space="preserve"> </w:t>
+      </w:r>
+      <w:hyperlink w:anchor="fig-annotation">
+        <w:r>
+          <w:rPr>
+            <w:rStyle w:val="Hyperlink"/>
+          </w:rPr>
+          <w:t xml:space="preserve">Figure 3</w:t>
+        </w:r>
+      </w:hyperlink>
+      <w:r>
+        <w:t xml:space="preserve">C and</w:t>
+      </w:r>
+      <w:r>
+        <w:t xml:space="preserve"> </w:t>
+      </w:r>
+      <w:hyperlink w:anchor="tbl-assigned-categories">
+        <w:r>
+          <w:rPr>
+            <w:rStyle w:val="Hyperlink"/>
+          </w:rPr>
+          <w:t xml:space="preserve">Table 1</w:t>
+        </w:r>
+      </w:hyperlink>
+      <w:r>
+        <w:t xml:space="preserve">). The same applies to the number of test proteins that originally had an informative category, but was assigned a different category with TEA (n=2723). Furthermore, due to the likely high number of false positives in TEA hits (see</w:t>
+      </w:r>
+      <w:r>
+        <w:t xml:space="preserve"> </w:t>
+      </w:r>
+      <w:hyperlink w:anchor="fig-overlap">
+        <w:r>
+          <w:rPr>
+            <w:rStyle w:val="Hyperlink"/>
+          </w:rPr>
+          <w:t xml:space="preserve">Figure 2</w:t>
+        </w:r>
+      </w:hyperlink>
+      <w:r>
+        <w:t xml:space="preserve">B), we concluded that the TEA uninformative-to-informative assignments lacked reliability.</w:t>
+      </w:r>
+    </w:p>
+    <w:p>
+      <w:pPr>
+        <w:pStyle w:val="BodyText"/>
+      </w:pPr>
+      <w:r>
+        <w:t xml:space="preserve">Of note, Boltz structure prediction combined with Foldseek structure comparison did assign more informative categories than the sequence-based methods to originally non-informative proteins (n=1,571 vs ~1400; see</w:t>
+      </w:r>
+      <w:r>
+        <w:t xml:space="preserve"> </w:t>
+      </w:r>
+      <w:hyperlink w:anchor="tbl-assigned-categories">
+        <w:r>
+          <w:rPr>
+            <w:rStyle w:val="Hyperlink"/>
+          </w:rPr>
+          <w:t xml:space="preserve">Table 1</w:t>
+        </w:r>
+      </w:hyperlink>
+      <w:r>
+        <w:t xml:space="preserve">). However, this method did retrieve less test proteins with hits against the BFVD.</w:t>
       </w:r>
     </w:p>
     <w:tbl>
@@ -1032,80 +1074,12 @@
         </w:tc>
       </w:tr>
     </w:tbl>
-    <w:bookmarkEnd w:id="27"/>
-    <w:bookmarkStart w:id="32" w:name="computational-benchmarking"/>
-    <w:p>
-      <w:pPr>
-        <w:pStyle w:val="Heading2"/>
-      </w:pPr>
-      <w:r>
-        <w:t xml:space="preserve">Computational benchmarking</w:t>
-      </w:r>
-    </w:p>
-    <w:p>
-      <w:pPr>
-        <w:pStyle w:val="FirstParagraph"/>
-      </w:pPr>
-      <w:r>
-        <w:t xml:space="preserve">All search methods were benchmarked for runtime and memory usage using Hyperfine</w:t>
-      </w:r>
-      <w:r>
-        <w:rPr>
-          <w:vertAlign w:val="superscript"/>
-        </w:rPr>
-        <w:t xml:space="preserve">4</w:t>
-      </w:r>
-      <w:r>
-        <w:t xml:space="preserve"> </w:t>
-      </w:r>
-      <w:r>
-        <w:t xml:space="preserve">and</w:t>
-      </w:r>
-      <w:r>
-        <w:t xml:space="preserve"> </w:t>
-      </w:r>
-      <w:r>
-        <w:rPr>
-          <w:rStyle w:val="VerbatimChar"/>
-        </w:rPr>
-        <w:t xml:space="preserve">nvidia-smi</w:t>
-      </w:r>
-      <w:r>
-        <w:t xml:space="preserve"> </w:t>
-      </w:r>
-      <w:r>
-        <w:t xml:space="preserve">for GPU memory consumption. As expected, the sequence-based methods were much faster and less memory intensive compared to the embedding and structure based methods (see</w:t>
-      </w:r>
-      <w:r>
-        <w:t xml:space="preserve"> </w:t>
-      </w:r>
-      <w:hyperlink w:anchor="fig-computational-benchmark">
-        <w:r>
-          <w:rPr>
-            <w:rStyle w:val="Hyperlink"/>
-          </w:rPr>
-          <w:t xml:space="preserve">Figure 4</w:t>
-        </w:r>
-      </w:hyperlink>
-      <w:r>
-        <w:t xml:space="preserve"> </w:t>
-      </w:r>
-      <w:r>
-        <w:t xml:space="preserve">and</w:t>
-      </w:r>
-      <w:r>
-        <w:t xml:space="preserve"> </w:t>
-      </w:r>
-      <w:hyperlink w:anchor="suppfig-time-increase">
-        <w:r>
-          <w:rPr>
-            <w:rStyle w:val="Hyperlink"/>
-          </w:rPr>
-          <w:t xml:space="preserve">Supplemental Figure 4</w:t>
-        </w:r>
-      </w:hyperlink>
-      <w:r>
-        <w:t xml:space="preserve">). Both Diamond and MMseqs2 finished the search of the &gt;11,000 proteins against the BFVD in under 10 seconds, followed by BLASTp with a runtime of almost two minutes, a ~28x time increase compared to MMseqs2 which was the fastest workflow.</w:t>
+    <w:p>
+      <w:pPr>
+        <w:pStyle w:val="BodyText"/>
+      </w:pPr>
+      <w:r>
+        <w:t xml:space="preserve"> </w:t>
       </w:r>
     </w:p>
     <w:tbl>
@@ -1121,7 +1095,1068 @@
       <w:tr>
         <w:tc>
           <w:tcPr/>
-          <w:bookmarkStart w:id="31" w:name="fig-computational-benchmark"/>
+          <w:bookmarkStart w:id="27" w:name="tbl-assigned-categories"/>
+          <w:p>
+            <w:pPr>
+              <w:jc w:val="center"/>
+            </w:pPr>
+            <w:pPr>
+              <w:jc w:val="left"/>
+              <w:spacing w:before="200"/>
+              <w:pStyle w:val="ImageCaption"/>
+            </w:pPr>
+            <w:r>
+              <w:t xml:space="preserve">Table 1: Information on changes in final category assignments.</w:t>
+            </w:r>
+          </w:p>
+          <w:tbl>
+            <w:tblPr>
+              <w:tblStyle w:val="Table"/>
+              <w:tblW w:type="pct" w:w="5000"/>
+              <w:tblLayout w:type="fixed"/>
+              <w:tblLook w:firstRow="1" w:lastRow="0" w:firstColumn="0" w:lastColumn="0" w:noHBand="0" w:noVBand="0" w:val="0020"/>
+            </w:tblPr>
+            <w:tblGrid>
+              <w:gridCol w:w="743"/>
+              <w:gridCol w:w="875"/>
+              <w:gridCol w:w="787"/>
+              <w:gridCol w:w="1050"/>
+              <w:gridCol w:w="918"/>
+              <w:gridCol w:w="1006"/>
+              <w:gridCol w:w="1225"/>
+              <w:gridCol w:w="1312"/>
+            </w:tblGrid>
+            <w:tr>
+              <w:trPr>
+                <w:tblHeader w:val="on"/>
+              </w:trPr>
+              <w:tc>
+                <w:tcPr/>
+                <w:p>
+                  <w:pPr>
+                    <w:pStyle w:val="Compact"/>
+                    <w:jc w:val="left"/>
+                    <w:jc w:val="center"/>
+                  </w:pPr>
+                  <w:r>
+                    <w:t xml:space="preserve">method</w:t>
+                  </w:r>
+                </w:p>
+              </w:tc>
+              <w:tc>
+                <w:tcPr/>
+                <w:p>
+                  <w:pPr>
+                    <w:pStyle w:val="Compact"/>
+                    <w:jc w:val="right"/>
+                    <w:jc w:val="center"/>
+                  </w:pPr>
+                  <w:r>
+                    <w:t xml:space="preserve">Queries</w:t>
+                  </w:r>
+                  <w:r>
+                    <w:t xml:space="preserve">assigned</w:t>
+                  </w:r>
+                </w:p>
+              </w:tc>
+              <w:tc>
+                <w:tcPr/>
+                <w:p>
+                  <w:pPr>
+                    <w:pStyle w:val="Compact"/>
+                    <w:jc w:val="right"/>
+                    <w:jc w:val="center"/>
+                  </w:pPr>
+                  <w:r>
+                    <w:t xml:space="preserve">Complete</w:t>
+                  </w:r>
+                  <w:r>
+                    <w:t xml:space="preserve">match</w:t>
+                  </w:r>
+                </w:p>
+              </w:tc>
+              <w:tc>
+                <w:tcPr/>
+                <w:p>
+                  <w:pPr>
+                    <w:pStyle w:val="Compact"/>
+                    <w:jc w:val="right"/>
+                    <w:jc w:val="center"/>
+                  </w:pPr>
+                  <w:r>
+                    <w:t xml:space="preserve">Informative</w:t>
+                  </w:r>
+                  <w:r>
+                    <w:t xml:space="preserve">mismatch</w:t>
+                  </w:r>
+                </w:p>
+              </w:tc>
+              <w:tc>
+                <w:tcPr/>
+                <w:p>
+                  <w:pPr>
+                    <w:pStyle w:val="Compact"/>
+                    <w:jc w:val="right"/>
+                    <w:jc w:val="center"/>
+                  </w:pPr>
+                  <w:r>
+                    <w:t xml:space="preserve">Informative</w:t>
+                  </w:r>
+                  <w:r>
+                    <w:t xml:space="preserve">match</w:t>
+                  </w:r>
+                </w:p>
+              </w:tc>
+              <w:tc>
+                <w:tcPr/>
+                <w:p>
+                  <w:pPr>
+                    <w:pStyle w:val="Compact"/>
+                    <w:jc w:val="right"/>
+                    <w:jc w:val="center"/>
+                  </w:pPr>
+                  <w:r>
+                    <w:t xml:space="preserve">Uninformative</w:t>
+                  </w:r>
+                  <w:r>
+                    <w:t xml:space="preserve">match</w:t>
+                  </w:r>
+                </w:p>
+              </w:tc>
+              <w:tc>
+                <w:tcPr/>
+                <w:p>
+                  <w:pPr>
+                    <w:pStyle w:val="Compact"/>
+                    <w:jc w:val="right"/>
+                    <w:jc w:val="center"/>
+                  </w:pPr>
+                  <w:r>
+                    <w:t xml:space="preserve">Informative</w:t>
+                  </w:r>
+                  <w:r>
+                    <w:t xml:space="preserve">reassignment</w:t>
+                  </w:r>
+                </w:p>
+              </w:tc>
+              <w:tc>
+                <w:tcPr/>
+                <w:p>
+                  <w:pPr>
+                    <w:pStyle w:val="Compact"/>
+                    <w:jc w:val="right"/>
+                    <w:jc w:val="center"/>
+                  </w:pPr>
+                  <w:r>
+                    <w:t xml:space="preserve">Uninformative</w:t>
+                  </w:r>
+                  <w:r>
+                    <w:t xml:space="preserve">reassignment</w:t>
+                  </w:r>
+                </w:p>
+              </w:tc>
+            </w:tr>
+            <w:tr>
+              <w:tc>
+                <w:tcPr/>
+                <w:p>
+                  <w:pPr>
+                    <w:pStyle w:val="Compact"/>
+                    <w:jc w:val="left"/>
+                    <w:jc w:val="center"/>
+                  </w:pPr>
+                  <w:r>
+                    <w:t xml:space="preserve">blastp</w:t>
+                  </w:r>
+                </w:p>
+              </w:tc>
+              <w:tc>
+                <w:tcPr/>
+                <w:p>
+                  <w:pPr>
+                    <w:pStyle w:val="Compact"/>
+                    <w:jc w:val="right"/>
+                    <w:jc w:val="center"/>
+                  </w:pPr>
+                  <w:r>
+                    <w:t xml:space="preserve">11177</w:t>
+                  </w:r>
+                </w:p>
+              </w:tc>
+              <w:tc>
+                <w:tcPr/>
+                <w:p>
+                  <w:pPr>
+                    <w:pStyle w:val="Compact"/>
+                    <w:jc w:val="right"/>
+                    <w:jc w:val="center"/>
+                  </w:pPr>
+                  <w:r>
+                    <w:t xml:space="preserve">8352</w:t>
+                  </w:r>
+                </w:p>
+              </w:tc>
+              <w:tc>
+                <w:tcPr/>
+                <w:p>
+                  <w:pPr>
+                    <w:pStyle w:val="Compact"/>
+                    <w:jc w:val="right"/>
+                    <w:jc w:val="center"/>
+                  </w:pPr>
+                  <w:r>
+                    <w:t xml:space="preserve">1216</w:t>
+                  </w:r>
+                </w:p>
+              </w:tc>
+              <w:tc>
+                <w:tcPr/>
+                <w:p>
+                  <w:pPr>
+                    <w:pStyle w:val="Compact"/>
+                    <w:jc w:val="right"/>
+                    <w:jc w:val="center"/>
+                  </w:pPr>
+                  <w:r>
+                    <w:t xml:space="preserve">2331</w:t>
+                  </w:r>
+                </w:p>
+              </w:tc>
+              <w:tc>
+                <w:tcPr/>
+                <w:p>
+                  <w:pPr>
+                    <w:pStyle w:val="Compact"/>
+                    <w:jc w:val="right"/>
+                    <w:jc w:val="center"/>
+                  </w:pPr>
+                  <w:r>
+                    <w:t xml:space="preserve">6021</w:t>
+                  </w:r>
+                </w:p>
+              </w:tc>
+              <w:tc>
+                <w:tcPr/>
+                <w:p>
+                  <w:pPr>
+                    <w:pStyle w:val="Compact"/>
+                    <w:jc w:val="right"/>
+                    <w:jc w:val="center"/>
+                  </w:pPr>
+                  <w:r>
+                    <w:t xml:space="preserve">1399</w:t>
+                  </w:r>
+                </w:p>
+              </w:tc>
+              <w:tc>
+                <w:tcPr/>
+                <w:p>
+                  <w:pPr>
+                    <w:pStyle w:val="Compact"/>
+                    <w:jc w:val="right"/>
+                    <w:jc w:val="center"/>
+                  </w:pPr>
+                  <w:r>
+                    <w:t xml:space="preserve">210</w:t>
+                  </w:r>
+                </w:p>
+              </w:tc>
+            </w:tr>
+            <w:tr>
+              <w:tc>
+                <w:tcPr/>
+                <w:p>
+                  <w:pPr>
+                    <w:pStyle w:val="Compact"/>
+                    <w:jc w:val="left"/>
+                    <w:jc w:val="center"/>
+                  </w:pPr>
+                  <w:r>
+                    <w:t xml:space="preserve">diamond</w:t>
+                  </w:r>
+                </w:p>
+              </w:tc>
+              <w:tc>
+                <w:tcPr/>
+                <w:p>
+                  <w:pPr>
+                    <w:pStyle w:val="Compact"/>
+                    <w:jc w:val="right"/>
+                    <w:jc w:val="center"/>
+                  </w:pPr>
+                  <w:r>
+                    <w:t xml:space="preserve">11119</w:t>
+                  </w:r>
+                </w:p>
+              </w:tc>
+              <w:tc>
+                <w:tcPr/>
+                <w:p>
+                  <w:pPr>
+                    <w:pStyle w:val="Compact"/>
+                    <w:jc w:val="right"/>
+                    <w:jc w:val="center"/>
+                  </w:pPr>
+                  <w:r>
+                    <w:t xml:space="preserve">8300</w:t>
+                  </w:r>
+                </w:p>
+              </w:tc>
+              <w:tc>
+                <w:tcPr/>
+                <w:p>
+                  <w:pPr>
+                    <w:pStyle w:val="Compact"/>
+                    <w:jc w:val="right"/>
+                    <w:jc w:val="center"/>
+                  </w:pPr>
+                  <w:r>
+                    <w:t xml:space="preserve">1206</w:t>
+                  </w:r>
+                </w:p>
+              </w:tc>
+              <w:tc>
+                <w:tcPr/>
+                <w:p>
+                  <w:pPr>
+                    <w:pStyle w:val="Compact"/>
+                    <w:jc w:val="right"/>
+                    <w:jc w:val="center"/>
+                  </w:pPr>
+                  <w:r>
+                    <w:t xml:space="preserve">2332</w:t>
+                  </w:r>
+                </w:p>
+              </w:tc>
+              <w:tc>
+                <w:tcPr/>
+                <w:p>
+                  <w:pPr>
+                    <w:pStyle w:val="Compact"/>
+                    <w:jc w:val="right"/>
+                    <w:jc w:val="center"/>
+                  </w:pPr>
+                  <w:r>
+                    <w:t xml:space="preserve">5968</w:t>
+                  </w:r>
+                </w:p>
+              </w:tc>
+              <w:tc>
+                <w:tcPr/>
+                <w:p>
+                  <w:pPr>
+                    <w:pStyle w:val="Compact"/>
+                    <w:jc w:val="right"/>
+                    <w:jc w:val="center"/>
+                  </w:pPr>
+                  <w:r>
+                    <w:t xml:space="preserve">1412</w:t>
+                  </w:r>
+                </w:p>
+              </w:tc>
+              <w:tc>
+                <w:tcPr/>
+                <w:p>
+                  <w:pPr>
+                    <w:pStyle w:val="Compact"/>
+                    <w:jc w:val="right"/>
+                    <w:jc w:val="center"/>
+                  </w:pPr>
+                  <w:r>
+                    <w:t xml:space="preserve">201</w:t>
+                  </w:r>
+                </w:p>
+              </w:tc>
+            </w:tr>
+            <w:tr>
+              <w:tc>
+                <w:tcPr/>
+                <w:p>
+                  <w:pPr>
+                    <w:pStyle w:val="Compact"/>
+                    <w:jc w:val="left"/>
+                    <w:jc w:val="center"/>
+                  </w:pPr>
+                  <w:r>
+                    <w:t xml:space="preserve">mmseqs2</w:t>
+                  </w:r>
+                </w:p>
+              </w:tc>
+              <w:tc>
+                <w:tcPr/>
+                <w:p>
+                  <w:pPr>
+                    <w:pStyle w:val="Compact"/>
+                    <w:jc w:val="right"/>
+                    <w:jc w:val="center"/>
+                  </w:pPr>
+                  <w:r>
+                    <w:t xml:space="preserve">11135</w:t>
+                  </w:r>
+                </w:p>
+              </w:tc>
+              <w:tc>
+                <w:tcPr/>
+                <w:p>
+                  <w:pPr>
+                    <w:pStyle w:val="Compact"/>
+                    <w:jc w:val="right"/>
+                    <w:jc w:val="center"/>
+                  </w:pPr>
+                  <w:r>
+                    <w:t xml:space="preserve">8314</w:t>
+                  </w:r>
+                </w:p>
+              </w:tc>
+              <w:tc>
+                <w:tcPr/>
+                <w:p>
+                  <w:pPr>
+                    <w:pStyle w:val="Compact"/>
+                    <w:jc w:val="right"/>
+                    <w:jc w:val="center"/>
+                  </w:pPr>
+                  <w:r>
+                    <w:t xml:space="preserve">1213</w:t>
+                  </w:r>
+                </w:p>
+              </w:tc>
+              <w:tc>
+                <w:tcPr/>
+                <w:p>
+                  <w:pPr>
+                    <w:pStyle w:val="Compact"/>
+                    <w:jc w:val="right"/>
+                    <w:jc w:val="center"/>
+                  </w:pPr>
+                  <w:r>
+                    <w:t xml:space="preserve">2335</w:t>
+                  </w:r>
+                </w:p>
+              </w:tc>
+              <w:tc>
+                <w:tcPr/>
+                <w:p>
+                  <w:pPr>
+                    <w:pStyle w:val="Compact"/>
+                    <w:jc w:val="right"/>
+                    <w:jc w:val="center"/>
+                  </w:pPr>
+                  <w:r>
+                    <w:t xml:space="preserve">5979</w:t>
+                  </w:r>
+                </w:p>
+              </w:tc>
+              <w:tc>
+                <w:tcPr/>
+                <w:p>
+                  <w:pPr>
+                    <w:pStyle w:val="Compact"/>
+                    <w:jc w:val="right"/>
+                    <w:jc w:val="center"/>
+                  </w:pPr>
+                  <w:r>
+                    <w:t xml:space="preserve">1408</w:t>
+                  </w:r>
+                </w:p>
+              </w:tc>
+              <w:tc>
+                <w:tcPr/>
+                <w:p>
+                  <w:pPr>
+                    <w:pStyle w:val="Compact"/>
+                    <w:jc w:val="right"/>
+                    <w:jc w:val="center"/>
+                  </w:pPr>
+                  <w:r>
+                    <w:t xml:space="preserve">200</w:t>
+                  </w:r>
+                </w:p>
+              </w:tc>
+            </w:tr>
+            <w:tr>
+              <w:tc>
+                <w:tcPr/>
+                <w:p>
+                  <w:pPr>
+                    <w:pStyle w:val="Compact"/>
+                    <w:jc w:val="left"/>
+                    <w:jc w:val="center"/>
+                  </w:pPr>
+                  <w:r>
+                    <w:t xml:space="preserve">ProstT5-foldseek</w:t>
+                  </w:r>
+                </w:p>
+              </w:tc>
+              <w:tc>
+                <w:tcPr/>
+                <w:p>
+                  <w:pPr>
+                    <w:pStyle w:val="Compact"/>
+                    <w:jc w:val="right"/>
+                    <w:jc w:val="center"/>
+                  </w:pPr>
+                  <w:r>
+                    <w:t xml:space="preserve">7366</w:t>
+                  </w:r>
+                </w:p>
+              </w:tc>
+              <w:tc>
+                <w:tcPr/>
+                <w:p>
+                  <w:pPr>
+                    <w:pStyle w:val="Compact"/>
+                    <w:jc w:val="right"/>
+                    <w:jc w:val="center"/>
+                  </w:pPr>
+                  <w:r>
+                    <w:t xml:space="preserve">4923</w:t>
+                  </w:r>
+                </w:p>
+              </w:tc>
+              <w:tc>
+                <w:tcPr/>
+                <w:p>
+                  <w:pPr>
+                    <w:pStyle w:val="Compact"/>
+                    <w:jc w:val="right"/>
+                    <w:jc w:val="center"/>
+                  </w:pPr>
+                  <w:r>
+                    <w:t xml:space="preserve">916</w:t>
+                  </w:r>
+                </w:p>
+              </w:tc>
+              <w:tc>
+                <w:tcPr/>
+                <w:p>
+                  <w:pPr>
+                    <w:pStyle w:val="Compact"/>
+                    <w:jc w:val="right"/>
+                    <w:jc w:val="center"/>
+                  </w:pPr>
+                  <w:r>
+                    <w:t xml:space="preserve">1810</w:t>
+                  </w:r>
+                </w:p>
+              </w:tc>
+              <w:tc>
+                <w:tcPr/>
+                <w:p>
+                  <w:pPr>
+                    <w:pStyle w:val="Compact"/>
+                    <w:jc w:val="right"/>
+                    <w:jc w:val="center"/>
+                  </w:pPr>
+                  <w:r>
+                    <w:t xml:space="preserve">3113</w:t>
+                  </w:r>
+                </w:p>
+              </w:tc>
+              <w:tc>
+                <w:tcPr/>
+                <w:p>
+                  <w:pPr>
+                    <w:pStyle w:val="Compact"/>
+                    <w:jc w:val="right"/>
+                    <w:jc w:val="center"/>
+                  </w:pPr>
+                  <w:r>
+                    <w:t xml:space="preserve">1371</w:t>
+                  </w:r>
+                </w:p>
+              </w:tc>
+              <w:tc>
+                <w:tcPr/>
+                <w:p>
+                  <w:pPr>
+                    <w:pStyle w:val="Compact"/>
+                    <w:jc w:val="right"/>
+                    <w:jc w:val="center"/>
+                  </w:pPr>
+                  <w:r>
+                    <w:t xml:space="preserve">156</w:t>
+                  </w:r>
+                </w:p>
+              </w:tc>
+            </w:tr>
+            <w:tr>
+              <w:tc>
+                <w:tcPr/>
+                <w:p>
+                  <w:pPr>
+                    <w:pStyle w:val="Compact"/>
+                    <w:jc w:val="left"/>
+                    <w:jc w:val="center"/>
+                  </w:pPr>
+                  <w:r>
+                    <w:t xml:space="preserve">TEA-mmseqs2</w:t>
+                  </w:r>
+                </w:p>
+              </w:tc>
+              <w:tc>
+                <w:tcPr/>
+                <w:p>
+                  <w:pPr>
+                    <w:pStyle w:val="Compact"/>
+                    <w:jc w:val="right"/>
+                    <w:jc w:val="center"/>
+                  </w:pPr>
+                  <w:r>
+                    <w:t xml:space="preserve">11318</w:t>
+                  </w:r>
+                </w:p>
+              </w:tc>
+              <w:tc>
+                <w:tcPr/>
+                <w:p>
+                  <w:pPr>
+                    <w:pStyle w:val="Compact"/>
+                    <w:jc w:val="right"/>
+                    <w:jc w:val="center"/>
+                  </w:pPr>
+                  <w:r>
+                    <w:t xml:space="preserve">5703</w:t>
+                  </w:r>
+                </w:p>
+              </w:tc>
+              <w:tc>
+                <w:tcPr/>
+                <w:p>
+                  <w:pPr>
+                    <w:pStyle w:val="Compact"/>
+                    <w:jc w:val="right"/>
+                    <w:jc w:val="center"/>
+                  </w:pPr>
+                  <w:r>
+                    <w:t xml:space="preserve">2725</w:t>
+                  </w:r>
+                </w:p>
+              </w:tc>
+              <w:tc>
+                <w:tcPr/>
+                <w:p>
+                  <w:pPr>
+                    <w:pStyle w:val="Compact"/>
+                    <w:jc w:val="right"/>
+                    <w:jc w:val="center"/>
+                  </w:pPr>
+                  <w:r>
+                    <w:t xml:space="preserve">1881</w:t>
+                  </w:r>
+                </w:p>
+              </w:tc>
+              <w:tc>
+                <w:tcPr/>
+                <w:p>
+                  <w:pPr>
+                    <w:pStyle w:val="Compact"/>
+                    <w:jc w:val="right"/>
+                    <w:jc w:val="center"/>
+                  </w:pPr>
+                  <w:r>
+                    <w:t xml:space="preserve">3822</w:t>
+                  </w:r>
+                </w:p>
+              </w:tc>
+              <w:tc>
+                <w:tcPr/>
+                <w:p>
+                  <w:pPr>
+                    <w:pStyle w:val="Compact"/>
+                    <w:jc w:val="right"/>
+                    <w:jc w:val="center"/>
+                  </w:pPr>
+                  <w:r>
+                    <w:t xml:space="preserve">2503</w:t>
+                  </w:r>
+                </w:p>
+              </w:tc>
+              <w:tc>
+                <w:tcPr/>
+                <w:p>
+                  <w:pPr>
+                    <w:pStyle w:val="Compact"/>
+                    <w:jc w:val="right"/>
+                    <w:jc w:val="center"/>
+                  </w:pPr>
+                  <w:r>
+                    <w:t xml:space="preserve">387</w:t>
+                  </w:r>
+                </w:p>
+              </w:tc>
+            </w:tr>
+            <w:tr>
+              <w:tc>
+                <w:tcPr/>
+                <w:p>
+                  <w:pPr>
+                    <w:pStyle w:val="Compact"/>
+                    <w:jc w:val="left"/>
+                    <w:jc w:val="center"/>
+                  </w:pPr>
+                  <w:r>
+                    <w:t xml:space="preserve">Boltz-foldseek</w:t>
+                  </w:r>
+                </w:p>
+              </w:tc>
+              <w:tc>
+                <w:tcPr/>
+                <w:p>
+                  <w:pPr>
+                    <w:pStyle w:val="Compact"/>
+                    <w:jc w:val="right"/>
+                    <w:jc w:val="center"/>
+                  </w:pPr>
+                  <w:r>
+                    <w:t xml:space="preserve">8889</w:t>
+                  </w:r>
+                </w:p>
+              </w:tc>
+              <w:tc>
+                <w:tcPr/>
+                <w:p>
+                  <w:pPr>
+                    <w:pStyle w:val="Compact"/>
+                    <w:jc w:val="right"/>
+                    <w:jc w:val="center"/>
+                  </w:pPr>
+                  <w:r>
+                    <w:t xml:space="preserve">6112</w:t>
+                  </w:r>
+                </w:p>
+              </w:tc>
+              <w:tc>
+                <w:tcPr/>
+                <w:p>
+                  <w:pPr>
+                    <w:pStyle w:val="Compact"/>
+                    <w:jc w:val="right"/>
+                    <w:jc w:val="center"/>
+                  </w:pPr>
+                  <w:r>
+                    <w:t xml:space="preserve">1054</w:t>
+                  </w:r>
+                </w:p>
+              </w:tc>
+              <w:tc>
+                <w:tcPr/>
+                <w:p>
+                  <w:pPr>
+                    <w:pStyle w:val="Compact"/>
+                    <w:jc w:val="right"/>
+                    <w:jc w:val="center"/>
+                  </w:pPr>
+                  <w:r>
+                    <w:t xml:space="preserve">2176</w:t>
+                  </w:r>
+                </w:p>
+              </w:tc>
+              <w:tc>
+                <w:tcPr/>
+                <w:p>
+                  <w:pPr>
+                    <w:pStyle w:val="Compact"/>
+                    <w:jc w:val="right"/>
+                    <w:jc w:val="center"/>
+                  </w:pPr>
+                  <w:r>
+                    <w:t xml:space="preserve">3936</w:t>
+                  </w:r>
+                </w:p>
+              </w:tc>
+              <w:tc>
+                <w:tcPr/>
+                <w:p>
+                  <w:pPr>
+                    <w:pStyle w:val="Compact"/>
+                    <w:jc w:val="right"/>
+                    <w:jc w:val="center"/>
+                  </w:pPr>
+                  <w:r>
+                    <w:t xml:space="preserve">1571</w:t>
+                  </w:r>
+                </w:p>
+              </w:tc>
+              <w:tc>
+                <w:tcPr/>
+                <w:p>
+                  <w:pPr>
+                    <w:pStyle w:val="Compact"/>
+                    <w:jc w:val="right"/>
+                    <w:jc w:val="center"/>
+                  </w:pPr>
+                  <w:r>
+                    <w:t xml:space="preserve">152</w:t>
+                  </w:r>
+                </w:p>
+              </w:tc>
+            </w:tr>
+            <w:tr>
+              <w:tc>
+                <w:tcPr/>
+                <w:p>
+                  <w:pPr>
+                    <w:pStyle w:val="Compact"/>
+                    <w:jc w:val="left"/>
+                    <w:jc w:val="center"/>
+                  </w:pPr>
+                  <w:r>
+                    <w:t xml:space="preserve">Boltz-reseek</w:t>
+                  </w:r>
+                </w:p>
+              </w:tc>
+              <w:tc>
+                <w:tcPr/>
+                <w:p>
+                  <w:pPr>
+                    <w:pStyle w:val="Compact"/>
+                    <w:jc w:val="right"/>
+                    <w:jc w:val="center"/>
+                  </w:pPr>
+                  <w:r>
+                    <w:t xml:space="preserve">7065</w:t>
+                  </w:r>
+                </w:p>
+              </w:tc>
+              <w:tc>
+                <w:tcPr/>
+                <w:p>
+                  <w:pPr>
+                    <w:pStyle w:val="Compact"/>
+                    <w:jc w:val="right"/>
+                    <w:jc w:val="center"/>
+                  </w:pPr>
+                  <w:r>
+                    <w:t xml:space="preserve">5119</w:t>
+                  </w:r>
+                </w:p>
+              </w:tc>
+              <w:tc>
+                <w:tcPr/>
+                <w:p>
+                  <w:pPr>
+                    <w:pStyle w:val="Compact"/>
+                    <w:jc w:val="right"/>
+                    <w:jc w:val="center"/>
+                  </w:pPr>
+                  <w:r>
+                    <w:t xml:space="preserve">723</w:t>
+                  </w:r>
+                </w:p>
+              </w:tc>
+              <w:tc>
+                <w:tcPr/>
+                <w:p>
+                  <w:pPr>
+                    <w:pStyle w:val="Compact"/>
+                    <w:jc w:val="right"/>
+                    <w:jc w:val="center"/>
+                  </w:pPr>
+                  <w:r>
+                    <w:t xml:space="preserve">1996</w:t>
+                  </w:r>
+                </w:p>
+              </w:tc>
+              <w:tc>
+                <w:tcPr/>
+                <w:p>
+                  <w:pPr>
+                    <w:pStyle w:val="Compact"/>
+                    <w:jc w:val="right"/>
+                    <w:jc w:val="center"/>
+                  </w:pPr>
+                  <w:r>
+                    <w:t xml:space="preserve">3123</w:t>
+                  </w:r>
+                </w:p>
+              </w:tc>
+              <w:tc>
+                <w:tcPr/>
+                <w:p>
+                  <w:pPr>
+                    <w:pStyle w:val="Compact"/>
+                    <w:jc w:val="right"/>
+                    <w:jc w:val="center"/>
+                  </w:pPr>
+                  <w:r>
+                    <w:t xml:space="preserve">1089</w:t>
+                  </w:r>
+                </w:p>
+              </w:tc>
+              <w:tc>
+                <w:tcPr/>
+                <w:p>
+                  <w:pPr>
+                    <w:pStyle w:val="Compact"/>
+                    <w:jc w:val="right"/>
+                    <w:jc w:val="center"/>
+                  </w:pPr>
+                  <w:r>
+                    <w:t xml:space="preserve">134</w:t>
+                  </w:r>
+                </w:p>
+              </w:tc>
+            </w:tr>
+          </w:tbl>
+          <w:bookmarkEnd w:id="27"/>
+          <w:p/>
+        </w:tc>
+      </w:tr>
+    </w:tbl>
+    <w:p>
+      <w:pPr>
+        <w:pStyle w:val="BodyText"/>
+      </w:pPr>
+      <w:r>
+        <w:rPr>
+          <w:vertAlign w:val="subscript"/>
+        </w:rPr>
+        <w:t xml:space="preserve">Source:</w:t>
+      </w:r>
+      <w:r>
+        <w:rPr>
+          <w:vertAlign w:val="subscript"/>
+        </w:rPr>
+        <w:t xml:space="preserve"> </w:t>
+      </w:r>
+      <w:hyperlink r:id="rId28">
+        <w:r>
+          <w:rPr>
+            <w:rStyle w:val="Hyperlink"/>
+            <w:vertAlign w:val="subscript"/>
+          </w:rPr>
+          <w:t xml:space="preserve">Article Notebook</w:t>
+        </w:r>
+      </w:hyperlink>
+    </w:p>
+    <w:p>
+      <w:pPr>
+        <w:pStyle w:val="Compact"/>
+        <w:numPr>
+          <w:ilvl w:val="0"/>
+          <w:numId w:val="1005"/>
+        </w:numPr>
+      </w:pPr>
+      <w:r>
+        <w:t xml:space="preserve">TODO: add that only 18 non-informative proteins got an informative functional annotation with structure methods (not TEA) compared to the sequence methods (make overlap figures with structures)</w:t>
+      </w:r>
+    </w:p>
+    <w:bookmarkEnd w:id="29"/>
+    <w:bookmarkStart w:id="34" w:name="computational-benchmarking"/>
+    <w:p>
+      <w:pPr>
+        <w:pStyle w:val="Heading2"/>
+      </w:pPr>
+      <w:r>
+        <w:t xml:space="preserve">Computational benchmarking</w:t>
+      </w:r>
+    </w:p>
+    <w:p>
+      <w:pPr>
+        <w:pStyle w:val="FirstParagraph"/>
+      </w:pPr>
+      <w:r>
+        <w:t xml:space="preserve">All search methods were benchmarked for runtime and memory usage using Hyperfine</w:t>
+      </w:r>
+      <w:r>
+        <w:rPr>
+          <w:vertAlign w:val="superscript"/>
+        </w:rPr>
+        <w:t xml:space="preserve">4</w:t>
+      </w:r>
+      <w:r>
+        <w:t xml:space="preserve">, and</w:t>
+      </w:r>
+      <w:r>
+        <w:t xml:space="preserve"> </w:t>
+      </w:r>
+      <w:r>
+        <w:rPr>
+          <w:rStyle w:val="VerbatimChar"/>
+        </w:rPr>
+        <w:t xml:space="preserve">nvidia-smi</w:t>
+      </w:r>
+      <w:r>
+        <w:t xml:space="preserve"> </w:t>
+      </w:r>
+      <w:r>
+        <w:t xml:space="preserve">for GPU memory consumption. As expected, the sequence-based methods were much faster and less memory intensive compared to the embedding and structure based methods (see</w:t>
+      </w:r>
+      <w:r>
+        <w:t xml:space="preserve"> </w:t>
+      </w:r>
+      <w:hyperlink w:anchor="fig-computational-benchmark">
+        <w:r>
+          <w:rPr>
+            <w:rStyle w:val="Hyperlink"/>
+          </w:rPr>
+          <w:t xml:space="preserve">Figure 4</w:t>
+        </w:r>
+      </w:hyperlink>
+      <w:r>
+        <w:t xml:space="preserve"> </w:t>
+      </w:r>
+      <w:r>
+        <w:t xml:space="preserve">and</w:t>
+      </w:r>
+      <w:r>
+        <w:t xml:space="preserve"> </w:t>
+      </w:r>
+      <w:hyperlink w:anchor="suppfig-time-increase">
+        <w:r>
+          <w:rPr>
+            <w:rStyle w:val="Hyperlink"/>
+          </w:rPr>
+          <w:t xml:space="preserve">Supplemental Figure 4</w:t>
+        </w:r>
+      </w:hyperlink>
+      <w:r>
+        <w:t xml:space="preserve">). Both Diamond and MMseqs2 finished the search of the &gt;11,000 proteins against the BFVD in under 10 seconds, followed by BLASTp with a runtime of almost two minutes, a ~28x time increase compared to MMseqs2 which was the fastest workflow. The embedding methods took 52 and 93 times longer than MMseqs2 for TEA and the ProstT5 workflow, respectively. Sequence-based methods were generally compatible with consumer-grade hardware. In contrast, the TEA workflow using the full precision ESM2 model required substantially greater GPU VRAM, necessitating specialized hardware, whereas ProstT5 operated within the memory constraints of consumer-grade GPUs. The structural workflows, by contrast, required over 20,000-fold more runtime than the sequence-based tools (see</w:t>
+      </w:r>
+      <w:r>
+        <w:t xml:space="preserve"> </w:t>
+      </w:r>
+      <w:hyperlink w:anchor="suppfig-time-increase">
+        <w:r>
+          <w:rPr>
+            <w:rStyle w:val="Hyperlink"/>
+          </w:rPr>
+          <w:t xml:space="preserve">Supplemental Figure 4</w:t>
+        </w:r>
+      </w:hyperlink>
+      <w:r>
+        <w:t xml:space="preserve">) and demanded substantial computational resources, exceeding 400 GiB of system memory (CPU) and approximately 80 GiB of GPU memory (see</w:t>
+      </w:r>
+      <w:r>
+        <w:t xml:space="preserve"> </w:t>
+      </w:r>
+      <w:hyperlink w:anchor="fig-computational-benchmark">
+        <w:r>
+          <w:rPr>
+            <w:rStyle w:val="Hyperlink"/>
+          </w:rPr>
+          <w:t xml:space="preserve">Figure 4</w:t>
+        </w:r>
+      </w:hyperlink>
+      <w:r>
+        <w:t xml:space="preserve">). Furthermore, the Reseek structural comparison incurred an additional two-hour runtime, whereas the Foldseek-based structural comparison completed in approximately two minutes.</w:t>
+      </w:r>
+    </w:p>
+    <w:tbl>
+      <w:tblPr>
+        <w:tblStyle w:val="Table"/>
+        <w:tblW w:type="pct" w:w="5000"/>
+        <w:tblLayout w:type="fixed"/>
+        <w:tblLook w:firstRow="0" w:lastRow="0" w:firstColumn="0" w:lastColumn="0" w:noHBand="0" w:noVBand="0" w:val="0000"/>
+      </w:tblPr>
+      <w:tblGrid>
+        <w:gridCol w:w="7920"/>
+      </w:tblGrid>
+      <w:tr>
+        <w:tc>
+          <w:tcPr/>
+          <w:bookmarkStart w:id="33" w:name="fig-computational-benchmark"/>
           <w:p>
             <w:pPr>
               <w:pStyle w:val="Compact"/>
@@ -1132,18 +2167,18 @@
                 <wp:inline>
                   <wp:extent cx="5943600" cy="3962400"/>
                   <wp:effectExtent b="0" l="0" r="0" t="0"/>
-                  <wp:docPr descr="" title="" id="29" name="Picture"/>
+                  <wp:docPr descr="" title="" id="31" name="Picture"/>
                   <a:graphic>
                     <a:graphicData uri="http://schemas.openxmlformats.org/drawingml/2006/picture">
                       <pic:pic>
                         <pic:nvPicPr>
-                          <pic:cNvPr descr="../figures/computational_benchmark/hyperfine_time_vs_memory.pdf" id="30" name="Picture"/>
+                          <pic:cNvPr descr="../figures/computational_benchmark/hyperfine_time_vs_memory.pdf" id="32" name="Picture"/>
                           <pic:cNvPicPr>
                             <a:picLocks noChangeArrowheads="1" noChangeAspect="1"/>
                           </pic:cNvPicPr>
                         </pic:nvPicPr>
                         <pic:blipFill>
-                          <a:blip r:embed="rId28"/>
+                          <a:blip r:embed="rId30"/>
                           <a:stretch>
                             <a:fillRect/>
                           </a:stretch>
@@ -1198,16 +2233,16 @@
               <w:t xml:space="preserve">10</w:t>
             </w:r>
             <w:r>
-              <w:t xml:space="preserve">-transformed memory usage (in GiB). For multistep workflows the indicated time is a cumulation of all steps (arrows indicate directionality of workflow steps). Worklfows are colored by search method, CPU and GPU steps are indicated by circles and triangles respectively. The inset shows the difference in runtime between foldseek and reseek after MSA generation (ColabFold) and structure prediction (Boltz2).</w:t>
+              <w:t xml:space="preserve">-transformed memory usage (in GiB). For multistep workflows the indicated time is a cumulation of all steps (arrows indicate directionality of workflow steps). Workflows are colored by search method, CPU and GPU steps are indicated by circles and triangles respectively. The inset shows the difference in runtime between foldseek and reseek after MSA generation (ColabFold) and structure prediction (Boltz2).</w:t>
             </w:r>
           </w:p>
-          <w:bookmarkEnd w:id="31"/>
+          <w:bookmarkEnd w:id="33"/>
         </w:tc>
       </w:tr>
     </w:tbl>
-    <w:bookmarkEnd w:id="32"/>
-    <w:bookmarkEnd w:id="33"/>
-    <w:bookmarkStart w:id="34" w:name="conclusion"/>
+    <w:bookmarkEnd w:id="34"/>
+    <w:bookmarkEnd w:id="35"/>
+    <w:bookmarkStart w:id="36" w:name="conclusion"/>
     <w:p>
       <w:pPr>
         <w:pStyle w:val="Heading1"/>
@@ -1227,7 +2262,7 @@
         <w:rPr>
           <w:vertAlign w:val="superscript"/>
         </w:rPr>
-        <w:t xml:space="preserve">1,5,6</w:t>
+        <w:t xml:space="preserve">2,5,6</w:t>
       </w:r>
       <w:r>
         <w:t xml:space="preserve">, including bacteriophage protein searches</w:t>
@@ -1236,14 +2271,26 @@
         <w:rPr>
           <w:vertAlign w:val="superscript"/>
         </w:rPr>
-        <w:t xml:space="preserve">3</w:t>
+        <w:t xml:space="preserve">1</w:t>
       </w:r>
       <w:r>
         <w:t xml:space="preserve">, this does not seem to be the case for eukaryotic virus proteins. If we consider that structural homology searches are most useful to find homologs with a clearly defined protein structure, a possible explanation could be that most structural proteins (eg. capsid proteins) are already well annotated in sequence databases compared to more globular, complex proteins, and therefore the advantage of using structural homology searches in eukaryotic virus protein annotation might be limited.</w:t>
       </w:r>
     </w:p>
-    <w:bookmarkEnd w:id="34"/>
-    <w:bookmarkStart w:id="54" w:name="material-and-methods"/>
+    <w:p>
+      <w:pPr>
+        <w:pStyle w:val="Compact"/>
+        <w:numPr>
+          <w:ilvl w:val="0"/>
+          <w:numId w:val="1006"/>
+        </w:numPr>
+      </w:pPr>
+      <w:r>
+        <w:t xml:space="preserve">considerably higher runtime for little reward</w:t>
+      </w:r>
+    </w:p>
+    <w:bookmarkEnd w:id="36"/>
+    <w:bookmarkStart w:id="56" w:name="material-and-methods"/>
     <w:p>
       <w:pPr>
         <w:pStyle w:val="Heading1"/>
@@ -1252,7 +2299,7 @@
         <w:t xml:space="preserve">Material and Methods</w:t>
       </w:r>
     </w:p>
-    <w:bookmarkStart w:id="37" w:name="dataset-selection"/>
+    <w:bookmarkStart w:id="39" w:name="dataset-selection"/>
     <w:p>
       <w:pPr>
         <w:pStyle w:val="Heading2"/>
@@ -1261,7 +2308,7 @@
         <w:t xml:space="preserve">Dataset selection</w:t>
       </w:r>
     </w:p>
-    <w:bookmarkStart w:id="35" w:name="test-set"/>
+    <w:bookmarkStart w:id="37" w:name="test-set"/>
     <w:p>
       <w:pPr>
         <w:pStyle w:val="Heading3"/>
@@ -1312,8 +2359,8 @@
         <w:t xml:space="preserve">). This resulted in a final test set of 11,467 protein sequences from 1,000 eukaryotic virus species.</w:t>
       </w:r>
     </w:p>
-    <w:bookmarkEnd w:id="35"/>
-    <w:bookmarkStart w:id="36" w:name="database"/>
+    <w:bookmarkEnd w:id="37"/>
+    <w:bookmarkStart w:id="38" w:name="database"/>
     <w:p>
       <w:pPr>
         <w:pStyle w:val="Heading3"/>
@@ -1430,9 +2477,9 @@
         <w:t xml:space="preserve">homology-based annotation).</w:t>
       </w:r>
     </w:p>
-    <w:bookmarkEnd w:id="36"/>
-    <w:bookmarkEnd w:id="37"/>
-    <w:bookmarkStart w:id="38" w:name="functional-classifier"/>
+    <w:bookmarkEnd w:id="38"/>
+    <w:bookmarkEnd w:id="39"/>
+    <w:bookmarkStart w:id="40" w:name="functional-classifier"/>
     <w:p>
       <w:pPr>
         <w:pStyle w:val="Heading2"/>
@@ -1468,7 +2515,7 @@
           <w:rPr>
             <w:rStyle w:val="Hyperlink"/>
           </w:rPr>
-          <w:t xml:space="preserve">Table 1</w:t>
+          <w:t xml:space="preserve">Table 2</w:t>
         </w:r>
       </w:hyperlink>
       <w:r>
@@ -1503,8 +2550,8 @@
         <w:t xml:space="preserve">The same functional classifier script was also used on the protein names from our test set to assign functional categories to the eukaryotic virus proteins downloaded from the ICTV exemplar species.</w:t>
       </w:r>
     </w:p>
-    <w:bookmarkEnd w:id="38"/>
-    <w:bookmarkStart w:id="39" w:name="sequence-homology-based-annotation"/>
+    <w:bookmarkEnd w:id="40"/>
+    <w:bookmarkStart w:id="41" w:name="sequence-homology-based-annotation"/>
     <w:p>
       <w:pPr>
         <w:pStyle w:val="Heading2"/>
@@ -1587,8 +2634,8 @@
         <w:t xml:space="preserve">with default settings; except for an E-value cutoff of 10 instead of 1e-03 to allow comparison to the other methods.</w:t>
       </w:r>
     </w:p>
-    <w:bookmarkEnd w:id="39"/>
-    <w:bookmarkStart w:id="42" w:name="protein-embedding-based-annotation"/>
+    <w:bookmarkEnd w:id="41"/>
+    <w:bookmarkStart w:id="44" w:name="protein-embedding-based-annotation"/>
     <w:p>
       <w:pPr>
         <w:pStyle w:val="Heading2"/>
@@ -1597,7 +2644,7 @@
         <w:t xml:space="preserve">Protein embedding-based annotation</w:t>
       </w:r>
     </w:p>
-    <w:bookmarkStart w:id="40" w:name="prostt5"/>
+    <w:bookmarkStart w:id="42" w:name="prostt5"/>
     <w:p>
       <w:pPr>
         <w:pStyle w:val="Heading3"/>
@@ -1674,8 +2721,8 @@
         <w:t xml:space="preserve">.</w:t>
       </w:r>
     </w:p>
-    <w:bookmarkEnd w:id="40"/>
-    <w:bookmarkStart w:id="41" w:name="tea"/>
+    <w:bookmarkEnd w:id="42"/>
+    <w:bookmarkStart w:id="43" w:name="tea"/>
     <w:p>
       <w:pPr>
         <w:pStyle w:val="Heading3"/>
@@ -1769,9 +2816,9 @@
         <w:t xml:space="preserve">) to search the test set against the BFVD.</w:t>
       </w:r>
     </w:p>
-    <w:bookmarkEnd w:id="41"/>
-    <w:bookmarkEnd w:id="42"/>
-    <w:bookmarkStart w:id="48" w:name="structure-homology-based-annotation"/>
+    <w:bookmarkEnd w:id="43"/>
+    <w:bookmarkEnd w:id="44"/>
+    <w:bookmarkStart w:id="50" w:name="structure-homology-based-annotation"/>
     <w:p>
       <w:pPr>
         <w:pStyle w:val="Heading2"/>
@@ -1780,7 +2827,7 @@
         <w:t xml:space="preserve">Structure homology-based annotation</w:t>
       </w:r>
     </w:p>
-    <w:bookmarkStart w:id="44" w:name="structure-prediction"/>
+    <w:bookmarkStart w:id="46" w:name="structure-prediction"/>
     <w:p>
       <w:pPr>
         <w:pStyle w:val="Heading3"/>
@@ -1823,7 +2870,7 @@
       <w:r>
         <w:t xml:space="preserve"> </w:t>
       </w:r>
-      <w:hyperlink r:id="rId43">
+      <w:hyperlink r:id="rId45">
         <w:r>
           <w:rPr>
             <w:rStyle w:val="Hyperlink"/>
@@ -1866,14 +2913,14 @@
         <w:rPr>
           <w:vertAlign w:val="superscript"/>
         </w:rPr>
-        <w:t xml:space="preserve">3</w:t>
+        <w:t xml:space="preserve">1</w:t>
       </w:r>
       <w:r>
         <w:t xml:space="preserve">.</w:t>
       </w:r>
     </w:p>
-    <w:bookmarkEnd w:id="44"/>
-    <w:bookmarkStart w:id="45" w:name="foldseek"/>
+    <w:bookmarkEnd w:id="46"/>
+    <w:bookmarkStart w:id="47" w:name="foldseek"/>
     <w:p>
       <w:pPr>
         <w:pStyle w:val="Heading3"/>
@@ -1917,8 +2964,8 @@
         <w:t xml:space="preserve">(Foldeek v10.941cd33) with default settings to search the predicted structures of our test set against the BFVD.</w:t>
       </w:r>
     </w:p>
-    <w:bookmarkEnd w:id="45"/>
-    <w:bookmarkStart w:id="47" w:name="reseek"/>
+    <w:bookmarkEnd w:id="47"/>
+    <w:bookmarkStart w:id="49" w:name="reseek"/>
     <w:p>
       <w:pPr>
         <w:pStyle w:val="Heading3"/>
@@ -1938,7 +2985,7 @@
         <w:rPr>
           <w:vertAlign w:val="superscript"/>
         </w:rPr>
-        <w:t xml:space="preserve">1</w:t>
+        <w:t xml:space="preserve">2</w:t>
       </w:r>
       <w:r>
         <w:t xml:space="preserve"> </w:t>
@@ -1969,7 +3016,7 @@
       <w:r>
         <w:t xml:space="preserve"> </w:t>
       </w:r>
-      <w:hyperlink r:id="rId46">
+      <w:hyperlink r:id="rId48">
         <w:r>
           <w:rPr>
             <w:rStyle w:val="Hyperlink"/>
@@ -1981,9 +3028,9 @@
         <w:t xml:space="preserve">).</w:t>
       </w:r>
     </w:p>
-    <w:bookmarkEnd w:id="47"/>
-    <w:bookmarkEnd w:id="48"/>
-    <w:bookmarkStart w:id="49" w:name="functional-category-assignment"/>
+    <w:bookmarkEnd w:id="49"/>
+    <w:bookmarkEnd w:id="50"/>
+    <w:bookmarkStart w:id="51" w:name="functional-category-assignment"/>
     <w:p>
       <w:pPr>
         <w:pStyle w:val="Heading2"/>
@@ -2041,8 +3088,8 @@
         <w:t xml:space="preserve">) when the weight of the informative category was at least 50% the weight of the uninformative categories.</w:t>
       </w:r>
     </w:p>
-    <w:bookmarkEnd w:id="49"/>
-    <w:bookmarkStart w:id="50" w:name="computational-benchmarking-1"/>
+    <w:bookmarkEnd w:id="51"/>
+    <w:bookmarkStart w:id="52" w:name="computational-benchmarking-1"/>
     <w:p>
       <w:pPr>
         <w:pStyle w:val="Heading2"/>
@@ -2073,11 +3120,11 @@
         <w:pStyle w:val="BodyText"/>
       </w:pPr>
       <w:r>
-        <w:t xml:space="preserve">All CPU analysis steps were performed on an HPC system using one IceLake node with 72 cores (2 Intel Xeon Platinum 8360Y CPUs@2.4 GHz; 256 GiB RAM), except for the MSA generation step which was performed on an IceLake big memory node with 72 cores (2 Intel Xeon Platinum 8360Y CPUs@2.4 GHz; 2048 GiB RAM). The GPU analyses were performed on one NVIDIA H100 SXM5 GPU (80 GiB HBM3) mounted on a node equipped with 2 AMD EPYC 9334 CPUs (768 GiB RAM).</w:t>
-      </w:r>
-    </w:p>
-    <w:bookmarkEnd w:id="50"/>
-    <w:bookmarkStart w:id="52" w:name="code-availibility"/>
+        <w:t xml:space="preserve">All CPU analysis steps were performed on an HPC system using one IceLake node with 72 cores (2 Intel Xeon Platinum 8360Y CPUs@2.4 GHz; 256 GiB RAM), except for the MSA generation step which was performed on an IceLake big memory node with 72 cores (2 Intel Xeon Platinum 8360Y CPUs@2.4 GHz; 2048 GiB RAM). The GPU analyses were performed on one NVIDIA H100 SXM5 GPU (80 GiB HBM3), mounted on a node equipped with 2 AMD EPYC 9334 CPUs (768 GiB RAM).</w:t>
+      </w:r>
+    </w:p>
+    <w:bookmarkEnd w:id="52"/>
+    <w:bookmarkStart w:id="54" w:name="code-availibility"/>
     <w:p>
       <w:pPr>
         <w:pStyle w:val="Heading2"/>
@@ -2096,7 +3143,7 @@
       <w:r>
         <w:t xml:space="preserve"> </w:t>
       </w:r>
-      <w:hyperlink r:id="rId51">
+      <w:hyperlink r:id="rId53">
         <w:r>
           <w:rPr>
             <w:rStyle w:val="Hyperlink"/>
@@ -2108,8 +3155,8 @@
         <w:t xml:space="preserve">.</w:t>
       </w:r>
     </w:p>
-    <w:bookmarkEnd w:id="52"/>
-    <w:bookmarkStart w:id="53" w:name="data-availibility"/>
+    <w:bookmarkEnd w:id="54"/>
+    <w:bookmarkStart w:id="55" w:name="data-availibility"/>
     <w:p>
       <w:pPr>
         <w:pStyle w:val="Heading2"/>
@@ -2129,9 +3176,9 @@
         <w:t xml:space="preserve">upload to zenodo</w:t>
       </w:r>
     </w:p>
-    <w:bookmarkEnd w:id="53"/>
-    <w:bookmarkEnd w:id="54"/>
-    <w:bookmarkStart w:id="55" w:name="acknowledgements"/>
+    <w:bookmarkEnd w:id="55"/>
+    <w:bookmarkEnd w:id="56"/>
+    <w:bookmarkStart w:id="57" w:name="acknowledgements"/>
     <w:p>
       <w:pPr>
         <w:pStyle w:val="Heading1"/>
@@ -2148,8 +3195,8 @@
         <w:t xml:space="preserve">LDC acknowledges support from the Research Foundation - Flanders (grants 11L1325N and V451025N). The resources and services used in this work were provided by the VSC (Flemish Supercomputer Center), funded by the Research Foundation - Flanders (FWO) and the Flemish Government.</w:t>
       </w:r>
     </w:p>
-    <w:bookmarkEnd w:id="55"/>
-    <w:bookmarkStart w:id="92" w:name="references"/>
+    <w:bookmarkEnd w:id="57"/>
+    <w:bookmarkStart w:id="94" w:name="references"/>
     <w:p>
       <w:pPr>
         <w:pStyle w:val="Heading1"/>
@@ -2158,8 +3205,8 @@
         <w:t xml:space="preserve">References</w:t>
       </w:r>
     </w:p>
-    <w:bookmarkStart w:id="91" w:name="refs"/>
-    <w:bookmarkStart w:id="57" w:name="ref-edgarProteinStructureAlignment2024"/>
+    <w:bookmarkStart w:id="93" w:name="refs"/>
+    <w:bookmarkStart w:id="59" w:name="X2c0b48febe45ccc797d9a56102a6e8246b839ee"/>
     <w:p>
       <w:pPr>
         <w:pStyle w:val="Bibliography"/>
@@ -2174,12 +3221,90 @@
         <w:t xml:space="preserve">	</w:t>
       </w:r>
       <w:r>
+        <w:t xml:space="preserve">Bouras, G.</w:t>
+      </w:r>
+      <w:r>
+        <w:t xml:space="preserve"> </w:t>
+      </w:r>
+      <w:r>
+        <w:rPr>
+          <w:i/>
+          <w:iCs/>
+        </w:rPr>
+        <w:t xml:space="preserve">et al.</w:t>
+      </w:r>
+      <w:r>
+        <w:t xml:space="preserve"> </w:t>
+      </w:r>
+      <w:hyperlink r:id="rId58">
+        <w:r>
+          <w:rPr>
+            <w:rStyle w:val="Hyperlink"/>
+          </w:rPr>
+          <w:t xml:space="preserve">Protein structure-informed bacteriophage genome annotation with</w:t>
+        </w:r>
+        <w:r>
+          <w:rPr>
+            <w:rStyle w:val="Hyperlink"/>
+          </w:rPr>
+          <w:t xml:space="preserve"> </w:t>
+        </w:r>
+        <w:r>
+          <w:rPr>
+            <w:rStyle w:val="Hyperlink"/>
+          </w:rPr>
+          <w:t xml:space="preserve">Phold</w:t>
+        </w:r>
+      </w:hyperlink>
+      <w:r>
+        <w:t xml:space="preserve">.</w:t>
+      </w:r>
+      <w:r>
+        <w:t xml:space="preserve"> </w:t>
+      </w:r>
+      <w:r>
+        <w:rPr>
+          <w:i/>
+          <w:iCs/>
+        </w:rPr>
+        <w:t xml:space="preserve">Nucleic Acids Research</w:t>
+      </w:r>
+      <w:r>
+        <w:t xml:space="preserve"> </w:t>
+      </w:r>
+      <w:r>
+        <w:rPr>
+          <w:b/>
+          <w:bCs/>
+        </w:rPr>
+        <w:t xml:space="preserve">54</w:t>
+      </w:r>
+      <w:r>
+        <w:t xml:space="preserve">, (2026).</w:t>
+      </w:r>
+    </w:p>
+    <w:bookmarkEnd w:id="59"/>
+    <w:bookmarkStart w:id="61" w:name="ref-edgarProteinStructureAlignment2024"/>
+    <w:p>
+      <w:pPr>
+        <w:pStyle w:val="Bibliography"/>
+      </w:pPr>
+      <w:r>
+        <w:t xml:space="preserve">2.</w:t>
+      </w:r>
+      <w:r>
+        <w:t xml:space="preserve"> </w:t>
+      </w:r>
+      <w:r>
+        <w:t xml:space="preserve">	</w:t>
+      </w:r>
+      <w:r>
         <w:t xml:space="preserve">Edgar, R. C.</w:t>
       </w:r>
       <w:r>
         <w:t xml:space="preserve"> </w:t>
       </w:r>
-      <w:hyperlink r:id="rId56">
+      <w:hyperlink r:id="rId60">
         <w:r>
           <w:rPr>
             <w:rStyle w:val="Hyperlink"/>
@@ -2238,14 +3363,14 @@
         <w:t xml:space="preserve">, btae687 (2024).</w:t>
       </w:r>
     </w:p>
-    <w:bookmarkEnd w:id="57"/>
-    <w:bookmarkStart w:id="59" w:name="ref-edgarProteinStructureAlignment2025"/>
+    <w:bookmarkEnd w:id="61"/>
+    <w:bookmarkStart w:id="63" w:name="ref-edgarProteinStructureAlignment2025"/>
     <w:p>
       <w:pPr>
         <w:pStyle w:val="Bibliography"/>
       </w:pPr>
       <w:r>
-        <w:t xml:space="preserve">2.</w:t>
+        <w:t xml:space="preserve">3.</w:t>
       </w:r>
       <w:r>
         <w:t xml:space="preserve"> </w:t>
@@ -2256,7 +3381,7 @@
       <w:r>
         <w:t xml:space="preserve">Edgar, R. C. &amp; Sahakyan, H. Protein structure alignment significance is often exaggerated. 2025.07.17.665375 (2025) doi:</w:t>
       </w:r>
-      <w:hyperlink r:id="rId58">
+      <w:hyperlink r:id="rId62">
         <w:r>
           <w:rPr>
             <w:rStyle w:val="Hyperlink"/>
@@ -2268,14 +3393,14 @@
         <w:t xml:space="preserve">.</w:t>
       </w:r>
     </w:p>
-    <w:bookmarkEnd w:id="59"/>
-    <w:bookmarkStart w:id="61" w:name="X2c0b48febe45ccc797d9a56102a6e8246b839ee"/>
+    <w:bookmarkEnd w:id="63"/>
+    <w:bookmarkStart w:id="64" w:name="ref-Peter_hyperfine_2023"/>
     <w:p>
       <w:pPr>
         <w:pStyle w:val="Bibliography"/>
       </w:pPr>
       <w:r>
-        <w:t xml:space="preserve">3.</w:t>
+        <w:t xml:space="preserve">4.</w:t>
       </w:r>
       <w:r>
         <w:t xml:space="preserve"> </w:t>
@@ -2284,7 +3409,26 @@
         <w:t xml:space="preserve">	</w:t>
       </w:r>
       <w:r>
-        <w:t xml:space="preserve">Bouras, G.</w:t>
+        <w:t xml:space="preserve">Peter, D. Hyperfine. (2023).</w:t>
+      </w:r>
+    </w:p>
+    <w:bookmarkEnd w:id="64"/>
+    <w:bookmarkStart w:id="66" w:name="ref-vankempenFastAccurateProtein2024"/>
+    <w:p>
+      <w:pPr>
+        <w:pStyle w:val="Bibliography"/>
+      </w:pPr>
+      <w:r>
+        <w:t xml:space="preserve">5.</w:t>
+      </w:r>
+      <w:r>
+        <w:t xml:space="preserve"> </w:t>
+      </w:r>
+      <w:r>
+        <w:t xml:space="preserve">	</w:t>
+      </w:r>
+      <w:r>
+        <w:t xml:space="preserve">van Kempen, M.</w:t>
       </w:r>
       <w:r>
         <w:t xml:space="preserve"> </w:t>
@@ -2299,104 +3443,7 @@
       <w:r>
         <w:t xml:space="preserve"> </w:t>
       </w:r>
-      <w:hyperlink r:id="rId60">
-        <w:r>
-          <w:rPr>
-            <w:rStyle w:val="Hyperlink"/>
-          </w:rPr>
-          <w:t xml:space="preserve">Protein structure-informed bacteriophage genome annotation with</w:t>
-        </w:r>
-        <w:r>
-          <w:rPr>
-            <w:rStyle w:val="Hyperlink"/>
-          </w:rPr>
-          <w:t xml:space="preserve"> </w:t>
-        </w:r>
-        <w:r>
-          <w:rPr>
-            <w:rStyle w:val="Hyperlink"/>
-          </w:rPr>
-          <w:t xml:space="preserve">Phold</w:t>
-        </w:r>
-      </w:hyperlink>
-      <w:r>
-        <w:t xml:space="preserve">.</w:t>
-      </w:r>
-      <w:r>
-        <w:t xml:space="preserve"> </w:t>
-      </w:r>
-      <w:r>
-        <w:rPr>
-          <w:i/>
-          <w:iCs/>
-        </w:rPr>
-        <w:t xml:space="preserve">Nucleic Acids Research</w:t>
-      </w:r>
-      <w:r>
-        <w:t xml:space="preserve"> </w:t>
-      </w:r>
-      <w:r>
-        <w:rPr>
-          <w:b/>
-          <w:bCs/>
-        </w:rPr>
-        <w:t xml:space="preserve">54</w:t>
-      </w:r>
-      <w:r>
-        <w:t xml:space="preserve">, (2026).</w:t>
-      </w:r>
-    </w:p>
-    <w:bookmarkEnd w:id="61"/>
-    <w:bookmarkStart w:id="62" w:name="ref-Peter_hyperfine_2023"/>
-    <w:p>
-      <w:pPr>
-        <w:pStyle w:val="Bibliography"/>
-      </w:pPr>
-      <w:r>
-        <w:t xml:space="preserve">4.</w:t>
-      </w:r>
-      <w:r>
-        <w:t xml:space="preserve"> </w:t>
-      </w:r>
-      <w:r>
-        <w:t xml:space="preserve">	</w:t>
-      </w:r>
-      <w:r>
-        <w:t xml:space="preserve">Peter, D. Hyperfine. (2023).</w:t>
-      </w:r>
-    </w:p>
-    <w:bookmarkEnd w:id="62"/>
-    <w:bookmarkStart w:id="64" w:name="ref-vankempenFastAccurateProtein2024"/>
-    <w:p>
-      <w:pPr>
-        <w:pStyle w:val="Bibliography"/>
-      </w:pPr>
-      <w:r>
-        <w:t xml:space="preserve">5.</w:t>
-      </w:r>
-      <w:r>
-        <w:t xml:space="preserve"> </w:t>
-      </w:r>
-      <w:r>
-        <w:t xml:space="preserve">	</w:t>
-      </w:r>
-      <w:r>
-        <w:t xml:space="preserve">van Kempen, M.</w:t>
-      </w:r>
-      <w:r>
-        <w:t xml:space="preserve"> </w:t>
-      </w:r>
-      <w:r>
-        <w:rPr>
-          <w:i/>
-          <w:iCs/>
-        </w:rPr>
-        <w:t xml:space="preserve">et al.</w:t>
-      </w:r>
-      <w:r>
-        <w:t xml:space="preserve"> </w:t>
-      </w:r>
-      <w:hyperlink r:id="rId63">
+      <w:hyperlink r:id="rId65">
         <w:r>
           <w:rPr>
             <w:rStyle w:val="Hyperlink"/>
@@ -2443,8 +3490,8 @@
         <w:t xml:space="preserve">, 243–246 (2024).</w:t>
       </w:r>
     </w:p>
-    <w:bookmarkEnd w:id="64"/>
-    <w:bookmarkStart w:id="66" w:name="Xf51a0e35be7b1fdad86f58a646a49d02ff6f742"/>
+    <w:bookmarkEnd w:id="66"/>
+    <w:bookmarkStart w:id="68" w:name="Xf51a0e35be7b1fdad86f58a646a49d02ff6f742"/>
     <w:p>
       <w:pPr>
         <w:pStyle w:val="Bibliography"/>
@@ -2474,7 +3521,7 @@
       <w:r>
         <w:t xml:space="preserve"> Rewriting protein alphabets with language models. 2025.11.27.690975 (2026) doi:</w:t>
       </w:r>
-      <w:hyperlink r:id="rId65">
+      <w:hyperlink r:id="rId67">
         <w:r>
           <w:rPr>
             <w:rStyle w:val="Hyperlink"/>
@@ -2486,8 +3533,8 @@
         <w:t xml:space="preserve">.</w:t>
       </w:r>
     </w:p>
-    <w:bookmarkEnd w:id="66"/>
-    <w:bookmarkStart w:id="68" w:name="ref-passaroBoltz2AccurateEfficient2025"/>
+    <w:bookmarkEnd w:id="68"/>
+    <w:bookmarkStart w:id="70" w:name="ref-passaroBoltz2AccurateEfficient2025"/>
     <w:p>
       <w:pPr>
         <w:pStyle w:val="Bibliography"/>
@@ -2538,7 +3585,7 @@
       <w:r>
         <w:t xml:space="preserve">. 2025.06.14.659707 (2025) doi:</w:t>
       </w:r>
-      <w:hyperlink r:id="rId67">
+      <w:hyperlink r:id="rId69">
         <w:r>
           <w:rPr>
             <w:rStyle w:val="Hyperlink"/>
@@ -2550,8 +3597,8 @@
         <w:t xml:space="preserve">.</w:t>
       </w:r>
     </w:p>
-    <w:bookmarkEnd w:id="68"/>
-    <w:bookmarkStart w:id="70" w:name="ref-kimBFVDLargeRepository2025"/>
+    <w:bookmarkEnd w:id="70"/>
+    <w:bookmarkStart w:id="72" w:name="ref-kimBFVDLargeRepository2025"/>
     <w:p>
       <w:pPr>
         <w:pStyle w:val="Bibliography"/>
@@ -2571,7 +3618,7 @@
       <w:r>
         <w:t xml:space="preserve"> </w:t>
       </w:r>
-      <w:hyperlink r:id="rId69">
+      <w:hyperlink r:id="rId71">
         <w:r>
           <w:rPr>
             <w:rStyle w:val="Hyperlink"/>
@@ -2612,8 +3659,8 @@
         <w:t xml:space="preserve">, D340–D347 (2025).</w:t>
       </w:r>
     </w:p>
-    <w:bookmarkEnd w:id="70"/>
-    <w:bookmarkStart w:id="72" w:name="ref-terzianPHROGFamiliesProkaryotic2021"/>
+    <w:bookmarkEnd w:id="72"/>
+    <w:bookmarkStart w:id="74" w:name="ref-terzianPHROGFamiliesProkaryotic2021"/>
     <w:p>
       <w:pPr>
         <w:pStyle w:val="Bibliography"/>
@@ -2643,7 +3690,7 @@
       <w:r>
         <w:t xml:space="preserve"> </w:t>
       </w:r>
-      <w:hyperlink r:id="rId71">
+      <w:hyperlink r:id="rId73">
         <w:r>
           <w:rPr>
             <w:rStyle w:val="Hyperlink"/>
@@ -2684,8 +3731,8 @@
         <w:t xml:space="preserve">, lqab067 (2021).</w:t>
       </w:r>
     </w:p>
-    <w:bookmarkEnd w:id="72"/>
-    <w:bookmarkStart w:id="74" w:name="ref-boulayEmpathiEmbeddingbasedPhage2025"/>
+    <w:bookmarkEnd w:id="74"/>
+    <w:bookmarkStart w:id="76" w:name="ref-boulayEmpathiEmbeddingbasedPhage2025"/>
     <w:p>
       <w:pPr>
         <w:pStyle w:val="Bibliography"/>
@@ -2705,7 +3752,7 @@
       <w:r>
         <w:t xml:space="preserve"> </w:t>
       </w:r>
-      <w:hyperlink r:id="rId73">
+      <w:hyperlink r:id="rId75">
         <w:r>
           <w:rPr>
             <w:rStyle w:val="Hyperlink"/>
@@ -2740,8 +3787,8 @@
         <w:t xml:space="preserve">, 9114 (2025).</w:t>
       </w:r>
     </w:p>
-    <w:bookmarkEnd w:id="74"/>
-    <w:bookmarkStart w:id="76" w:name="ref-altschulBasicLocalAlignment1990"/>
+    <w:bookmarkEnd w:id="76"/>
+    <w:bookmarkStart w:id="78" w:name="ref-altschulBasicLocalAlignment1990"/>
     <w:p>
       <w:pPr>
         <w:pStyle w:val="Bibliography"/>
@@ -2761,7 +3808,7 @@
       <w:r>
         <w:t xml:space="preserve"> </w:t>
       </w:r>
-      <w:hyperlink r:id="rId75">
+      <w:hyperlink r:id="rId77">
         <w:r>
           <w:rPr>
             <w:rStyle w:val="Hyperlink"/>
@@ -2786,8 +3833,8 @@
         <w:t xml:space="preserve">, 403–410 (1990).</w:t>
       </w:r>
     </w:p>
-    <w:bookmarkEnd w:id="76"/>
-    <w:bookmarkStart w:id="78" w:name="Xa956458ae3e05b5069e24cca7d937b4d5bcb564"/>
+    <w:bookmarkEnd w:id="78"/>
+    <w:bookmarkStart w:id="80" w:name="Xa956458ae3e05b5069e24cca7d937b4d5bcb564"/>
     <w:p>
       <w:pPr>
         <w:pStyle w:val="Bibliography"/>
@@ -2807,7 +3854,7 @@
       <w:r>
         <w:t xml:space="preserve"> </w:t>
       </w:r>
-      <w:hyperlink r:id="rId77">
+      <w:hyperlink r:id="rId79">
         <w:r>
           <w:rPr>
             <w:rStyle w:val="Hyperlink"/>
@@ -2854,8 +3901,8 @@
         <w:t xml:space="preserve">, 366–368 (2021).</w:t>
       </w:r>
     </w:p>
-    <w:bookmarkEnd w:id="78"/>
-    <w:bookmarkStart w:id="80" w:name="Xb1871b972aac70d2d99b56311e901dbd11f244c"/>
+    <w:bookmarkEnd w:id="80"/>
+    <w:bookmarkStart w:id="82" w:name="Xb1871b972aac70d2d99b56311e901dbd11f244c"/>
     <w:p>
       <w:pPr>
         <w:pStyle w:val="Bibliography"/>
@@ -2875,7 +3922,7 @@
       <w:r>
         <w:t xml:space="preserve"> </w:t>
       </w:r>
-      <w:hyperlink r:id="rId79">
+      <w:hyperlink r:id="rId81">
         <w:r>
           <w:rPr>
             <w:rStyle w:val="Hyperlink"/>
@@ -2922,8 +3969,8 @@
         <w:t xml:space="preserve">, 1026–1028 (2017).</w:t>
       </w:r>
     </w:p>
-    <w:bookmarkEnd w:id="80"/>
-    <w:bookmarkStart w:id="82" w:name="ref-heinzingerBilingualLanguageModel2024"/>
+    <w:bookmarkEnd w:id="82"/>
+    <w:bookmarkStart w:id="84" w:name="ref-heinzingerBilingualLanguageModel2024"/>
     <w:p>
       <w:pPr>
         <w:pStyle w:val="Bibliography"/>
@@ -2953,7 +4000,7 @@
       <w:r>
         <w:t xml:space="preserve"> </w:t>
       </w:r>
-      <w:hyperlink r:id="rId81">
+      <w:hyperlink r:id="rId83">
         <w:r>
           <w:rPr>
             <w:rStyle w:val="Hyperlink"/>
@@ -2988,8 +4035,8 @@
         <w:t xml:space="preserve">, lqae150 (2024).</w:t>
       </w:r>
     </w:p>
-    <w:bookmarkEnd w:id="82"/>
-    <w:bookmarkStart w:id="84" w:name="Xab23086715934bcc0f018ee599e230e9d872dae"/>
+    <w:bookmarkEnd w:id="84"/>
+    <w:bookmarkStart w:id="86" w:name="Xab23086715934bcc0f018ee599e230e9d872dae"/>
     <w:p>
       <w:pPr>
         <w:pStyle w:val="Bibliography"/>
@@ -3019,7 +4066,7 @@
       <w:r>
         <w:t xml:space="preserve"> </w:t>
       </w:r>
-      <w:hyperlink r:id="rId83">
+      <w:hyperlink r:id="rId85">
         <w:r>
           <w:rPr>
             <w:rStyle w:val="Hyperlink"/>
@@ -3120,8 +4167,8 @@
         <w:t xml:space="preserve">, 7112–7127 (2022).</w:t>
       </w:r>
     </w:p>
-    <w:bookmarkEnd w:id="84"/>
-    <w:bookmarkStart w:id="86" w:name="X5f1b8907d6a3bec1b0fabfc5f84c6d1da0a2a36"/>
+    <w:bookmarkEnd w:id="86"/>
+    <w:bookmarkStart w:id="88" w:name="X5f1b8907d6a3bec1b0fabfc5f84c6d1da0a2a36"/>
     <w:p>
       <w:pPr>
         <w:pStyle w:val="Bibliography"/>
@@ -3151,7 +4198,7 @@
       <w:r>
         <w:t xml:space="preserve"> </w:t>
       </w:r>
-      <w:hyperlink r:id="rId85">
+      <w:hyperlink r:id="rId87">
         <w:r>
           <w:rPr>
             <w:rStyle w:val="Hyperlink"/>
@@ -3186,8 +4233,8 @@
         <w:t xml:space="preserve">, 1123–1130 (2023).</w:t>
       </w:r>
     </w:p>
-    <w:bookmarkEnd w:id="86"/>
-    <w:bookmarkStart w:id="88" w:name="ref-mirditaColabFoldMakingProtein2022"/>
+    <w:bookmarkEnd w:id="88"/>
+    <w:bookmarkStart w:id="90" w:name="ref-mirditaColabFoldMakingProtein2022"/>
     <w:p>
       <w:pPr>
         <w:pStyle w:val="Bibliography"/>
@@ -3217,7 +4264,7 @@
       <w:r>
         <w:t xml:space="preserve"> </w:t>
       </w:r>
-      <w:hyperlink r:id="rId87">
+      <w:hyperlink r:id="rId89">
         <w:r>
           <w:rPr>
             <w:rStyle w:val="Hyperlink"/>
@@ -3258,8 +4305,8 @@
         <w:t xml:space="preserve">, 679–682 (2022).</w:t>
       </w:r>
     </w:p>
-    <w:bookmarkEnd w:id="88"/>
-    <w:bookmarkStart w:id="90" w:name="X970de467fd5d06c167b475b1295fef72fd3ada6"/>
+    <w:bookmarkEnd w:id="90"/>
+    <w:bookmarkStart w:id="92" w:name="X970de467fd5d06c167b475b1295fef72fd3ada6"/>
     <w:p>
       <w:pPr>
         <w:pStyle w:val="Bibliography"/>
@@ -3289,7 +4336,7 @@
       <w:r>
         <w:t xml:space="preserve"> </w:t>
       </w:r>
-      <w:hyperlink r:id="rId89">
+      <w:hyperlink r:id="rId91">
         <w:r>
           <w:rPr>
             <w:rStyle w:val="Hyperlink"/>
@@ -3348,15 +4395,15 @@
         <w:t xml:space="preserve">, e03200–24 (2024).</w:t>
       </w:r>
     </w:p>
-    <w:bookmarkEnd w:id="90"/>
-    <w:bookmarkEnd w:id="91"/>
+    <w:bookmarkEnd w:id="92"/>
+    <w:bookmarkEnd w:id="93"/>
     <w:p>
       <w:r>
         <w:br w:type="page"/>
       </w:r>
     </w:p>
-    <w:bookmarkEnd w:id="92"/>
-    <w:bookmarkStart w:id="111" w:name="supplementary-figures"/>
+    <w:bookmarkEnd w:id="94"/>
+    <w:bookmarkStart w:id="113" w:name="supplementary-figures"/>
     <w:p>
       <w:pPr>
         <w:pStyle w:val="Heading1"/>
@@ -3378,7 +4425,7 @@
       <w:tr>
         <w:tc>
           <w:tcPr/>
-          <w:bookmarkStart w:id="96" w:name="suppfig-kingdom"/>
+          <w:bookmarkStart w:id="98" w:name="suppfig-kingdom"/>
           <w:p>
             <w:pPr>
               <w:pStyle w:val="Compact"/>
@@ -3389,18 +4436,18 @@
                 <wp:inline>
                   <wp:extent cx="3657600" cy="2743200"/>
                   <wp:effectExtent b="0" l="0" r="0" t="0"/>
-                  <wp:docPr descr="" title="" id="94" name="Picture"/>
+                  <wp:docPr descr="" title="" id="96" name="Picture"/>
                   <a:graphic>
                     <a:graphicData uri="http://schemas.openxmlformats.org/drawingml/2006/picture">
                       <pic:pic>
                         <pic:nvPicPr>
-                          <pic:cNvPr descr="../figures/data_info/kingdom_distribution.pdf" id="95" name="Picture"/>
+                          <pic:cNvPr descr="../figures/data_info/kingdom_distribution.pdf" id="97" name="Picture"/>
                           <pic:cNvPicPr>
                             <a:picLocks noChangeArrowheads="1" noChangeAspect="1"/>
                           </pic:cNvPicPr>
                         </pic:nvPicPr>
                         <pic:blipFill>
-                          <a:blip r:embed="rId93"/>
+                          <a:blip r:embed="rId95"/>
                           <a:stretch>
                             <a:fillRect/>
                           </a:stretch>
@@ -3440,7 +4487,7 @@
               <w:t xml:space="preserve">Supplemental Figure 1: The distribution of the number of genomes from the different viral Kingdoms in the test set.</w:t>
             </w:r>
           </w:p>
-          <w:bookmarkEnd w:id="96"/>
+          <w:bookmarkEnd w:id="98"/>
         </w:tc>
       </w:tr>
     </w:tbl>
@@ -3465,7 +4512,7 @@
       <w:tr>
         <w:tc>
           <w:tcPr/>
-          <w:bookmarkStart w:id="100" w:name="suppfig-query-vs-evalue"/>
+          <w:bookmarkStart w:id="102" w:name="suppfig-query-vs-evalue"/>
           <w:p>
             <w:pPr>
               <w:pStyle w:val="Compact"/>
@@ -3476,18 +4523,18 @@
                 <wp:inline>
                   <wp:extent cx="5486400" cy="3657600"/>
                   <wp:effectExtent b="0" l="0" r="0" t="0"/>
-                  <wp:docPr descr="" title="" id="98" name="Picture"/>
+                  <wp:docPr descr="" title="" id="100" name="Picture"/>
                   <a:graphic>
                     <a:graphicData uri="http://schemas.openxmlformats.org/drawingml/2006/picture">
                       <pic:pic>
                         <pic:nvPicPr>
-                          <pic:cNvPr descr="../figures/search_results/unique_queries_vs_evalue.pdf" id="99" name="Picture"/>
+                          <pic:cNvPr descr="../figures/search_results/unique_queries_vs_evalue.pdf" id="101" name="Picture"/>
                           <pic:cNvPicPr>
                             <a:picLocks noChangeArrowheads="1" noChangeAspect="1"/>
                           </pic:cNvPicPr>
                         </pic:nvPicPr>
                         <pic:blipFill>
-                          <a:blip r:embed="rId97"/>
+                          <a:blip r:embed="rId99"/>
                           <a:stretch>
                             <a:fillRect/>
                           </a:stretch>
@@ -3527,7 +4574,7 @@
               <w:t xml:space="preserve">Supplemental Figure 2: The number of test proteins with at least 1 hit for each method across different E-value thresholds.</w:t>
             </w:r>
           </w:p>
-          <w:bookmarkEnd w:id="100"/>
+          <w:bookmarkEnd w:id="102"/>
         </w:tc>
       </w:tr>
     </w:tbl>
@@ -3552,7 +4599,7 @@
       <w:tr>
         <w:tc>
           <w:tcPr/>
-          <w:bookmarkStart w:id="104" w:name="suppfig-pairwise-method"/>
+          <w:bookmarkStart w:id="106" w:name="suppfig-pairwise-method"/>
           <w:p>
             <w:pPr>
               <w:pStyle w:val="Compact"/>
@@ -3563,18 +4610,18 @@
                 <wp:inline>
                   <wp:extent cx="5943600" cy="1981200"/>
                   <wp:effectExtent b="0" l="0" r="0" t="0"/>
-                  <wp:docPr descr="" title="" id="102" name="Picture"/>
+                  <wp:docPr descr="" title="" id="104" name="Picture"/>
                   <a:graphic>
                     <a:graphicData uri="http://schemas.openxmlformats.org/drawingml/2006/picture">
                       <pic:pic>
                         <pic:nvPicPr>
-                          <pic:cNvPr descr="../figures/search_results/hit_overlap_methods.pdf" id="103" name="Picture"/>
+                          <pic:cNvPr descr="../figures/search_results/hit_overlap_methods.pdf" id="105" name="Picture"/>
                           <pic:cNvPicPr>
                             <a:picLocks noChangeArrowheads="1" noChangeAspect="1"/>
                           </pic:cNvPicPr>
                         </pic:nvPicPr>
                         <pic:blipFill>
-                          <a:blip r:embed="rId101"/>
+                          <a:blip r:embed="rId103"/>
                           <a:stretch>
                             <a:fillRect/>
                           </a:stretch>
@@ -3614,7 +4661,7 @@
               <w:t xml:space="preserve">Supplemental Figure 3: Pairwise comparisons of shared hits between search methods for (A) the best 25 hits, (B) the best 25 hits after filtering on E-value (E &lt; 1e-03), and (C) the top hits for each query.</w:t>
             </w:r>
           </w:p>
-          <w:bookmarkEnd w:id="104"/>
+          <w:bookmarkEnd w:id="106"/>
         </w:tc>
       </w:tr>
     </w:tbl>
@@ -3639,7 +4686,7 @@
       <w:tr>
         <w:tc>
           <w:tcPr/>
-          <w:bookmarkStart w:id="108" w:name="suppfig-time-increase"/>
+          <w:bookmarkStart w:id="110" w:name="suppfig-time-increase"/>
           <w:p>
             <w:pPr>
               <w:pStyle w:val="Compact"/>
@@ -3650,18 +4697,18 @@
                 <wp:inline>
                   <wp:extent cx="3238500" cy="3238500"/>
                   <wp:effectExtent b="0" l="0" r="0" t="0"/>
-                  <wp:docPr descr="" title="" id="106" name="Picture"/>
+                  <wp:docPr descr="" title="" id="108" name="Picture"/>
                   <a:graphic>
                     <a:graphicData uri="http://schemas.openxmlformats.org/drawingml/2006/picture">
                       <pic:pic>
                         <pic:nvPicPr>
-                          <pic:cNvPr descr="../figures/computational_benchmark/time_fold_increase.pdf" id="107" name="Picture"/>
+                          <pic:cNvPr descr="../figures/computational_benchmark/time_fold_increase.pdf" id="109" name="Picture"/>
                           <pic:cNvPicPr>
                             <a:picLocks noChangeArrowheads="1" noChangeAspect="1"/>
                           </pic:cNvPicPr>
                         </pic:nvPicPr>
                         <pic:blipFill>
-                          <a:blip r:embed="rId105"/>
+                          <a:blip r:embed="rId107"/>
                           <a:stretch>
                             <a:fillRect/>
                           </a:stretch>
@@ -3701,7 +4748,7 @@
               <w:t xml:space="preserve">Supplemental Figure 4: Workflow runtime increase compared to the fastest workflow (MMseqs2).</w:t>
             </w:r>
           </w:p>
-          <w:bookmarkEnd w:id="108"/>
+          <w:bookmarkEnd w:id="110"/>
         </w:tc>
       </w:tr>
     </w:tbl>
@@ -3715,7 +4762,7 @@
         <w:sectPr/>
       </w:pPr>
     </w:p>
-    <w:bookmarkStart w:id="110" w:name="supplementary-tables"/>
+    <w:bookmarkStart w:id="112" w:name="supplementary-tables"/>
     <w:p>
       <w:pPr>
         <w:pStyle w:val="Heading1"/>
@@ -3737,7 +4784,7 @@
       <w:tr>
         <w:tc>
           <w:tcPr/>
-          <w:bookmarkStart w:id="109" w:name="tbl-supp-functional-categories"/>
+          <w:bookmarkStart w:id="111" w:name="tbl-supp-functional-categories"/>
           <w:p>
             <w:pPr>
               <w:jc w:val="center"/>
@@ -3748,7 +4795,7 @@
               <w:pStyle w:val="ImageCaption"/>
             </w:pPr>
             <w:r>
-              <w:t xml:space="preserve">Table 1: Final functional categories used for annotation, including descriptions, pattern matching keywords, and exclusions.</w:t>
+              <w:t xml:space="preserve">Table 2: Final functional categories used for annotation, including descriptions, pattern matching keywords, and exclusions.</w:t>
             </w:r>
           </w:p>
           <w:tbl>
@@ -6090,7 +7137,7 @@
               </w:tc>
             </w:tr>
           </w:tbl>
-          <w:bookmarkEnd w:id="109"/>
+          <w:bookmarkEnd w:id="111"/>
           <w:p/>
         </w:tc>
       </w:tr>
@@ -6102,8 +7149,8 @@
         </w:sectPr>
       </w:pPr>
     </w:p>
-    <w:bookmarkEnd w:id="110"/>
-    <w:bookmarkEnd w:id="111"/>
+    <w:bookmarkEnd w:id="112"/>
+    <w:bookmarkEnd w:id="113"/>
     <w:sectPr>
       <w:footnotePr>
         <w:numRestart w:val="eachSect"/>
@@ -6500,6 +7547,82 @@
       </w:pPr>
     </w:lvl>
   </w:abstractNum>
+  <w:abstractNum w:abstractNumId="993">
+    <w:nsid w:val="0000A993"/>
+    <w:multiLevelType w:val="multilevel"/>
+    <w:lvl w:ilvl="0">
+      <w:numFmt w:val="bullet"/>
+      <w:lvlText w:val="☒"/>
+      <w:lvlJc w:val="left"/>
+      <w:pPr>
+        <w:ind w:left="720" w:hanging="360"/>
+      </w:pPr>
+    </w:lvl>
+    <w:lvl w:ilvl="1">
+      <w:numFmt w:val="bullet"/>
+      <w:lvlText w:val="☒"/>
+      <w:lvlJc w:val="left"/>
+      <w:pPr>
+        <w:ind w:left="1440" w:hanging="360"/>
+      </w:pPr>
+    </w:lvl>
+    <w:lvl w:ilvl="2">
+      <w:numFmt w:val="bullet"/>
+      <w:lvlText w:val="☒"/>
+      <w:lvlJc w:val="left"/>
+      <w:pPr>
+        <w:ind w:left="2160" w:hanging="360"/>
+      </w:pPr>
+    </w:lvl>
+    <w:lvl w:ilvl="3">
+      <w:numFmt w:val="bullet"/>
+      <w:lvlText w:val="☒"/>
+      <w:lvlJc w:val="left"/>
+      <w:pPr>
+        <w:ind w:left="2880" w:hanging="360"/>
+      </w:pPr>
+    </w:lvl>
+    <w:lvl w:ilvl="4">
+      <w:numFmt w:val="bullet"/>
+      <w:lvlText w:val="☒"/>
+      <w:lvlJc w:val="left"/>
+      <w:pPr>
+        <w:ind w:left="3600" w:hanging="360"/>
+      </w:pPr>
+    </w:lvl>
+    <w:lvl w:ilvl="5">
+      <w:numFmt w:val="bullet"/>
+      <w:lvlText w:val="☒"/>
+      <w:lvlJc w:val="left"/>
+      <w:pPr>
+        <w:ind w:left="4320" w:hanging="360"/>
+      </w:pPr>
+    </w:lvl>
+    <w:lvl w:ilvl="6">
+      <w:numFmt w:val="bullet"/>
+      <w:lvlText w:val="☒"/>
+      <w:lvlJc w:val="left"/>
+      <w:pPr>
+        <w:ind w:left="5040" w:hanging="360"/>
+      </w:pPr>
+    </w:lvl>
+    <w:lvl w:ilvl="7">
+      <w:numFmt w:val="bullet"/>
+      <w:lvlText w:val="☒"/>
+      <w:lvlJc w:val="left"/>
+      <w:pPr>
+        <w:ind w:left="5760" w:hanging="360"/>
+      </w:pPr>
+    </w:lvl>
+    <w:lvl w:ilvl="8">
+      <w:numFmt w:val="bullet"/>
+      <w:lvlText w:val="☒"/>
+      <w:lvlJc w:val="left"/>
+      <w:pPr>
+        <w:ind w:left="6480" w:hanging="360"/>
+      </w:pPr>
+    </w:lvl>
+  </w:abstractNum>
   <w:num w16cid:durableId="1189947306" w:numId="1">
     <w:abstractNumId w:val="0"/>
   </w:num>
@@ -6516,7 +7639,13 @@
     <w:abstractNumId w:val="992"/>
   </w:num>
   <w:num w:numId="1004">
-    <w:abstractNumId w:val="992"/>
+    <w:abstractNumId w:val="993"/>
+  </w:num>
+  <w:num w:numId="1005">
+    <w:abstractNumId w:val="991"/>
+  </w:num>
+  <w:num w:numId="1006">
+    <w:abstractNumId w:val="991"/>
   </w:num>
 </w:numbering>
 </file>

</xml_diff>

<commit_message>
Add introduction, move abstract to YAML metadata, and extract outline to TODO.md
</commit_message>
<xml_diff>
--- a/manuscript/_manuscript/manuscript.docx
+++ b/manuscript/_manuscript/manuscript.docx
@@ -40,6 +40,34 @@
           <w:vertAlign w:val="superscript"/>
         </w:rPr>
         <w:t xml:space="preserve">2</w:t>
+      </w:r>
+    </w:p>
+    <w:p>
+      <w:pPr>
+        <w:pStyle w:val="AbstractTitle"/>
+      </w:pPr>
+      <w:r>
+        <w:t xml:space="preserve">Abstract</w:t>
+      </w:r>
+    </w:p>
+    <w:p>
+      <w:pPr>
+        <w:pStyle w:val="Abstract"/>
+      </w:pPr>
+      <w:r>
+        <w:t xml:space="preserve">The advent of protein language models and structural prediction promises new avenues for protein annotation through structure homology. Earlier work (eg. Phold) has shown protein strucural homology annotation works well for prokaryotic viruses. To leverage these new techniques for protein annotation of eukaryotic viruses, we benchmarked four recent embedding- and structure-based methods in comparison with the gold standard of sequence-based annotation. We selected 10% of the entries in ICTV’s VMR v40.2 that did not have bacteria or archaea as designated host (n=1,054), and subsequently retrieved all associated proteins from NCBI (n=11,360). Boltz-2 structure prediction of these proteins produced generally high-quality models (median pLDDT 71.3). Using the structures and protein sequences of the entries in the Big Fantastic Virus Database, we queried the VMR proteins with BLASTp, Diamond, and MMseqs2 (sequence); TEA and ProstT5-3Di (embedding); and Foldseek and Reseek (structure). Sequence homology-based methods showed a high overlap in hits, whereas the other methods had low intra- and inter-method agreement in hits between themselves and the sequence-based methods. Additionally, all methods improved the number of informative categories (ie. not “hypothetical protein”) for the VMR proteins, with embedding and structure methods producing the largest increases. However, when evaluated against proteins with informative GenBank annotations as ground truth (n=2,938), embedding- and structure-based methods agreed less often with the</w:t>
+      </w:r>
+      <w:r>
+        <w:t xml:space="preserve"> </w:t>
+      </w:r>
+      <w:r>
+        <w:t xml:space="preserve">“ground truth”</w:t>
+      </w:r>
+      <w:r>
+        <w:t xml:space="preserve"> </w:t>
+      </w:r>
+      <w:r>
+        <w:t xml:space="preserve">than sequence-based methods (~67% and ~76% vs ~83%, respectively). Overall, sequence homology remains the most accurate approach for protein annotation of eukaryotic viruses at present.</w:t>
       </w:r>
     </w:p>
     <w:p>
@@ -102,276 +130,202 @@
         </w:r>
       </w:hyperlink>
     </w:p>
-    <w:bookmarkStart w:id="10" w:name="outline-to-delete"/>
+    <w:bookmarkStart w:id="10" w:name="introduction"/>
     <w:p>
       <w:pPr>
         <w:pStyle w:val="Heading1"/>
       </w:pPr>
       <w:r>
-        <w:t xml:space="preserve">Outline (to delete)</w:t>
-      </w:r>
-    </w:p>
-    <w:p>
-      <w:pPr>
-        <w:pStyle w:val="Compact"/>
-        <w:numPr>
-          <w:ilvl w:val="0"/>
-          <w:numId w:val="1001"/>
-        </w:numPr>
-      </w:pPr>
-      <w:r>
-        <w:t xml:space="preserve">general overview of data and structures</w:t>
-      </w:r>
-    </w:p>
-    <w:p>
-      <w:pPr>
-        <w:pStyle w:val="Compact"/>
-        <w:numPr>
-          <w:ilvl w:val="1"/>
-          <w:numId w:val="1002"/>
-        </w:numPr>
-      </w:pPr>
-      <w:r>
-        <w:t xml:space="preserve">TODO: add annotation of BFVD (eukaryotic vs prokaryotic viruses)</w:t>
-      </w:r>
-    </w:p>
-    <w:p>
-      <w:pPr>
-        <w:pStyle w:val="Compact"/>
-        <w:numPr>
-          <w:ilvl w:val="0"/>
-          <w:numId w:val="1001"/>
-        </w:numPr>
-      </w:pPr>
-      <w:r>
-        <w:t xml:space="preserve">performance of methods in hits</w:t>
-      </w:r>
-    </w:p>
-    <w:p>
-      <w:pPr>
-        <w:pStyle w:val="Compact"/>
-        <w:numPr>
-          <w:ilvl w:val="0"/>
-          <w:numId w:val="1001"/>
-        </w:numPr>
-      </w:pPr>
-      <w:r>
-        <w:t xml:space="preserve">comparison of methods in shared hits</w:t>
-      </w:r>
-    </w:p>
-    <w:p>
-      <w:pPr>
-        <w:pStyle w:val="Compact"/>
-        <w:numPr>
-          <w:ilvl w:val="0"/>
-          <w:numId w:val="1001"/>
-        </w:numPr>
-      </w:pPr>
-      <w:r>
-        <w:t xml:space="preserve">comparison of functional annotation per method to original</w:t>
-      </w:r>
-    </w:p>
-    <w:p>
-      <w:pPr>
-        <w:pStyle w:val="Compact"/>
-        <w:numPr>
-          <w:ilvl w:val="1"/>
-          <w:numId w:val="1003"/>
-        </w:numPr>
-      </w:pPr>
-      <w:r>
-        <w:t xml:space="preserve">TODO: check if bad annotations are from low quality structures</w:t>
-      </w:r>
-    </w:p>
-    <w:p>
-      <w:pPr>
-        <w:pStyle w:val="Compact"/>
-        <w:numPr>
-          <w:ilvl w:val="0"/>
-          <w:numId w:val="1001"/>
-        </w:numPr>
-      </w:pPr>
-      <w:r>
-        <w:t xml:space="preserve">how many are informative annotations</w:t>
-      </w:r>
-    </w:p>
-    <w:p>
-      <w:pPr>
-        <w:pStyle w:val="Compact"/>
-        <w:numPr>
-          <w:ilvl w:val="1"/>
-          <w:numId w:val="1004"/>
-        </w:numPr>
-      </w:pPr>
-      <w:r>
-        <w:t xml:space="preserve">TODO: which conversions from hypothetical protein to informative</w:t>
-      </w:r>
-    </w:p>
-    <w:p>
-      <w:pPr>
-        <w:pStyle w:val="Compact"/>
-        <w:numPr>
-          <w:ilvl w:val="0"/>
-          <w:numId w:val="1001"/>
-        </w:numPr>
-      </w:pPr>
-      <w:r>
-        <w:t xml:space="preserve">☒ TODO: computational benchmark + add database sizes</w:t>
-      </w:r>
-    </w:p>
-    <w:p>
-      <w:pPr>
-        <w:pStyle w:val="Compact"/>
-        <w:numPr>
-          <w:ilvl w:val="0"/>
-          <w:numId w:val="1001"/>
-        </w:numPr>
-      </w:pPr>
-      <w:r>
-        <w:t xml:space="preserve">☐ TODO: check correlation between structure quality/TEA entropy and correct annotation/agreement between methods</w:t>
-      </w:r>
-    </w:p>
-    <w:p>
-      <w:pPr>
-        <w:pStyle w:val="Compact"/>
-        <w:numPr>
-          <w:ilvl w:val="0"/>
-          <w:numId w:val="1001"/>
-        </w:numPr>
-      </w:pPr>
-      <w:r>
-        <w:t xml:space="preserve">☐ TODO: add recall, precision and F1 plots -&gt; see also Figure 3C</w:t>
-      </w:r>
-    </w:p>
-    <w:p>
-      <w:pPr>
-        <w:pStyle w:val="Compact"/>
-        <w:numPr>
-          <w:ilvl w:val="0"/>
-          <w:numId w:val="1001"/>
-        </w:numPr>
-      </w:pPr>
-      <w:r>
-        <w:t xml:space="preserve">☐ TODO: make annotations better (local LLM, GenePT?)</w:t>
-      </w:r>
-    </w:p>
-    <w:p>
-      <w:pPr>
-        <w:pStyle w:val="Compact"/>
-        <w:numPr>
-          <w:ilvl w:val="0"/>
-          <w:numId w:val="1001"/>
-        </w:numPr>
-      </w:pPr>
-      <w:r>
-        <w:t xml:space="preserve">☐ TODO: do structure search of non-informative vs informative BFVD entries?</w:t>
-      </w:r>
-    </w:p>
-    <w:p>
-      <w:pPr>
-        <w:pStyle w:val="Compact"/>
-        <w:numPr>
-          <w:ilvl w:val="0"/>
-          <w:numId w:val="1001"/>
-        </w:numPr>
-      </w:pPr>
-      <w:r>
-        <w:t xml:space="preserve">☒ TODO: look at p-value for Reseek and see if this improves annotations -&gt; still very lenient (p&lt;0.05)</w:t>
-      </w:r>
-    </w:p>
-    <w:p>
-      <w:pPr>
-        <w:pStyle w:val="Compact"/>
-        <w:numPr>
-          <w:ilvl w:val="0"/>
-          <w:numId w:val="1001"/>
-        </w:numPr>
-      </w:pPr>
-      <w:r>
-        <w:rPr>
-          <w:strike/>
-        </w:rPr>
-        <w:t xml:space="preserve">Try out LucaVirus?</w:t>
-      </w:r>
-    </w:p>
-    <w:p>
-      <w:pPr>
-        <w:pStyle w:val="Compact"/>
-        <w:numPr>
-          <w:ilvl w:val="0"/>
-          <w:numId w:val="1001"/>
-        </w:numPr>
-      </w:pPr>
-      <w:r>
-        <w:rPr>
-          <w:strike/>
-        </w:rPr>
-        <w:t xml:space="preserve">Also test on Nomburg dataset, should have ground truth labels (see LucaVirus paper: seems to be protein names)</w:t>
-      </w:r>
-    </w:p>
-    <w:p>
-      <w:pPr>
-        <w:pStyle w:val="Compact"/>
-        <w:numPr>
-          <w:ilvl w:val="0"/>
-          <w:numId w:val="1001"/>
-        </w:numPr>
-      </w:pPr>
-      <w:r>
-        <w:t xml:space="preserve">possible explanation for bad structure results: small representation of viruses in training sets due to biosafety concerns?</w:t>
+        <w:t xml:space="preserve">Introduction</w:t>
+      </w:r>
+    </w:p>
+    <w:p>
+      <w:pPr>
+        <w:pStyle w:val="FirstParagraph"/>
+      </w:pPr>
+      <w:r>
+        <w:t xml:space="preserve">The current increase in metagenomic sequencing experiments is providing researchers with a steady stream of new viral genomes. A large problem that remains for computational biologists is the annotation of these genomes with functionally relevant labels for the predicted proteins. As annotating all these genomes through experimental evidence is an unfeasible task, researchers transfer annotations of annotated genomes to these novel genomes. The established gold standard for performing this task has been the use of the BLAST suite or comparable sequence alignment tools, such as Diamond and MMSeqs2</w:t>
+      </w:r>
+      <w:r>
+        <w:rPr>
+          <w:vertAlign w:val="superscript"/>
+        </w:rPr>
+        <w:t xml:space="preserve">1–3</w:t>
+      </w:r>
+      <w:r>
+        <w:t xml:space="preserve">. However, this approach reaches it limits when newly discovered sequences diverge too much from (experimentally validated) annotated genomes.</w:t>
+      </w:r>
+    </w:p>
+    <w:p>
+      <w:pPr>
+        <w:pStyle w:val="BodyText"/>
+      </w:pPr>
+      <w:r>
+        <w:t xml:space="preserve">To address this issue, novel methods rely on protein structure information, which should be more conserved than the sequence level because the 3D topology of a protein is vital for its function. Phold</w:t>
+      </w:r>
+      <w:r>
+        <w:rPr>
+          <w:vertAlign w:val="superscript"/>
+        </w:rPr>
+        <w:t xml:space="preserve">4</w:t>
+      </w:r>
+      <w:r>
+        <w:t xml:space="preserve">, for example, cleverly uses structural information to increase the amount of annotated proteins in bacteriophage genomes. Phold either takes user-provided structure predictions or uses ProstT5</w:t>
+      </w:r>
+      <w:r>
+        <w:rPr>
+          <w:vertAlign w:val="superscript"/>
+        </w:rPr>
+        <w:t xml:space="preserve">5</w:t>
+      </w:r>
+      <w:r>
+        <w:t xml:space="preserve">, a protein language model (pLM), to convert amino acid sequences into 3Di sequences, which contain the structural alphabet used by Foldseek</w:t>
+      </w:r>
+      <w:r>
+        <w:rPr>
+          <w:vertAlign w:val="superscript"/>
+        </w:rPr>
+        <w:t xml:space="preserve">6</w:t>
+      </w:r>
+      <w:r>
+        <w:t xml:space="preserve"> </w:t>
+      </w:r>
+      <w:r>
+        <w:t xml:space="preserve">to find structural homologs. In addition, a similar approach was developed by the same authors to increase the annotation rate in bacterial genomes</w:t>
+      </w:r>
+      <w:r>
+        <w:rPr>
+          <w:vertAlign w:val="superscript"/>
+        </w:rPr>
+        <w:t xml:space="preserve">7</w:t>
+      </w:r>
+      <w:r>
+        <w:t xml:space="preserve">.</w:t>
+      </w:r>
+    </w:p>
+    <w:p>
+      <w:pPr>
+        <w:pStyle w:val="BodyText"/>
+      </w:pPr>
+      <w:r>
+        <w:t xml:space="preserve">In addition to bacteriophages, also less studied eukaryotic viruses (e.g. insect viruses, nematode viruses and plant viruses) might benefit from such an approach to bring a more functional understanding to metagenomic discoveries of these viruses. For example, the</w:t>
+      </w:r>
+      <w:r>
+        <w:t xml:space="preserve"> </w:t>
+      </w:r>
+      <w:r>
+        <w:rPr>
+          <w:i/>
+          <w:iCs/>
+        </w:rPr>
+        <w:t xml:space="preserve">Chrysoviridae</w:t>
+      </w:r>
+      <w:r>
+        <w:t xml:space="preserve"> </w:t>
+      </w:r>
+      <w:r>
+        <w:t xml:space="preserve">is a viral family known to infect fungi, plants and probably insects, it has four dsRNA segments encoding four proteins. Two of these proteins have a known function, an RNA-dependent RNA polymerase and a capsid protein, while the other two proteins have no known function</w:t>
+      </w:r>
+      <w:r>
+        <w:rPr>
+          <w:vertAlign w:val="superscript"/>
+        </w:rPr>
+        <w:t xml:space="preserve">8</w:t>
+      </w:r>
+      <w:r>
+        <w:t xml:space="preserve">. Therefore, we benchmarked seven approaches for functional annotation: BLASTp, Diamond and MMseqs2 as gold standard sequence alignment; ProstT5 3Di conversion with Foldseek alignment, and ESM2 to The Embedded Alphabet (TEA) conversion with MMseqs2 alignment as pLM approaches; and finally, structure prediction of viral proteins with structure alignment using Foldseek or Reseek.</w:t>
+      </w:r>
+    </w:p>
+    <w:p>
+      <w:pPr>
+        <w:pStyle w:val="BodyText"/>
+      </w:pPr>
+      <w:r>
+        <w:t xml:space="preserve">The pLM approaches both convert the amino acid sequences into new 2D sequences representing structural information, but differ in the structural alphabet they use (3Di and TEA). Pantolini</w:t>
+      </w:r>
+      <w:r>
+        <w:t xml:space="preserve"> </w:t>
+      </w:r>
+      <w:r>
+        <w:rPr>
+          <w:i/>
+          <w:iCs/>
+        </w:rPr>
+        <w:t xml:space="preserve">et al</w:t>
+      </w:r>
+      <w:r>
+        <w:t xml:space="preserve"> </w:t>
+      </w:r>
+      <w:r>
+        <w:t xml:space="preserve">claim that their structural alphabet has a high association with secondary structural elements, similar to 3Di, but has better representation of helices and loops by multiple characters in TEA, compared to an overrepresentation of these structural elements by 3Di-v and 3Di-d, respectively</w:t>
+      </w:r>
+      <w:r>
+        <w:rPr>
+          <w:vertAlign w:val="superscript"/>
+        </w:rPr>
+        <w:t xml:space="preserve">9</w:t>
+      </w:r>
+      <w:r>
+        <w:t xml:space="preserve">.</w:t>
+      </w:r>
+    </w:p>
+    <w:p>
+      <w:pPr>
+        <w:pStyle w:val="BodyText"/>
+      </w:pPr>
+      <w:r>
+        <w:t xml:space="preserve">Additionally, we also predicted the structures of 11,467 proteins with Boltz-2</w:t>
+      </w:r>
+      <w:r>
+        <w:rPr>
+          <w:vertAlign w:val="superscript"/>
+        </w:rPr>
+        <w:t xml:space="preserve">10</w:t>
+      </w:r>
+      <w:r>
+        <w:t xml:space="preserve"> </w:t>
+      </w:r>
+      <w:r>
+        <w:t xml:space="preserve">and compared these structures with both Foldseek and Reseek. The latter claiming to improve sensitivity to remote homologs, compared to the widely used Foldseek</w:t>
+      </w:r>
+      <w:r>
+        <w:rPr>
+          <w:vertAlign w:val="superscript"/>
+        </w:rPr>
+        <w:t xml:space="preserve">11</w:t>
+      </w:r>
+      <w:r>
+        <w:t xml:space="preserve">.</w:t>
+      </w:r>
+    </w:p>
+    <w:p>
+      <w:pPr>
+        <w:pStyle w:val="BodyText"/>
+      </w:pPr>
+      <w:r>
+        <w:t xml:space="preserve">For our benchmarking, we picked the Big Fantastic Virus Database (BFVD), which contains 351,242 high quality predicted viral protein structures, as the reference database</w:t>
+      </w:r>
+      <w:r>
+        <w:rPr>
+          <w:vertAlign w:val="superscript"/>
+        </w:rPr>
+        <w:t xml:space="preserve">12</w:t>
+      </w:r>
+      <w:r>
+        <w:t xml:space="preserve">. This ensured that each annotation method was compared to the same viral proteins.</w:t>
       </w:r>
     </w:p>
     <w:bookmarkEnd w:id="10"/>
-    <w:bookmarkStart w:id="11" w:name="abstract"/>
+    <w:bookmarkStart w:id="33" w:name="results-discussion"/>
     <w:p>
       <w:pPr>
         <w:pStyle w:val="Heading1"/>
       </w:pPr>
       <w:r>
-        <w:t xml:space="preserve">Abstract</w:t>
-      </w:r>
-    </w:p>
-    <w:p>
-      <w:pPr>
-        <w:pStyle w:val="FirstParagraph"/>
-      </w:pPr>
-      <w:r>
-        <w:t xml:space="preserve">The advent of protein language models (pLMs) and structural prediction promises new avenues for protein annotation through structure homology. Earlier work (eg. Phold) has shown protein strucural homology annotation works well for prokaryotic viruses. To leverage these new techniques for protein annotation of eukaryotic viruses, we benchmarked four recent embedding- and structure-based methods in comparison with the gold standard of sequence-based annotation. We selected 10% of the entries in ICTV’s VMR v40.2 that did not have bacteria or archaea as designated host (n=1,054), and subsequently retrieved all associated proteins from NCBI (n=11,360). Boltz-2 structure prediction of these proteins produced generally high-quality models (median pLDDT 71.3). Using the structures and protein sequences of the entries in the Big Fantastic Virus Database (BFVD), we queried the VMR proteins with Blastp, Diamond, and MMseqs2 (sequence); TEA and ProstT5-3Di (embedding); and Foldseek and Reseek (structure). Sequence homology-based methods showed a high overlap in hits, whereas the other methods had low intra- and inter-method agreement in hits between themselves and the sequence-based methods. Additionally, all methods improved the number of informative categories (ie. not “hypothetical protein”) for the VMR proteins, with embedding and structure methods producing the largest increases. However, when evaluated against proteins with informative GenBank annotations as ground truth (n=2,938), embedding- and structure-based methods agreed less often with the</w:t>
-      </w:r>
-      <w:r>
-        <w:t xml:space="preserve"> </w:t>
-      </w:r>
-      <w:r>
-        <w:t xml:space="preserve">“ground truth”</w:t>
-      </w:r>
-      <w:r>
-        <w:t xml:space="preserve"> </w:t>
-      </w:r>
-      <w:r>
-        <w:t xml:space="preserve">than sequence-based methods (~67% and ~76% vs ~83%, respectively). Overall, sequence homology remains the most accurate approach for protein annotation of eukaryotic viruses at present.</w:t>
-      </w:r>
-    </w:p>
-    <w:bookmarkEnd w:id="11"/>
-    <w:bookmarkStart w:id="12" w:name="introduction"/>
-    <w:p>
-      <w:pPr>
-        <w:pStyle w:val="Heading1"/>
-      </w:pPr>
-      <w:r>
-        <w:t xml:space="preserve">Introduction</w:t>
-      </w:r>
-    </w:p>
-    <w:bookmarkEnd w:id="12"/>
-    <w:bookmarkStart w:id="35" w:name="results-discussion"/>
-    <w:p>
-      <w:pPr>
-        <w:pStyle w:val="Heading1"/>
-      </w:pPr>
-      <w:r>
         <w:t xml:space="preserve">Results &amp; Discussion</w:t>
       </w:r>
     </w:p>
-    <w:bookmarkStart w:id="17" w:name="dataset-overview"/>
+    <w:bookmarkStart w:id="15" w:name="dataset-overview"/>
     <w:p>
       <w:pPr>
         <w:pStyle w:val="Heading2"/>
@@ -483,7 +437,7 @@
       <w:tr>
         <w:tc>
           <w:tcPr/>
-          <w:bookmarkStart w:id="16" w:name="fig-overview"/>
+          <w:bookmarkStart w:id="14" w:name="fig-overview"/>
           <w:p>
             <w:pPr>
               <w:pStyle w:val="Compact"/>
@@ -494,18 +448,18 @@
                 <wp:inline>
                   <wp:extent cx="3810000" cy="2540000"/>
                   <wp:effectExtent b="0" l="0" r="0" t="0"/>
-                  <wp:docPr descr="" title="" id="14" name="Picture"/>
+                  <wp:docPr descr="" title="" id="12" name="Picture"/>
                   <a:graphic>
                     <a:graphicData uri="http://schemas.openxmlformats.org/drawingml/2006/picture">
                       <pic:pic>
                         <pic:nvPicPr>
-                          <pic:cNvPr descr="../figures/data_info/dataset_overview.pdf" id="15" name="Picture"/>
+                          <pic:cNvPr descr="../figures/data_info/dataset_overview.pdf" id="13" name="Picture"/>
                           <pic:cNvPicPr>
                             <a:picLocks noChangeArrowheads="1" noChangeAspect="1"/>
                           </pic:cNvPicPr>
                         </pic:nvPicPr>
                         <pic:blipFill>
-                          <a:blip r:embed="rId13"/>
+                          <a:blip r:embed="rId11"/>
                           <a:stretch>
                             <a:fillRect/>
                           </a:stretch>
@@ -545,12 +499,12 @@
               <w:t xml:space="preserve">Figure 1: A) The distribution of the number of proteins from the different viral Kingdoms. Each tile roughly corresponds to 110 proteins. B) A cumulative distribution function plot showing the percentage of predicted structures from the test set with a pLDDT score above the pLDDT score on the x-axis. The inset shows a violin- and boxplot with all pLDDT scores from the predicted structures (n=11,467).</w:t>
             </w:r>
           </w:p>
-          <w:bookmarkEnd w:id="16"/>
+          <w:bookmarkEnd w:id="14"/>
         </w:tc>
       </w:tr>
     </w:tbl>
-    <w:bookmarkEnd w:id="17"/>
-    <w:bookmarkStart w:id="22" w:name="performance-of-the-different-methods"/>
+    <w:bookmarkEnd w:id="15"/>
+    <w:bookmarkStart w:id="20" w:name="performance-of-the-different-methods"/>
     <w:p>
       <w:pPr>
         <w:pStyle w:val="Heading2"/>
@@ -584,7 +538,7 @@
         <w:rPr>
           <w:vertAlign w:val="superscript"/>
         </w:rPr>
-        <w:t xml:space="preserve">1</w:t>
+        <w:t xml:space="preserve">4</w:t>
       </w:r>
       <w:r>
         <w:t xml:space="preserve">. As the quality of our structure predictions was rather high (see</w:t>
@@ -621,7 +575,7 @@
         <w:rPr>
           <w:vertAlign w:val="superscript"/>
         </w:rPr>
-        <w:t xml:space="preserve">2,3</w:t>
+        <w:t xml:space="preserve">11,13</w:t>
       </w:r>
       <w:r>
         <w:t xml:space="preserve"> </w:t>
@@ -725,7 +679,7 @@
         <w:rPr>
           <w:vertAlign w:val="superscript"/>
         </w:rPr>
-        <w:t xml:space="preserve">2,3</w:t>
+        <w:t xml:space="preserve">11,13</w:t>
       </w:r>
       <w:r>
         <w:t xml:space="preserve">. Notably, while ProstT5 was the worst performer across the three datasets compared to the sequence methods, TEA performed better in the top hits comparison and was on par with the structure based methods. Overall, the embedding and structure based methods, that should be better to detect remote homologs, had low agreement on shared hits among each other.</w:t>
@@ -744,7 +698,7 @@
       <w:tr>
         <w:tc>
           <w:tcPr/>
-          <w:bookmarkStart w:id="21" w:name="fig-overlap"/>
+          <w:bookmarkStart w:id="19" w:name="fig-overlap"/>
           <w:p>
             <w:pPr>
               <w:pStyle w:val="Compact"/>
@@ -755,18 +709,18 @@
                 <wp:inline>
                   <wp:extent cx="5943600" cy="5279315"/>
                   <wp:effectExtent b="0" l="0" r="0" t="0"/>
-                  <wp:docPr descr="" title="" id="19" name="Picture"/>
+                  <wp:docPr descr="" title="" id="17" name="Picture"/>
                   <a:graphic>
                     <a:graphicData uri="http://schemas.openxmlformats.org/drawingml/2006/picture">
                       <pic:pic>
                         <pic:nvPicPr>
-                          <pic:cNvPr descr="../figures/search_results/hit_overlap_summary.pdf" id="20" name="Picture"/>
+                          <pic:cNvPr descr="../figures/search_results/hit_overlap_summary.pdf" id="18" name="Picture"/>
                           <pic:cNvPicPr>
                             <a:picLocks noChangeArrowheads="1" noChangeAspect="1"/>
                           </pic:cNvPicPr>
                         </pic:nvPicPr>
                         <pic:blipFill>
-                          <a:blip r:embed="rId18"/>
+                          <a:blip r:embed="rId16"/>
                           <a:stretch>
                             <a:fillRect/>
                           </a:stretch>
@@ -806,12 +760,12 @@
               <w:t xml:space="preserve">Figure 2: A) The number of proteins that got a hit against the BFVD shown per method (colored by category) before and after filtering the reported results on E-value lower than 1e-03 (lighter color). B) The total number of hits across all test proteins in function of the E-value for each method. C-D) Pairwise comparisons of shared hits across methods for the same test proteins, shown for the best 25 hits (C), and the top hits regardless of E-value (D). Text inside the colored tiles indicate the number of shared hits for the method on the x-axis compared to the method on the y-axis, followed by the percentage of shared hits as a proportion of the total hits for the method on the y-axis.</w:t>
             </w:r>
           </w:p>
-          <w:bookmarkEnd w:id="21"/>
+          <w:bookmarkEnd w:id="19"/>
         </w:tc>
       </w:tr>
     </w:tbl>
-    <w:bookmarkEnd w:id="22"/>
-    <w:bookmarkStart w:id="29" w:name="functional-annotation-comparison"/>
+    <w:bookmarkEnd w:id="20"/>
+    <w:bookmarkStart w:id="27" w:name="functional-annotation-comparison"/>
     <w:p>
       <w:pPr>
         <w:pStyle w:val="Heading2"/>
@@ -948,7 +902,7 @@
         <w:pStyle w:val="BodyText"/>
       </w:pPr>
       <w:r>
-        <w:t xml:space="preserve">Of note, Boltz structure prediction combined with Foldseek structure comparison did assign more informative categories than the sequence-based methods to originally non-informative proteins (n=1,571 vs ~1400; see</w:t>
+        <w:t xml:space="preserve">Of note, Boltz structure prediction combined with Foldseek did assign more informative categories than the sequence-based methods to originally non-informative proteins (n=1,571 vs ~1400; see</w:t>
       </w:r>
       <w:r>
         <w:t xml:space="preserve"> </w:t>
@@ -962,7 +916,19 @@
         </w:r>
       </w:hyperlink>
       <w:r>
-        <w:t xml:space="preserve">). However, this method did retrieve less test proteins with hits against the BFVD.</w:t>
+        <w:t xml:space="preserve">). However, this method retrieved less test proteins with hits against the BFVD.</w:t>
+      </w:r>
+    </w:p>
+    <w:p>
+      <w:pPr>
+        <w:pStyle w:val="Compact"/>
+        <w:numPr>
+          <w:ilvl w:val="0"/>
+          <w:numId w:val="1001"/>
+        </w:numPr>
+      </w:pPr>
+      <w:r>
+        <w:t xml:space="preserve">TODO: add that only 18 non-informative proteins got an informative functional annotation with structure methods (not TEA) compared to the sequence methods (make overlap figures with structures)</w:t>
       </w:r>
     </w:p>
     <w:tbl>
@@ -978,7 +944,7 @@
       <w:tr>
         <w:tc>
           <w:tcPr/>
-          <w:bookmarkStart w:id="26" w:name="fig-annotation"/>
+          <w:bookmarkStart w:id="24" w:name="fig-annotation"/>
           <w:p>
             <w:pPr>
               <w:pStyle w:val="Compact"/>
@@ -989,18 +955,18 @@
                 <wp:inline>
                   <wp:extent cx="5943600" cy="3298115"/>
                   <wp:effectExtent b="0" l="0" r="0" t="0"/>
-                  <wp:docPr descr="" title="" id="24" name="Picture"/>
+                  <wp:docPr descr="" title="" id="22" name="Picture"/>
                   <a:graphic>
                     <a:graphicData uri="http://schemas.openxmlformats.org/drawingml/2006/picture">
                       <pic:pic>
                         <pic:nvPicPr>
-                          <pic:cNvPr descr="../figures/search_results/annotation_combined.pdf" id="25" name="Picture"/>
+                          <pic:cNvPr descr="../figures/search_results/annotation_combined.pdf" id="23" name="Picture"/>
                           <pic:cNvPicPr>
                             <a:picLocks noChangeArrowheads="1" noChangeAspect="1"/>
                           </pic:cNvPicPr>
                         </pic:nvPicPr>
                         <pic:blipFill>
-                          <a:blip r:embed="rId23"/>
+                          <a:blip r:embed="rId21"/>
                           <a:stretch>
                             <a:fillRect/>
                           </a:stretch>
@@ -1067,10 +1033,10 @@
               <w:t xml:space="preserve">“Other Function”</w:t>
             </w:r>
             <w:r>
-              <w:t xml:space="preserve">) after applying each method. B) The percentage of queries that have a matching functional category for each method compared tot the informative original functional categories (regarded as the ground truth). C) Comparison of final assigned annotation categories compared to the original categories. Negative changes (ie. different informative categories or informative labels that changed to non-informative categories) are displayed to the left of the zero point, matches or category improvements (from non-informative to informative) are displayed on the right.</w:t>
+              <w:t xml:space="preserve">) after applying each method. Colored by method, light shades indicate non-informative proteins, dark shade indicates informative protein assignments. B) The percentage of queries that have a matching functional category for each method compared tot the informative original functional categories (regarded as the ground truth). C) Comparison of final assigned annotation categories compared to the original categories. Negative changes (ie. different informative categories or informative labels that changed to non-informative categories) are displayed to the left of the zero point, matches or category improvements (from non-informative to informative) are displayed on the right.</w:t>
             </w:r>
           </w:p>
-          <w:bookmarkEnd w:id="26"/>
+          <w:bookmarkEnd w:id="24"/>
         </w:tc>
       </w:tr>
     </w:tbl>
@@ -1095,7 +1061,7 @@
       <w:tr>
         <w:tc>
           <w:tcPr/>
-          <w:bookmarkStart w:id="27" w:name="tbl-assigned-categories"/>
+          <w:bookmarkStart w:id="25" w:name="tbl-assigned-categories"/>
           <w:p>
             <w:pPr>
               <w:jc w:val="center"/>
@@ -1120,9 +1086,9 @@
               <w:gridCol w:w="743"/>
               <w:gridCol w:w="875"/>
               <w:gridCol w:w="787"/>
-              <w:gridCol w:w="1050"/>
               <w:gridCol w:w="918"/>
               <w:gridCol w:w="1006"/>
+              <w:gridCol w:w="1050"/>
               <w:gridCol w:w="1225"/>
               <w:gridCol w:w="1312"/>
             </w:tblGrid>
@@ -1187,39 +1153,39 @@
                     <w:t xml:space="preserve">Informative</w:t>
                   </w:r>
                   <w:r>
+                    <w:t xml:space="preserve">match</w:t>
+                  </w:r>
+                </w:p>
+              </w:tc>
+              <w:tc>
+                <w:tcPr/>
+                <w:p>
+                  <w:pPr>
+                    <w:pStyle w:val="Compact"/>
+                    <w:jc w:val="right"/>
+                    <w:jc w:val="center"/>
+                  </w:pPr>
+                  <w:r>
+                    <w:t xml:space="preserve">Uninformative</w:t>
+                  </w:r>
+                  <w:r>
+                    <w:t xml:space="preserve">match</w:t>
+                  </w:r>
+                </w:p>
+              </w:tc>
+              <w:tc>
+                <w:tcPr/>
+                <w:p>
+                  <w:pPr>
+                    <w:pStyle w:val="Compact"/>
+                    <w:jc w:val="right"/>
+                    <w:jc w:val="center"/>
+                  </w:pPr>
+                  <w:r>
+                    <w:t xml:space="preserve">Informative</w:t>
+                  </w:r>
+                  <w:r>
                     <w:t xml:space="preserve">mismatch</w:t>
-                  </w:r>
-                </w:p>
-              </w:tc>
-              <w:tc>
-                <w:tcPr/>
-                <w:p>
-                  <w:pPr>
-                    <w:pStyle w:val="Compact"/>
-                    <w:jc w:val="right"/>
-                    <w:jc w:val="center"/>
-                  </w:pPr>
-                  <w:r>
-                    <w:t xml:space="preserve">Informative</w:t>
-                  </w:r>
-                  <w:r>
-                    <w:t xml:space="preserve">match</w:t>
-                  </w:r>
-                </w:p>
-              </w:tc>
-              <w:tc>
-                <w:tcPr/>
-                <w:p>
-                  <w:pPr>
-                    <w:pStyle w:val="Compact"/>
-                    <w:jc w:val="right"/>
-                    <w:jc w:val="center"/>
-                  </w:pPr>
-                  <w:r>
-                    <w:t xml:space="preserve">Uninformative</w:t>
-                  </w:r>
-                  <w:r>
-                    <w:t xml:space="preserve">match</w:t>
                   </w:r>
                 </w:p>
               </w:tc>
@@ -1305,33 +1271,33 @@
                     <w:jc w:val="center"/>
                   </w:pPr>
                   <w:r>
+                    <w:t xml:space="preserve">2331</w:t>
+                  </w:r>
+                </w:p>
+              </w:tc>
+              <w:tc>
+                <w:tcPr/>
+                <w:p>
+                  <w:pPr>
+                    <w:pStyle w:val="Compact"/>
+                    <w:jc w:val="right"/>
+                    <w:jc w:val="center"/>
+                  </w:pPr>
+                  <w:r>
+                    <w:t xml:space="preserve">6021</w:t>
+                  </w:r>
+                </w:p>
+              </w:tc>
+              <w:tc>
+                <w:tcPr/>
+                <w:p>
+                  <w:pPr>
+                    <w:pStyle w:val="Compact"/>
+                    <w:jc w:val="right"/>
+                    <w:jc w:val="center"/>
+                  </w:pPr>
+                  <w:r>
                     <w:t xml:space="preserve">1216</w:t>
-                  </w:r>
-                </w:p>
-              </w:tc>
-              <w:tc>
-                <w:tcPr/>
-                <w:p>
-                  <w:pPr>
-                    <w:pStyle w:val="Compact"/>
-                    <w:jc w:val="right"/>
-                    <w:jc w:val="center"/>
-                  </w:pPr>
-                  <w:r>
-                    <w:t xml:space="preserve">2331</w:t>
-                  </w:r>
-                </w:p>
-              </w:tc>
-              <w:tc>
-                <w:tcPr/>
-                <w:p>
-                  <w:pPr>
-                    <w:pStyle w:val="Compact"/>
-                    <w:jc w:val="right"/>
-                    <w:jc w:val="center"/>
-                  </w:pPr>
-                  <w:r>
-                    <w:t xml:space="preserve">6021</w:t>
                   </w:r>
                 </w:p>
               </w:tc>
@@ -1411,33 +1377,33 @@
                     <w:jc w:val="center"/>
                   </w:pPr>
                   <w:r>
+                    <w:t xml:space="preserve">2332</w:t>
+                  </w:r>
+                </w:p>
+              </w:tc>
+              <w:tc>
+                <w:tcPr/>
+                <w:p>
+                  <w:pPr>
+                    <w:pStyle w:val="Compact"/>
+                    <w:jc w:val="right"/>
+                    <w:jc w:val="center"/>
+                  </w:pPr>
+                  <w:r>
+                    <w:t xml:space="preserve">5968</w:t>
+                  </w:r>
+                </w:p>
+              </w:tc>
+              <w:tc>
+                <w:tcPr/>
+                <w:p>
+                  <w:pPr>
+                    <w:pStyle w:val="Compact"/>
+                    <w:jc w:val="right"/>
+                    <w:jc w:val="center"/>
+                  </w:pPr>
+                  <w:r>
                     <w:t xml:space="preserve">1206</w:t>
-                  </w:r>
-                </w:p>
-              </w:tc>
-              <w:tc>
-                <w:tcPr/>
-                <w:p>
-                  <w:pPr>
-                    <w:pStyle w:val="Compact"/>
-                    <w:jc w:val="right"/>
-                    <w:jc w:val="center"/>
-                  </w:pPr>
-                  <w:r>
-                    <w:t xml:space="preserve">2332</w:t>
-                  </w:r>
-                </w:p>
-              </w:tc>
-              <w:tc>
-                <w:tcPr/>
-                <w:p>
-                  <w:pPr>
-                    <w:pStyle w:val="Compact"/>
-                    <w:jc w:val="right"/>
-                    <w:jc w:val="center"/>
-                  </w:pPr>
-                  <w:r>
-                    <w:t xml:space="preserve">5968</w:t>
                   </w:r>
                 </w:p>
               </w:tc>
@@ -1517,33 +1483,33 @@
                     <w:jc w:val="center"/>
                   </w:pPr>
                   <w:r>
+                    <w:t xml:space="preserve">2335</w:t>
+                  </w:r>
+                </w:p>
+              </w:tc>
+              <w:tc>
+                <w:tcPr/>
+                <w:p>
+                  <w:pPr>
+                    <w:pStyle w:val="Compact"/>
+                    <w:jc w:val="right"/>
+                    <w:jc w:val="center"/>
+                  </w:pPr>
+                  <w:r>
+                    <w:t xml:space="preserve">5979</w:t>
+                  </w:r>
+                </w:p>
+              </w:tc>
+              <w:tc>
+                <w:tcPr/>
+                <w:p>
+                  <w:pPr>
+                    <w:pStyle w:val="Compact"/>
+                    <w:jc w:val="right"/>
+                    <w:jc w:val="center"/>
+                  </w:pPr>
+                  <w:r>
                     <w:t xml:space="preserve">1213</w:t>
-                  </w:r>
-                </w:p>
-              </w:tc>
-              <w:tc>
-                <w:tcPr/>
-                <w:p>
-                  <w:pPr>
-                    <w:pStyle w:val="Compact"/>
-                    <w:jc w:val="right"/>
-                    <w:jc w:val="center"/>
-                  </w:pPr>
-                  <w:r>
-                    <w:t xml:space="preserve">2335</w:t>
-                  </w:r>
-                </w:p>
-              </w:tc>
-              <w:tc>
-                <w:tcPr/>
-                <w:p>
-                  <w:pPr>
-                    <w:pStyle w:val="Compact"/>
-                    <w:jc w:val="right"/>
-                    <w:jc w:val="center"/>
-                  </w:pPr>
-                  <w:r>
-                    <w:t xml:space="preserve">5979</w:t>
                   </w:r>
                 </w:p>
               </w:tc>
@@ -1623,33 +1589,33 @@
                     <w:jc w:val="center"/>
                   </w:pPr>
                   <w:r>
+                    <w:t xml:space="preserve">1810</w:t>
+                  </w:r>
+                </w:p>
+              </w:tc>
+              <w:tc>
+                <w:tcPr/>
+                <w:p>
+                  <w:pPr>
+                    <w:pStyle w:val="Compact"/>
+                    <w:jc w:val="right"/>
+                    <w:jc w:val="center"/>
+                  </w:pPr>
+                  <w:r>
+                    <w:t xml:space="preserve">3113</w:t>
+                  </w:r>
+                </w:p>
+              </w:tc>
+              <w:tc>
+                <w:tcPr/>
+                <w:p>
+                  <w:pPr>
+                    <w:pStyle w:val="Compact"/>
+                    <w:jc w:val="right"/>
+                    <w:jc w:val="center"/>
+                  </w:pPr>
+                  <w:r>
                     <w:t xml:space="preserve">916</w:t>
-                  </w:r>
-                </w:p>
-              </w:tc>
-              <w:tc>
-                <w:tcPr/>
-                <w:p>
-                  <w:pPr>
-                    <w:pStyle w:val="Compact"/>
-                    <w:jc w:val="right"/>
-                    <w:jc w:val="center"/>
-                  </w:pPr>
-                  <w:r>
-                    <w:t xml:space="preserve">1810</w:t>
-                  </w:r>
-                </w:p>
-              </w:tc>
-              <w:tc>
-                <w:tcPr/>
-                <w:p>
-                  <w:pPr>
-                    <w:pStyle w:val="Compact"/>
-                    <w:jc w:val="right"/>
-                    <w:jc w:val="center"/>
-                  </w:pPr>
-                  <w:r>
-                    <w:t xml:space="preserve">3113</w:t>
                   </w:r>
                 </w:p>
               </w:tc>
@@ -1729,33 +1695,33 @@
                     <w:jc w:val="center"/>
                   </w:pPr>
                   <w:r>
+                    <w:t xml:space="preserve">1881</w:t>
+                  </w:r>
+                </w:p>
+              </w:tc>
+              <w:tc>
+                <w:tcPr/>
+                <w:p>
+                  <w:pPr>
+                    <w:pStyle w:val="Compact"/>
+                    <w:jc w:val="right"/>
+                    <w:jc w:val="center"/>
+                  </w:pPr>
+                  <w:r>
+                    <w:t xml:space="preserve">3822</w:t>
+                  </w:r>
+                </w:p>
+              </w:tc>
+              <w:tc>
+                <w:tcPr/>
+                <w:p>
+                  <w:pPr>
+                    <w:pStyle w:val="Compact"/>
+                    <w:jc w:val="right"/>
+                    <w:jc w:val="center"/>
+                  </w:pPr>
+                  <w:r>
                     <w:t xml:space="preserve">2725</w:t>
-                  </w:r>
-                </w:p>
-              </w:tc>
-              <w:tc>
-                <w:tcPr/>
-                <w:p>
-                  <w:pPr>
-                    <w:pStyle w:val="Compact"/>
-                    <w:jc w:val="right"/>
-                    <w:jc w:val="center"/>
-                  </w:pPr>
-                  <w:r>
-                    <w:t xml:space="preserve">1881</w:t>
-                  </w:r>
-                </w:p>
-              </w:tc>
-              <w:tc>
-                <w:tcPr/>
-                <w:p>
-                  <w:pPr>
-                    <w:pStyle w:val="Compact"/>
-                    <w:jc w:val="right"/>
-                    <w:jc w:val="center"/>
-                  </w:pPr>
-                  <w:r>
-                    <w:t xml:space="preserve">3822</w:t>
                   </w:r>
                 </w:p>
               </w:tc>
@@ -1835,33 +1801,33 @@
                     <w:jc w:val="center"/>
                   </w:pPr>
                   <w:r>
+                    <w:t xml:space="preserve">2176</w:t>
+                  </w:r>
+                </w:p>
+              </w:tc>
+              <w:tc>
+                <w:tcPr/>
+                <w:p>
+                  <w:pPr>
+                    <w:pStyle w:val="Compact"/>
+                    <w:jc w:val="right"/>
+                    <w:jc w:val="center"/>
+                  </w:pPr>
+                  <w:r>
+                    <w:t xml:space="preserve">3936</w:t>
+                  </w:r>
+                </w:p>
+              </w:tc>
+              <w:tc>
+                <w:tcPr/>
+                <w:p>
+                  <w:pPr>
+                    <w:pStyle w:val="Compact"/>
+                    <w:jc w:val="right"/>
+                    <w:jc w:val="center"/>
+                  </w:pPr>
+                  <w:r>
                     <w:t xml:space="preserve">1054</w:t>
-                  </w:r>
-                </w:p>
-              </w:tc>
-              <w:tc>
-                <w:tcPr/>
-                <w:p>
-                  <w:pPr>
-                    <w:pStyle w:val="Compact"/>
-                    <w:jc w:val="right"/>
-                    <w:jc w:val="center"/>
-                  </w:pPr>
-                  <w:r>
-                    <w:t xml:space="preserve">2176</w:t>
-                  </w:r>
-                </w:p>
-              </w:tc>
-              <w:tc>
-                <w:tcPr/>
-                <w:p>
-                  <w:pPr>
-                    <w:pStyle w:val="Compact"/>
-                    <w:jc w:val="right"/>
-                    <w:jc w:val="center"/>
-                  </w:pPr>
-                  <w:r>
-                    <w:t xml:space="preserve">3936</w:t>
                   </w:r>
                 </w:p>
               </w:tc>
@@ -1941,33 +1907,33 @@
                     <w:jc w:val="center"/>
                   </w:pPr>
                   <w:r>
+                    <w:t xml:space="preserve">1996</w:t>
+                  </w:r>
+                </w:p>
+              </w:tc>
+              <w:tc>
+                <w:tcPr/>
+                <w:p>
+                  <w:pPr>
+                    <w:pStyle w:val="Compact"/>
+                    <w:jc w:val="right"/>
+                    <w:jc w:val="center"/>
+                  </w:pPr>
+                  <w:r>
+                    <w:t xml:space="preserve">3123</w:t>
+                  </w:r>
+                </w:p>
+              </w:tc>
+              <w:tc>
+                <w:tcPr/>
+                <w:p>
+                  <w:pPr>
+                    <w:pStyle w:val="Compact"/>
+                    <w:jc w:val="right"/>
+                    <w:jc w:val="center"/>
+                  </w:pPr>
+                  <w:r>
                     <w:t xml:space="preserve">723</w:t>
-                  </w:r>
-                </w:p>
-              </w:tc>
-              <w:tc>
-                <w:tcPr/>
-                <w:p>
-                  <w:pPr>
-                    <w:pStyle w:val="Compact"/>
-                    <w:jc w:val="right"/>
-                    <w:jc w:val="center"/>
-                  </w:pPr>
-                  <w:r>
-                    <w:t xml:space="preserve">1996</w:t>
-                  </w:r>
-                </w:p>
-              </w:tc>
-              <w:tc>
-                <w:tcPr/>
-                <w:p>
-                  <w:pPr>
-                    <w:pStyle w:val="Compact"/>
-                    <w:jc w:val="right"/>
-                    <w:jc w:val="center"/>
-                  </w:pPr>
-                  <w:r>
-                    <w:t xml:space="preserve">3123</w:t>
                   </w:r>
                 </w:p>
               </w:tc>
@@ -1999,7 +1965,7 @@
               </w:tc>
             </w:tr>
           </w:tbl>
-          <w:bookmarkEnd w:id="27"/>
+          <w:bookmarkEnd w:id="25"/>
           <w:p/>
         </w:tc>
       </w:tr>
@@ -2020,7 +1986,7 @@
         </w:rPr>
         <w:t xml:space="preserve"> </w:t>
       </w:r>
-      <w:hyperlink r:id="rId28">
+      <w:hyperlink r:id="rId26">
         <w:r>
           <w:rPr>
             <w:rStyle w:val="Hyperlink"/>
@@ -2030,20 +1996,8 @@
         </w:r>
       </w:hyperlink>
     </w:p>
-    <w:p>
-      <w:pPr>
-        <w:pStyle w:val="Compact"/>
-        <w:numPr>
-          <w:ilvl w:val="0"/>
-          <w:numId w:val="1005"/>
-        </w:numPr>
-      </w:pPr>
-      <w:r>
-        <w:t xml:space="preserve">TODO: add that only 18 non-informative proteins got an informative functional annotation with structure methods (not TEA) compared to the sequence methods (make overlap figures with structures)</w:t>
-      </w:r>
-    </w:p>
-    <w:bookmarkEnd w:id="29"/>
-    <w:bookmarkStart w:id="34" w:name="computational-benchmarking"/>
+    <w:bookmarkEnd w:id="27"/>
+    <w:bookmarkStart w:id="32" w:name="computational-benchmarking"/>
     <w:p>
       <w:pPr>
         <w:pStyle w:val="Heading2"/>
@@ -2063,7 +2017,7 @@
         <w:rPr>
           <w:vertAlign w:val="superscript"/>
         </w:rPr>
-        <w:t xml:space="preserve">4</w:t>
+        <w:t xml:space="preserve">14</w:t>
       </w:r>
       <w:r>
         <w:t xml:space="preserve">, and</w:t>
@@ -2156,7 +2110,7 @@
       <w:tr>
         <w:tc>
           <w:tcPr/>
-          <w:bookmarkStart w:id="33" w:name="fig-computational-benchmark"/>
+          <w:bookmarkStart w:id="31" w:name="fig-computational-benchmark"/>
           <w:p>
             <w:pPr>
               <w:pStyle w:val="Compact"/>
@@ -2167,18 +2121,18 @@
                 <wp:inline>
                   <wp:extent cx="5943600" cy="3962400"/>
                   <wp:effectExtent b="0" l="0" r="0" t="0"/>
-                  <wp:docPr descr="" title="" id="31" name="Picture"/>
+                  <wp:docPr descr="" title="" id="29" name="Picture"/>
                   <a:graphic>
                     <a:graphicData uri="http://schemas.openxmlformats.org/drawingml/2006/picture">
                       <pic:pic>
                         <pic:nvPicPr>
-                          <pic:cNvPr descr="../figures/computational_benchmark/hyperfine_time_vs_memory.pdf" id="32" name="Picture"/>
+                          <pic:cNvPr descr="../figures/computational_benchmark/hyperfine_time_vs_memory.pdf" id="30" name="Picture"/>
                           <pic:cNvPicPr>
                             <a:picLocks noChangeArrowheads="1" noChangeAspect="1"/>
                           </pic:cNvPicPr>
                         </pic:nvPicPr>
                         <pic:blipFill>
-                          <a:blip r:embed="rId30"/>
+                          <a:blip r:embed="rId28"/>
                           <a:stretch>
                             <a:fillRect/>
                           </a:stretch>
@@ -2236,13 +2190,13 @@
               <w:t xml:space="preserve">-transformed memory usage (in GiB). For multistep workflows the indicated time is a cumulation of all steps (arrows indicate directionality of workflow steps). Workflows are colored by search method, CPU and GPU steps are indicated by circles and triangles respectively. The inset shows the difference in runtime between foldseek and reseek after MSA generation (ColabFold) and structure prediction (Boltz2).</w:t>
             </w:r>
           </w:p>
-          <w:bookmarkEnd w:id="33"/>
+          <w:bookmarkEnd w:id="31"/>
         </w:tc>
       </w:tr>
     </w:tbl>
-    <w:bookmarkEnd w:id="34"/>
-    <w:bookmarkEnd w:id="35"/>
-    <w:bookmarkStart w:id="36" w:name="conclusion"/>
+    <w:bookmarkEnd w:id="32"/>
+    <w:bookmarkEnd w:id="33"/>
+    <w:bookmarkStart w:id="34" w:name="conclusion"/>
     <w:p>
       <w:pPr>
         <w:pStyle w:val="Heading1"/>
@@ -2262,7 +2216,7 @@
         <w:rPr>
           <w:vertAlign w:val="superscript"/>
         </w:rPr>
-        <w:t xml:space="preserve">2,5,6</w:t>
+        <w:t xml:space="preserve">6,9,11</w:t>
       </w:r>
       <w:r>
         <w:t xml:space="preserve">, including bacteriophage protein searches</w:t>
@@ -2271,7 +2225,7 @@
         <w:rPr>
           <w:vertAlign w:val="superscript"/>
         </w:rPr>
-        <w:t xml:space="preserve">1</w:t>
+        <w:t xml:space="preserve">4</w:t>
       </w:r>
       <w:r>
         <w:t xml:space="preserve">, this does not seem to be the case for eukaryotic virus proteins. If we consider that structural homology searches are most useful to find homologs with a clearly defined protein structure, a possible explanation could be that most structural proteins (eg. capsid proteins) are already well annotated in sequence databases compared to more globular, complex proteins, and therefore the advantage of using structural homology searches in eukaryotic virus protein annotation might be limited.</w:t>
@@ -2282,15 +2236,15 @@
         <w:pStyle w:val="Compact"/>
         <w:numPr>
           <w:ilvl w:val="0"/>
-          <w:numId w:val="1006"/>
+          <w:numId w:val="1002"/>
         </w:numPr>
       </w:pPr>
       <w:r>
         <w:t xml:space="preserve">considerably higher runtime for little reward</w:t>
       </w:r>
     </w:p>
-    <w:bookmarkEnd w:id="36"/>
-    <w:bookmarkStart w:id="56" w:name="material-and-methods"/>
+    <w:bookmarkEnd w:id="34"/>
+    <w:bookmarkStart w:id="54" w:name="material-and-methods"/>
     <w:p>
       <w:pPr>
         <w:pStyle w:val="Heading1"/>
@@ -2299,7 +2253,7 @@
         <w:t xml:space="preserve">Material and Methods</w:t>
       </w:r>
     </w:p>
-    <w:bookmarkStart w:id="39" w:name="dataset-selection"/>
+    <w:bookmarkStart w:id="37" w:name="dataset-selection"/>
     <w:p>
       <w:pPr>
         <w:pStyle w:val="Heading2"/>
@@ -2308,7 +2262,7 @@
         <w:t xml:space="preserve">Dataset selection</w:t>
       </w:r>
     </w:p>
-    <w:bookmarkStart w:id="37" w:name="test-set"/>
+    <w:bookmarkStart w:id="35" w:name="test-set"/>
     <w:p>
       <w:pPr>
         <w:pStyle w:val="Heading3"/>
@@ -2336,7 +2290,7 @@
         <w:rPr>
           <w:vertAlign w:val="superscript"/>
         </w:rPr>
-        <w:t xml:space="preserve">7</w:t>
+        <w:t xml:space="preserve">10</w:t>
       </w:r>
       <w:r>
         <w:t xml:space="preserve"> </w:t>
@@ -2359,8 +2313,8 @@
         <w:t xml:space="preserve">). This resulted in a final test set of 11,467 protein sequences from 1,000 eukaryotic virus species.</w:t>
       </w:r>
     </w:p>
-    <w:bookmarkEnd w:id="37"/>
-    <w:bookmarkStart w:id="38" w:name="database"/>
+    <w:bookmarkEnd w:id="35"/>
+    <w:bookmarkStart w:id="36" w:name="database"/>
     <w:p>
       <w:pPr>
         <w:pStyle w:val="Heading3"/>
@@ -2374,13 +2328,13 @@
         <w:pStyle w:val="FirstParagraph"/>
       </w:pPr>
       <w:r>
-        <w:t xml:space="preserve">The Big Fantastic Virus Database (BFVD)</w:t>
+        <w:t xml:space="preserve">The BFVD</w:t>
       </w:r>
       <w:r>
         <w:rPr>
           <w:vertAlign w:val="superscript"/>
         </w:rPr>
-        <w:t xml:space="preserve">8</w:t>
+        <w:t xml:space="preserve">12</w:t>
       </w:r>
       <w:r>
         <w:t xml:space="preserve"> </w:t>
@@ -2414,7 +2368,7 @@
         <w:rPr>
           <w:vertAlign w:val="superscript"/>
         </w:rPr>
-        <w:t xml:space="preserve">9</w:t>
+        <w:t xml:space="preserve">15</w:t>
       </w:r>
       <w:r>
         <w:t xml:space="preserve"> </w:t>
@@ -2426,7 +2380,7 @@
         <w:rPr>
           <w:vertAlign w:val="superscript"/>
         </w:rPr>
-        <w:t xml:space="preserve">10</w:t>
+        <w:t xml:space="preserve">16</w:t>
       </w:r>
       <w:r>
         <w:t xml:space="preserve"> </w:t>
@@ -2477,9 +2431,9 @@
         <w:t xml:space="preserve">homology-based annotation).</w:t>
       </w:r>
     </w:p>
-    <w:bookmarkEnd w:id="38"/>
-    <w:bookmarkEnd w:id="39"/>
-    <w:bookmarkStart w:id="40" w:name="functional-classifier"/>
+    <w:bookmarkEnd w:id="36"/>
+    <w:bookmarkEnd w:id="37"/>
+    <w:bookmarkStart w:id="38" w:name="functional-classifier"/>
     <w:p>
       <w:pPr>
         <w:pStyle w:val="Heading2"/>
@@ -2550,14 +2504,290 @@
         <w:t xml:space="preserve">The same functional classifier script was also used on the protein names from our test set to assign functional categories to the eukaryotic virus proteins downloaded from the ICTV exemplar species.</w:t>
       </w:r>
     </w:p>
+    <w:bookmarkEnd w:id="38"/>
+    <w:bookmarkStart w:id="39" w:name="sequence-homology-based-annotation"/>
+    <w:p>
+      <w:pPr>
+        <w:pStyle w:val="Heading2"/>
+      </w:pPr>
+      <w:r>
+        <w:t xml:space="preserve">Sequence homology-based annotation</w:t>
+      </w:r>
+    </w:p>
+    <w:p>
+      <w:pPr>
+        <w:pStyle w:val="FirstParagraph"/>
+      </w:pPr>
+      <w:r>
+        <w:t xml:space="preserve">For sequence homology annotation, we used three state-of-the-art tools widely used in functional annotation pipelines and sequence similarity searches. As gold standard, BLASTp v2.16.0+</w:t>
+      </w:r>
+      <w:r>
+        <w:rPr>
+          <w:vertAlign w:val="superscript"/>
+        </w:rPr>
+        <w:t xml:space="preserve">1</w:t>
+      </w:r>
+      <w:r>
+        <w:t xml:space="preserve"> </w:t>
+      </w:r>
+      <w:r>
+        <w:t xml:space="preserve">was used to align the test set amino acid sequences against the amino acid sequences of the BFVD entries. In addition, we used</w:t>
+      </w:r>
+      <w:r>
+        <w:t xml:space="preserve"> </w:t>
+      </w:r>
+      <w:r>
+        <w:rPr>
+          <w:rStyle w:val="VerbatimChar"/>
+        </w:rPr>
+        <w:t xml:space="preserve">diamond blastp</w:t>
+      </w:r>
+      <w:r>
+        <w:t xml:space="preserve"> </w:t>
+      </w:r>
+      <w:r>
+        <w:t xml:space="preserve">(Diamond v2.1.16)</w:t>
+      </w:r>
+      <w:r>
+        <w:rPr>
+          <w:vertAlign w:val="superscript"/>
+        </w:rPr>
+        <w:t xml:space="preserve">17</w:t>
+      </w:r>
+      <w:r>
+        <w:t xml:space="preserve"> </w:t>
+      </w:r>
+      <w:r>
+        <w:t xml:space="preserve">in sensitive mode and</w:t>
+      </w:r>
+      <w:r>
+        <w:t xml:space="preserve"> </w:t>
+      </w:r>
+      <w:r>
+        <w:rPr>
+          <w:rStyle w:val="VerbatimChar"/>
+        </w:rPr>
+        <w:t xml:space="preserve">mmseqs easy-search</w:t>
+      </w:r>
+      <w:r>
+        <w:t xml:space="preserve"> </w:t>
+      </w:r>
+      <w:r>
+        <w:t xml:space="preserve">(MMseqs2 v18.8cc5c)</w:t>
+      </w:r>
+      <w:r>
+        <w:rPr>
+          <w:vertAlign w:val="superscript"/>
+        </w:rPr>
+        <w:t xml:space="preserve">3</w:t>
+      </w:r>
+      <w:r>
+        <w:t xml:space="preserve"> </w:t>
+      </w:r>
+      <w:r>
+        <w:t xml:space="preserve">with default settings; except for an E-value cutoff of 10 instead of 1e-03 to allow comparison to the other methods.</w:t>
+      </w:r>
+    </w:p>
+    <w:bookmarkEnd w:id="39"/>
+    <w:bookmarkStart w:id="42" w:name="protein-embedding-based-annotation"/>
+    <w:p>
+      <w:pPr>
+        <w:pStyle w:val="Heading2"/>
+      </w:pPr>
+      <w:r>
+        <w:t xml:space="preserve">Protein embedding-based annotation</w:t>
+      </w:r>
+    </w:p>
+    <w:bookmarkStart w:id="40" w:name="prostt5"/>
+    <w:p>
+      <w:pPr>
+        <w:pStyle w:val="Heading3"/>
+      </w:pPr>
+      <w:r>
+        <w:t xml:space="preserve">ProstT5</w:t>
+      </w:r>
+    </w:p>
+    <w:p>
+      <w:pPr>
+        <w:pStyle w:val="FirstParagraph"/>
+      </w:pPr>
+      <w:r>
+        <w:t xml:space="preserve">ProstT5</w:t>
+      </w:r>
+      <w:r>
+        <w:rPr>
+          <w:vertAlign w:val="superscript"/>
+        </w:rPr>
+        <w:t xml:space="preserve">5</w:t>
+      </w:r>
+      <w:r>
+        <w:t xml:space="preserve"> </w:t>
+      </w:r>
+      <w:r>
+        <w:t xml:space="preserve">is a pLM, based on ProtT5-XL-U50</w:t>
+      </w:r>
+      <w:r>
+        <w:rPr>
+          <w:vertAlign w:val="superscript"/>
+        </w:rPr>
+        <w:t xml:space="preserve">18</w:t>
+      </w:r>
+      <w:r>
+        <w:t xml:space="preserve">, finetuned for translating amino acid sequences into structure representations with 3Di sequences. We used ProstT5 within foldseek v10.941cd33</w:t>
+      </w:r>
+      <w:r>
+        <w:rPr>
+          <w:vertAlign w:val="superscript"/>
+        </w:rPr>
+        <w:t xml:space="preserve">6</w:t>
+      </w:r>
+      <w:r>
+        <w:t xml:space="preserve"> </w:t>
+      </w:r>
+      <w:r>
+        <w:t xml:space="preserve">using default settings of</w:t>
+      </w:r>
+      <w:r>
+        <w:t xml:space="preserve"> </w:t>
+      </w:r>
+      <w:r>
+        <w:rPr>
+          <w:rStyle w:val="VerbatimChar"/>
+        </w:rPr>
+        <w:t xml:space="preserve">foldseek createdb</w:t>
+      </w:r>
+      <w:r>
+        <w:t xml:space="preserve"> </w:t>
+      </w:r>
+      <w:r>
+        <w:t xml:space="preserve">to generate 3Di sequences for our test set and search them against the BFVD with</w:t>
+      </w:r>
+      <w:r>
+        <w:t xml:space="preserve"> </w:t>
+      </w:r>
+      <w:r>
+        <w:rPr>
+          <w:rStyle w:val="VerbatimChar"/>
+        </w:rPr>
+        <w:t xml:space="preserve">foldseek easy-search</w:t>
+      </w:r>
+      <w:r>
+        <w:t xml:space="preserve">.</w:t>
+      </w:r>
+    </w:p>
     <w:bookmarkEnd w:id="40"/>
-    <w:bookmarkStart w:id="41" w:name="sequence-homology-based-annotation"/>
+    <w:bookmarkStart w:id="41" w:name="tea"/>
+    <w:p>
+      <w:pPr>
+        <w:pStyle w:val="Heading3"/>
+      </w:pPr>
+      <w:r>
+        <w:t xml:space="preserve">TEA</w:t>
+      </w:r>
+    </w:p>
+    <w:p>
+      <w:pPr>
+        <w:pStyle w:val="FirstParagraph"/>
+      </w:pPr>
+      <w:r>
+        <w:t xml:space="preserve">In contrast to ProstT5, TEA</w:t>
+      </w:r>
+      <w:r>
+        <w:rPr>
+          <w:vertAlign w:val="superscript"/>
+        </w:rPr>
+        <w:t xml:space="preserve">9</w:t>
+      </w:r>
+      <w:r>
+        <w:t xml:space="preserve"> </w:t>
+      </w:r>
+      <w:r>
+        <w:t xml:space="preserve">uses the ESM2 pLM</w:t>
+      </w:r>
+      <w:r>
+        <w:rPr>
+          <w:vertAlign w:val="superscript"/>
+        </w:rPr>
+        <w:t xml:space="preserve">19</w:t>
+      </w:r>
+      <w:r>
+        <w:t xml:space="preserve"> </w:t>
+      </w:r>
+      <w:r>
+        <w:t xml:space="preserve">to generate embeddings for protein sequences and converts these embeddings into TEA sequences using this novel structural alphabet. Despite TEA and 3Di both consisting of 20 characters, TEA is different from 3Di in terms of the numbers and distribution these TEA characters map to secondary structural elements, promising a better representation of different structural elements across multiple alphabet characters.</w:t>
+      </w:r>
+    </w:p>
+    <w:p>
+      <w:pPr>
+        <w:pStyle w:val="BodyText"/>
+      </w:pPr>
+      <w:r>
+        <w:t xml:space="preserve">We converted both our test set and the BFVD into TEA sequences using the</w:t>
+      </w:r>
+      <w:r>
+        <w:t xml:space="preserve"> </w:t>
+      </w:r>
+      <w:r>
+        <w:rPr>
+          <w:rStyle w:val="VerbatimChar"/>
+        </w:rPr>
+        <w:t xml:space="preserve">tea_convert</w:t>
+      </w:r>
+      <w:r>
+        <w:t xml:space="preserve"> </w:t>
+      </w:r>
+      <w:r>
+        <w:t xml:space="preserve">pipeline with default settings, and subsequently performed sequence similarity searches using</w:t>
+      </w:r>
+      <w:r>
+        <w:t xml:space="preserve"> </w:t>
+      </w:r>
+      <w:r>
+        <w:rPr>
+          <w:rStyle w:val="VerbatimChar"/>
+        </w:rPr>
+        <w:t xml:space="preserve">mmseqs easy-search</w:t>
+      </w:r>
+      <w:r>
+        <w:rPr>
+          <w:vertAlign w:val="superscript"/>
+        </w:rPr>
+        <w:t xml:space="preserve">3</w:t>
+      </w:r>
+      <w:r>
+        <w:t xml:space="preserve"> </w:t>
+      </w:r>
+      <w:r>
+        <w:t xml:space="preserve">with a custom substitution matrix (matcha substiution matrix provided with TEA) and gap scoring settings (</w:t>
+      </w:r>
+      <w:r>
+        <w:rPr>
+          <w:rStyle w:val="VerbatimChar"/>
+        </w:rPr>
+        <w:t xml:space="preserve">--comp-bias-corr 0 --mask 0 --gap-open 18 --gap-extend 3</w:t>
+      </w:r>
+      <w:r>
+        <w:t xml:space="preserve">) to search the test set against the BFVD.</w:t>
+      </w:r>
+    </w:p>
+    <w:bookmarkEnd w:id="41"/>
+    <w:bookmarkEnd w:id="42"/>
+    <w:bookmarkStart w:id="48" w:name="structure-homology-based-annotation"/>
     <w:p>
       <w:pPr>
         <w:pStyle w:val="Heading2"/>
       </w:pPr>
       <w:r>
-        <w:t xml:space="preserve">Sequence homology-based annotation</w:t>
+        <w:t xml:space="preserve">Structure homology-based annotation</w:t>
+      </w:r>
+    </w:p>
+    <w:bookmarkStart w:id="44" w:name="structure-prediction"/>
+    <w:p>
+      <w:pPr>
+        <w:pStyle w:val="Heading3"/>
+      </w:pPr>
+      <w:r>
+        <w:t xml:space="preserve">Structure prediction</w:t>
       </w:r>
     </w:p>
     <w:p>
@@ -2565,301 +2795,25 @@
         <w:pStyle w:val="FirstParagraph"/>
       </w:pPr>
       <w:r>
-        <w:t xml:space="preserve">For sequence homology annotation, we used three state-of-the-art tools widely used in functional annotation pipelines and sequence similarity searches. As gold standard, BLASTp v2.16.0+</w:t>
+        <w:t xml:space="preserve">For the structure prediction of our test set proteins, we relied on Boltz v2.2.1</w:t>
       </w:r>
       <w:r>
         <w:rPr>
           <w:vertAlign w:val="superscript"/>
         </w:rPr>
-        <w:t xml:space="preserve">11</w:t>
-      </w:r>
-      <w:r>
-        <w:t xml:space="preserve"> </w:t>
-      </w:r>
-      <w:r>
-        <w:t xml:space="preserve">was used to align the test set amino acid sequences against the amino acid sequences of the BFVD entries. In addition, we used</w:t>
-      </w:r>
-      <w:r>
-        <w:t xml:space="preserve"> </w:t>
-      </w:r>
-      <w:r>
-        <w:rPr>
-          <w:rStyle w:val="VerbatimChar"/>
-        </w:rPr>
-        <w:t xml:space="preserve">diamond blastp</w:t>
-      </w:r>
-      <w:r>
-        <w:t xml:space="preserve"> </w:t>
-      </w:r>
-      <w:r>
-        <w:t xml:space="preserve">(Diamond v2.1.16)</w:t>
+        <w:t xml:space="preserve">10</w:t>
+      </w:r>
+      <w:r>
+        <w:t xml:space="preserve"> </w:t>
+      </w:r>
+      <w:r>
+        <w:t xml:space="preserve">(default settings) with multiple sequence alignments (MSAs) generated by a local, adapted ColabFold installation</w:t>
       </w:r>
       <w:r>
         <w:rPr>
           <w:vertAlign w:val="superscript"/>
         </w:rPr>
-        <w:t xml:space="preserve">12</w:t>
-      </w:r>
-      <w:r>
-        <w:t xml:space="preserve"> </w:t>
-      </w:r>
-      <w:r>
-        <w:t xml:space="preserve">in sensitive mode and</w:t>
-      </w:r>
-      <w:r>
-        <w:t xml:space="preserve"> </w:t>
-      </w:r>
-      <w:r>
-        <w:rPr>
-          <w:rStyle w:val="VerbatimChar"/>
-        </w:rPr>
-        <w:t xml:space="preserve">mmseqs easy-search</w:t>
-      </w:r>
-      <w:r>
-        <w:t xml:space="preserve"> </w:t>
-      </w:r>
-      <w:r>
-        <w:t xml:space="preserve">(MMseqs2 v18.8cc5c)</w:t>
-      </w:r>
-      <w:r>
-        <w:rPr>
-          <w:vertAlign w:val="superscript"/>
-        </w:rPr>
-        <w:t xml:space="preserve">13</w:t>
-      </w:r>
-      <w:r>
-        <w:t xml:space="preserve"> </w:t>
-      </w:r>
-      <w:r>
-        <w:t xml:space="preserve">with default settings; except for an E-value cutoff of 10 instead of 1e-03 to allow comparison to the other methods.</w:t>
-      </w:r>
-    </w:p>
-    <w:bookmarkEnd w:id="41"/>
-    <w:bookmarkStart w:id="44" w:name="protein-embedding-based-annotation"/>
-    <w:p>
-      <w:pPr>
-        <w:pStyle w:val="Heading2"/>
-      </w:pPr>
-      <w:r>
-        <w:t xml:space="preserve">Protein embedding-based annotation</w:t>
-      </w:r>
-    </w:p>
-    <w:bookmarkStart w:id="42" w:name="prostt5"/>
-    <w:p>
-      <w:pPr>
-        <w:pStyle w:val="Heading3"/>
-      </w:pPr>
-      <w:r>
-        <w:t xml:space="preserve">ProstT5</w:t>
-      </w:r>
-    </w:p>
-    <w:p>
-      <w:pPr>
-        <w:pStyle w:val="FirstParagraph"/>
-      </w:pPr>
-      <w:r>
-        <w:t xml:space="preserve">ProstT5</w:t>
-      </w:r>
-      <w:r>
-        <w:rPr>
-          <w:vertAlign w:val="superscript"/>
-        </w:rPr>
-        <w:t xml:space="preserve">14</w:t>
-      </w:r>
-      <w:r>
-        <w:t xml:space="preserve"> </w:t>
-      </w:r>
-      <w:r>
-        <w:t xml:space="preserve">is a pLM, based on ProtT5-XL-U50</w:t>
-      </w:r>
-      <w:r>
-        <w:rPr>
-          <w:vertAlign w:val="superscript"/>
-        </w:rPr>
-        <w:t xml:space="preserve">15</w:t>
-      </w:r>
-      <w:r>
-        <w:t xml:space="preserve">, finetuned for translating amino acid sequences into structure representations with 3Di sequences. We used ProstT5 within foldseek v10.941cd33</w:t>
-      </w:r>
-      <w:r>
-        <w:rPr>
-          <w:vertAlign w:val="superscript"/>
-        </w:rPr>
-        <w:t xml:space="preserve">5</w:t>
-      </w:r>
-      <w:r>
-        <w:t xml:space="preserve"> </w:t>
-      </w:r>
-      <w:r>
-        <w:t xml:space="preserve">using default settings of</w:t>
-      </w:r>
-      <w:r>
-        <w:t xml:space="preserve"> </w:t>
-      </w:r>
-      <w:r>
-        <w:rPr>
-          <w:rStyle w:val="VerbatimChar"/>
-        </w:rPr>
-        <w:t xml:space="preserve">foldseek createdb</w:t>
-      </w:r>
-      <w:r>
-        <w:t xml:space="preserve"> </w:t>
-      </w:r>
-      <w:r>
-        <w:t xml:space="preserve">to generate 3Di sequences for our test set and search them against the BFVD with</w:t>
-      </w:r>
-      <w:r>
-        <w:t xml:space="preserve"> </w:t>
-      </w:r>
-      <w:r>
-        <w:rPr>
-          <w:rStyle w:val="VerbatimChar"/>
-        </w:rPr>
-        <w:t xml:space="preserve">foldseek easy-search</w:t>
-      </w:r>
-      <w:r>
-        <w:t xml:space="preserve">.</w:t>
-      </w:r>
-    </w:p>
-    <w:bookmarkEnd w:id="42"/>
-    <w:bookmarkStart w:id="43" w:name="tea"/>
-    <w:p>
-      <w:pPr>
-        <w:pStyle w:val="Heading3"/>
-      </w:pPr>
-      <w:r>
-        <w:t xml:space="preserve">TEA</w:t>
-      </w:r>
-    </w:p>
-    <w:p>
-      <w:pPr>
-        <w:pStyle w:val="FirstParagraph"/>
-      </w:pPr>
-      <w:r>
-        <w:t xml:space="preserve">In contrast to ProstT5, The Embedded Alphabet (TEA)</w:t>
-      </w:r>
-      <w:r>
-        <w:rPr>
-          <w:vertAlign w:val="superscript"/>
-        </w:rPr>
-        <w:t xml:space="preserve">6</w:t>
-      </w:r>
-      <w:r>
-        <w:t xml:space="preserve"> </w:t>
-      </w:r>
-      <w:r>
-        <w:t xml:space="preserve">uses the ESM2 pLM</w:t>
-      </w:r>
-      <w:r>
-        <w:rPr>
-          <w:vertAlign w:val="superscript"/>
-        </w:rPr>
-        <w:t xml:space="preserve">16</w:t>
-      </w:r>
-      <w:r>
-        <w:t xml:space="preserve"> </w:t>
-      </w:r>
-      <w:r>
-        <w:t xml:space="preserve">to generate embeddings for protein sequences and converts these embeddings into TEA sequences using this novel structural alphabet. Despite TEA and 3Di both consisting of 20 characters, TEA is different from 3Di in terms of the numbers and distribution these TEA characters map to secondary structural elements, promising a better representation of different structural elements across multiple alphabet characters.</w:t>
-      </w:r>
-    </w:p>
-    <w:p>
-      <w:pPr>
-        <w:pStyle w:val="BodyText"/>
-      </w:pPr>
-      <w:r>
-        <w:t xml:space="preserve">We converted both our test set and the BFVD into TEA sequences using the</w:t>
-      </w:r>
-      <w:r>
-        <w:t xml:space="preserve"> </w:t>
-      </w:r>
-      <w:r>
-        <w:rPr>
-          <w:rStyle w:val="VerbatimChar"/>
-        </w:rPr>
-        <w:t xml:space="preserve">tea_convert</w:t>
-      </w:r>
-      <w:r>
-        <w:t xml:space="preserve"> </w:t>
-      </w:r>
-      <w:r>
-        <w:t xml:space="preserve">pipeline with default settings, and subsequently performed sequence similarity searches using</w:t>
-      </w:r>
-      <w:r>
-        <w:t xml:space="preserve"> </w:t>
-      </w:r>
-      <w:r>
-        <w:rPr>
-          <w:rStyle w:val="VerbatimChar"/>
-        </w:rPr>
-        <w:t xml:space="preserve">mmseqs easy-search</w:t>
-      </w:r>
-      <w:r>
-        <w:rPr>
-          <w:vertAlign w:val="superscript"/>
-        </w:rPr>
-        <w:t xml:space="preserve">13</w:t>
-      </w:r>
-      <w:r>
-        <w:t xml:space="preserve"> </w:t>
-      </w:r>
-      <w:r>
-        <w:t xml:space="preserve">with a custom substitution matrix (matcha substiution matrix provided with TEA) and gap scoring settings (</w:t>
-      </w:r>
-      <w:r>
-        <w:rPr>
-          <w:rStyle w:val="VerbatimChar"/>
-        </w:rPr>
-        <w:t xml:space="preserve">--comp-bias-corr 0 --mask 0 --gap-open 18 --gap-extend 3</w:t>
-      </w:r>
-      <w:r>
-        <w:t xml:space="preserve">) to search the test set against the BFVD.</w:t>
-      </w:r>
-    </w:p>
-    <w:bookmarkEnd w:id="43"/>
-    <w:bookmarkEnd w:id="44"/>
-    <w:bookmarkStart w:id="50" w:name="structure-homology-based-annotation"/>
-    <w:p>
-      <w:pPr>
-        <w:pStyle w:val="Heading2"/>
-      </w:pPr>
-      <w:r>
-        <w:t xml:space="preserve">Structure homology-based annotation</w:t>
-      </w:r>
-    </w:p>
-    <w:bookmarkStart w:id="46" w:name="structure-prediction"/>
-    <w:p>
-      <w:pPr>
-        <w:pStyle w:val="Heading3"/>
-      </w:pPr>
-      <w:r>
-        <w:t xml:space="preserve">Structure prediction</w:t>
-      </w:r>
-    </w:p>
-    <w:p>
-      <w:pPr>
-        <w:pStyle w:val="FirstParagraph"/>
-      </w:pPr>
-      <w:r>
-        <w:t xml:space="preserve">For the structure prediction of our test set proteins, we relied on Boltz v2.2.1</w:t>
-      </w:r>
-      <w:r>
-        <w:rPr>
-          <w:vertAlign w:val="superscript"/>
-        </w:rPr>
-        <w:t xml:space="preserve">7</w:t>
-      </w:r>
-      <w:r>
-        <w:t xml:space="preserve"> </w:t>
-      </w:r>
-      <w:r>
-        <w:t xml:space="preserve">(default settings) with multiple sequence alignments (MSAs) generated by a local, adapted ColabFold installation</w:t>
-      </w:r>
-      <w:r>
-        <w:rPr>
-          <w:vertAlign w:val="superscript"/>
-        </w:rPr>
-        <w:t xml:space="preserve">17</w:t>
+        <w:t xml:space="preserve">20</w:t>
       </w:r>
       <w:r>
         <w:t xml:space="preserve"> </w:t>
@@ -2870,7 +2824,7 @@
       <w:r>
         <w:t xml:space="preserve"> </w:t>
       </w:r>
-      <w:hyperlink r:id="rId45">
+      <w:hyperlink r:id="rId43">
         <w:r>
           <w:rPr>
             <w:rStyle w:val="Hyperlink"/>
@@ -2901,7 +2855,7 @@
         <w:rPr>
           <w:vertAlign w:val="superscript"/>
         </w:rPr>
-        <w:t xml:space="preserve">18</w:t>
+        <w:t xml:space="preserve">21</w:t>
       </w:r>
       <w:r>
         <w:t xml:space="preserve"> </w:t>
@@ -2913,14 +2867,14 @@
         <w:rPr>
           <w:vertAlign w:val="superscript"/>
         </w:rPr>
-        <w:t xml:space="preserve">1</w:t>
+        <w:t xml:space="preserve">4</w:t>
       </w:r>
       <w:r>
         <w:t xml:space="preserve">.</w:t>
       </w:r>
     </w:p>
-    <w:bookmarkEnd w:id="46"/>
-    <w:bookmarkStart w:id="47" w:name="foldseek"/>
+    <w:bookmarkEnd w:id="44"/>
+    <w:bookmarkStart w:id="45" w:name="foldseek"/>
     <w:p>
       <w:pPr>
         <w:pStyle w:val="Heading3"/>
@@ -2940,7 +2894,7 @@
         <w:rPr>
           <w:vertAlign w:val="superscript"/>
         </w:rPr>
-        <w:t xml:space="preserve">5</w:t>
+        <w:t xml:space="preserve">6</w:t>
       </w:r>
       <w:r>
         <w:t xml:space="preserve"> </w:t>
@@ -2964,8 +2918,8 @@
         <w:t xml:space="preserve">(Foldeek v10.941cd33) with default settings to search the predicted structures of our test set against the BFVD.</w:t>
       </w:r>
     </w:p>
-    <w:bookmarkEnd w:id="47"/>
-    <w:bookmarkStart w:id="49" w:name="reseek"/>
+    <w:bookmarkEnd w:id="45"/>
+    <w:bookmarkStart w:id="47" w:name="reseek"/>
     <w:p>
       <w:pPr>
         <w:pStyle w:val="Heading3"/>
@@ -2985,7 +2939,7 @@
         <w:rPr>
           <w:vertAlign w:val="superscript"/>
         </w:rPr>
-        <w:t xml:space="preserve">2</w:t>
+        <w:t xml:space="preserve">11</w:t>
       </w:r>
       <w:r>
         <w:t xml:space="preserve"> </w:t>
@@ -3016,7 +2970,7 @@
       <w:r>
         <w:t xml:space="preserve"> </w:t>
       </w:r>
-      <w:hyperlink r:id="rId48">
+      <w:hyperlink r:id="rId46">
         <w:r>
           <w:rPr>
             <w:rStyle w:val="Hyperlink"/>
@@ -3028,9 +2982,9 @@
         <w:t xml:space="preserve">).</w:t>
       </w:r>
     </w:p>
-    <w:bookmarkEnd w:id="49"/>
-    <w:bookmarkEnd w:id="50"/>
-    <w:bookmarkStart w:id="51" w:name="functional-category-assignment"/>
+    <w:bookmarkEnd w:id="47"/>
+    <w:bookmarkEnd w:id="48"/>
+    <w:bookmarkStart w:id="49" w:name="functional-category-assignment"/>
     <w:p>
       <w:pPr>
         <w:pStyle w:val="Heading2"/>
@@ -3088,8 +3042,8 @@
         <w:t xml:space="preserve">) when the weight of the informative category was at least 50% the weight of the uninformative categories.</w:t>
       </w:r>
     </w:p>
-    <w:bookmarkEnd w:id="51"/>
-    <w:bookmarkStart w:id="52" w:name="computational-benchmarking-1"/>
+    <w:bookmarkEnd w:id="49"/>
+    <w:bookmarkStart w:id="50" w:name="computational-benchmarking-1"/>
     <w:p>
       <w:pPr>
         <w:pStyle w:val="Heading2"/>
@@ -3109,7 +3063,7 @@
         <w:rPr>
           <w:vertAlign w:val="superscript"/>
         </w:rPr>
-        <w:t xml:space="preserve">4</w:t>
+        <w:t xml:space="preserve">14</w:t>
       </w:r>
       <w:r>
         <w:t xml:space="preserve">. GPU memory consumption was measured by sampling usage every 200 ms with nvidia-smi v580.82.07, recording the peak value observed after each step.</w:t>
@@ -3123,8 +3077,8 @@
         <w:t xml:space="preserve">All CPU analysis steps were performed on an HPC system using one IceLake node with 72 cores (2 Intel Xeon Platinum 8360Y CPUs@2.4 GHz; 256 GiB RAM), except for the MSA generation step which was performed on an IceLake big memory node with 72 cores (2 Intel Xeon Platinum 8360Y CPUs@2.4 GHz; 2048 GiB RAM). The GPU analyses were performed on one NVIDIA H100 SXM5 GPU (80 GiB HBM3), mounted on a node equipped with 2 AMD EPYC 9334 CPUs (768 GiB RAM).</w:t>
       </w:r>
     </w:p>
-    <w:bookmarkEnd w:id="52"/>
-    <w:bookmarkStart w:id="54" w:name="code-availibility"/>
+    <w:bookmarkEnd w:id="50"/>
+    <w:bookmarkStart w:id="52" w:name="code-availibility"/>
     <w:p>
       <w:pPr>
         <w:pStyle w:val="Heading2"/>
@@ -3143,7 +3097,7 @@
       <w:r>
         <w:t xml:space="preserve"> </w:t>
       </w:r>
-      <w:hyperlink r:id="rId53">
+      <w:hyperlink r:id="rId51">
         <w:r>
           <w:rPr>
             <w:rStyle w:val="Hyperlink"/>
@@ -3155,14 +3109,36 @@
         <w:t xml:space="preserve">.</w:t>
       </w:r>
     </w:p>
+    <w:bookmarkEnd w:id="52"/>
+    <w:bookmarkStart w:id="53" w:name="data-availibility"/>
+    <w:p>
+      <w:pPr>
+        <w:pStyle w:val="Heading2"/>
+      </w:pPr>
+      <w:r>
+        <w:t xml:space="preserve">Data availibility</w:t>
+      </w:r>
+    </w:p>
+    <w:p>
+      <w:pPr>
+        <w:pStyle w:val="FirstParagraph"/>
+      </w:pPr>
+      <w:r>
+        <w:rPr>
+          <w:highlight w:val="yellow"/>
+        </w:rPr>
+        <w:t xml:space="preserve">upload to zenodo</w:t>
+      </w:r>
+    </w:p>
+    <w:bookmarkEnd w:id="53"/>
     <w:bookmarkEnd w:id="54"/>
-    <w:bookmarkStart w:id="55" w:name="data-availibility"/>
-    <w:p>
-      <w:pPr>
-        <w:pStyle w:val="Heading2"/>
-      </w:pPr>
-      <w:r>
-        <w:t xml:space="preserve">Data availibility</w:t>
+    <w:bookmarkStart w:id="55" w:name="acknowledgements"/>
+    <w:p>
+      <w:pPr>
+        <w:pStyle w:val="Heading1"/>
+      </w:pPr>
+      <w:r>
+        <w:t xml:space="preserve">Acknowledgements</w:t>
       </w:r>
     </w:p>
     <w:p>
@@ -3170,49 +3146,73 @@
         <w:pStyle w:val="FirstParagraph"/>
       </w:pPr>
       <w:r>
-        <w:rPr>
-          <w:highlight w:val="yellow"/>
-        </w:rPr>
-        <w:t xml:space="preserve">upload to zenodo</w:t>
+        <w:t xml:space="preserve">LDC acknowledges support from the Research Foundation - Flanders (grants 11L1325N and V451025N). The resources and services used in this work were provided by the VSC (Flemish Supercomputer Center), funded by the Research Foundation - Flanders (FWO) and the Flemish Government.</w:t>
       </w:r>
     </w:p>
     <w:bookmarkEnd w:id="55"/>
-    <w:bookmarkEnd w:id="56"/>
-    <w:bookmarkStart w:id="57" w:name="acknowledgements"/>
+    <w:bookmarkStart w:id="98" w:name="references"/>
     <w:p>
       <w:pPr>
         <w:pStyle w:val="Heading1"/>
       </w:pPr>
       <w:r>
-        <w:t xml:space="preserve">Acknowledgements</w:t>
-      </w:r>
-    </w:p>
-    <w:p>
-      <w:pPr>
-        <w:pStyle w:val="FirstParagraph"/>
-      </w:pPr>
-      <w:r>
-        <w:t xml:space="preserve">LDC acknowledges support from the Research Foundation - Flanders (grants 11L1325N and V451025N). The resources and services used in this work were provided by the VSC (Flemish Supercomputer Center), funded by the Research Foundation - Flanders (FWO) and the Flemish Government.</w:t>
+        <w:t xml:space="preserve">References</w:t>
+      </w:r>
+    </w:p>
+    <w:bookmarkStart w:id="97" w:name="refs"/>
+    <w:bookmarkStart w:id="57" w:name="ref-altschulBasicLocalAlignment1990"/>
+    <w:p>
+      <w:pPr>
+        <w:pStyle w:val="Bibliography"/>
+      </w:pPr>
+      <w:r>
+        <w:t xml:space="preserve">1.</w:t>
+      </w:r>
+      <w:r>
+        <w:t xml:space="preserve"> </w:t>
+      </w:r>
+      <w:r>
+        <w:t xml:space="preserve">	</w:t>
+      </w:r>
+      <w:r>
+        <w:t xml:space="preserve">Altschul, S. F., Gish, W., Miller, W., Myers, E. W. &amp; Lipman, D. J.</w:t>
+      </w:r>
+      <w:r>
+        <w:t xml:space="preserve"> </w:t>
+      </w:r>
+      <w:hyperlink r:id="rId56">
+        <w:r>
+          <w:rPr>
+            <w:rStyle w:val="Hyperlink"/>
+          </w:rPr>
+          <w:t xml:space="preserve">Basic local alignment search tool</w:t>
+        </w:r>
+      </w:hyperlink>
+      <w:r>
+        <w:t xml:space="preserve">.</w:t>
+      </w:r>
+      <w:r>
+        <w:t xml:space="preserve"> </w:t>
+      </w:r>
+      <w:r>
+        <w:rPr>
+          <w:b/>
+          <w:bCs/>
+        </w:rPr>
+        <w:t xml:space="preserve">215</w:t>
+      </w:r>
+      <w:r>
+        <w:t xml:space="preserve">, 403–410 (1990).</w:t>
       </w:r>
     </w:p>
     <w:bookmarkEnd w:id="57"/>
-    <w:bookmarkStart w:id="94" w:name="references"/>
-    <w:p>
-      <w:pPr>
-        <w:pStyle w:val="Heading1"/>
-      </w:pPr>
-      <w:r>
-        <w:t xml:space="preserve">References</w:t>
-      </w:r>
-    </w:p>
-    <w:bookmarkStart w:id="93" w:name="refs"/>
-    <w:bookmarkStart w:id="59" w:name="X2c0b48febe45ccc797d9a56102a6e8246b839ee"/>
+    <w:bookmarkStart w:id="59" w:name="ref-buchfinkFastSensitiveProtein2014"/>
     <w:p>
       <w:pPr>
         <w:pStyle w:val="Bibliography"/>
       </w:pPr>
       <w:r>
-        <w:t xml:space="preserve">1.</w:t>
+        <w:t xml:space="preserve">2.</w:t>
       </w:r>
       <w:r>
         <w:t xml:space="preserve"> </w:t>
@@ -3221,7 +3221,33 @@
         <w:t xml:space="preserve">	</w:t>
       </w:r>
       <w:r>
-        <w:t xml:space="preserve">Bouras, G.</w:t>
+        <w:t xml:space="preserve">Buchfink, B., Xie, C. &amp; Huson, D. H.</w:t>
+      </w:r>
+      <w:r>
+        <w:t xml:space="preserve"> </w:t>
+      </w:r>
+      <w:hyperlink r:id="rId58">
+        <w:r>
+          <w:rPr>
+            <w:rStyle w:val="Hyperlink"/>
+          </w:rPr>
+          <w:t xml:space="preserve">Fast and sensitive protein alignment using</w:t>
+        </w:r>
+        <w:r>
+          <w:rPr>
+            <w:rStyle w:val="Hyperlink"/>
+          </w:rPr>
+          <w:t xml:space="preserve"> </w:t>
+        </w:r>
+        <w:r>
+          <w:rPr>
+            <w:rStyle w:val="Hyperlink"/>
+          </w:rPr>
+          <w:t xml:space="preserve">DIAMOND</w:t>
+        </w:r>
+      </w:hyperlink>
+      <w:r>
+        <w:t xml:space="preserve">.</w:t>
       </w:r>
       <w:r>
         <w:t xml:space="preserve"> </w:t>
@@ -3231,12 +3257,122 @@
           <w:i/>
           <w:iCs/>
         </w:rPr>
+        <w:t xml:space="preserve">Nature Methods</w:t>
+      </w:r>
+      <w:r>
+        <w:t xml:space="preserve"> </w:t>
+      </w:r>
+      <w:r>
+        <w:rPr>
+          <w:b/>
+          <w:bCs/>
+        </w:rPr>
+        <w:t xml:space="preserve">12</w:t>
+      </w:r>
+      <w:r>
+        <w:t xml:space="preserve">, 59–60 (2014).</w:t>
+      </w:r>
+    </w:p>
+    <w:bookmarkEnd w:id="59"/>
+    <w:bookmarkStart w:id="61" w:name="Xb1871b972aac70d2d99b56311e901dbd11f244c"/>
+    <w:p>
+      <w:pPr>
+        <w:pStyle w:val="Bibliography"/>
+      </w:pPr>
+      <w:r>
+        <w:t xml:space="preserve">3.</w:t>
+      </w:r>
+      <w:r>
+        <w:t xml:space="preserve"> </w:t>
+      </w:r>
+      <w:r>
+        <w:t xml:space="preserve">	</w:t>
+      </w:r>
+      <w:r>
+        <w:t xml:space="preserve">Steinegger, M. &amp; Söding, J.</w:t>
+      </w:r>
+      <w:r>
+        <w:t xml:space="preserve"> </w:t>
+      </w:r>
+      <w:hyperlink r:id="rId60">
+        <w:r>
+          <w:rPr>
+            <w:rStyle w:val="Hyperlink"/>
+          </w:rPr>
+          <w:t xml:space="preserve">MMseqs2</w:t>
+        </w:r>
+        <w:r>
+          <w:rPr>
+            <w:rStyle w:val="Hyperlink"/>
+          </w:rPr>
+          <w:t xml:space="preserve"> </w:t>
+        </w:r>
+        <w:r>
+          <w:rPr>
+            <w:rStyle w:val="Hyperlink"/>
+          </w:rPr>
+          <w:t xml:space="preserve">enables sensitive protein sequence searching for the analysis of massive data sets</w:t>
+        </w:r>
+      </w:hyperlink>
+      <w:r>
+        <w:t xml:space="preserve">.</w:t>
+      </w:r>
+      <w:r>
+        <w:t xml:space="preserve"> </w:t>
+      </w:r>
+      <w:r>
+        <w:rPr>
+          <w:i/>
+          <w:iCs/>
+        </w:rPr>
+        <w:t xml:space="preserve">Nature Biotechnology</w:t>
+      </w:r>
+      <w:r>
+        <w:t xml:space="preserve"> </w:t>
+      </w:r>
+      <w:r>
+        <w:rPr>
+          <w:b/>
+          <w:bCs/>
+        </w:rPr>
+        <w:t xml:space="preserve">35</w:t>
+      </w:r>
+      <w:r>
+        <w:t xml:space="preserve">, 1026–1028 (2017).</w:t>
+      </w:r>
+    </w:p>
+    <w:bookmarkEnd w:id="61"/>
+    <w:bookmarkStart w:id="63" w:name="X2c0b48febe45ccc797d9a56102a6e8246b839ee"/>
+    <w:p>
+      <w:pPr>
+        <w:pStyle w:val="Bibliography"/>
+      </w:pPr>
+      <w:r>
+        <w:t xml:space="preserve">4.</w:t>
+      </w:r>
+      <w:r>
+        <w:t xml:space="preserve"> </w:t>
+      </w:r>
+      <w:r>
+        <w:t xml:space="preserve">	</w:t>
+      </w:r>
+      <w:r>
+        <w:t xml:space="preserve">Bouras, G.</w:t>
+      </w:r>
+      <w:r>
+        <w:t xml:space="preserve"> </w:t>
+      </w:r>
+      <w:r>
+        <w:rPr>
+          <w:i/>
+          <w:iCs/>
+        </w:rPr>
         <w:t xml:space="preserve">et al.</w:t>
       </w:r>
       <w:r>
         <w:t xml:space="preserve"> </w:t>
       </w:r>
-      <w:hyperlink r:id="rId58">
+      <w:hyperlink r:id="rId62">
         <w:r>
           <w:rPr>
             <w:rStyle w:val="Hyperlink"/>
@@ -3283,14 +3419,14 @@
         <w:t xml:space="preserve">, (2026).</w:t>
       </w:r>
     </w:p>
-    <w:bookmarkEnd w:id="59"/>
-    <w:bookmarkStart w:id="61" w:name="ref-edgarProteinStructureAlignment2024"/>
+    <w:bookmarkEnd w:id="63"/>
+    <w:bookmarkStart w:id="65" w:name="ref-heinzingerBilingualLanguageModel2024"/>
     <w:p>
       <w:pPr>
         <w:pStyle w:val="Bibliography"/>
       </w:pPr>
       <w:r>
-        <w:t xml:space="preserve">2.</w:t>
+        <w:t xml:space="preserve">5.</w:t>
       </w:r>
       <w:r>
         <w:t xml:space="preserve"> </w:t>
@@ -3299,12 +3435,408 @@
         <w:t xml:space="preserve">	</w:t>
       </w:r>
       <w:r>
+        <w:t xml:space="preserve">Heinzinger, M.</w:t>
+      </w:r>
+      <w:r>
+        <w:t xml:space="preserve"> </w:t>
+      </w:r>
+      <w:r>
+        <w:rPr>
+          <w:i/>
+          <w:iCs/>
+        </w:rPr>
+        <w:t xml:space="preserve">et al.</w:t>
+      </w:r>
+      <w:r>
+        <w:t xml:space="preserve"> </w:t>
+      </w:r>
+      <w:hyperlink r:id="rId64">
+        <w:r>
+          <w:rPr>
+            <w:rStyle w:val="Hyperlink"/>
+          </w:rPr>
+          <w:t xml:space="preserve">Bilingual language model for protein sequence and structure</w:t>
+        </w:r>
+      </w:hyperlink>
+      <w:r>
+        <w:t xml:space="preserve">.</w:t>
+      </w:r>
+      <w:r>
+        <w:t xml:space="preserve"> </w:t>
+      </w:r>
+      <w:r>
+        <w:rPr>
+          <w:i/>
+          <w:iCs/>
+        </w:rPr>
+        <w:t xml:space="preserve">NAR Genomics and Bioinformatics</w:t>
+      </w:r>
+      <w:r>
+        <w:t xml:space="preserve"> </w:t>
+      </w:r>
+      <w:r>
+        <w:rPr>
+          <w:b/>
+          <w:bCs/>
+        </w:rPr>
+        <w:t xml:space="preserve">6</w:t>
+      </w:r>
+      <w:r>
+        <w:t xml:space="preserve">, lqae150 (2024).</w:t>
+      </w:r>
+    </w:p>
+    <w:bookmarkEnd w:id="65"/>
+    <w:bookmarkStart w:id="67" w:name="ref-vankempenFastAccurateProtein2024"/>
+    <w:p>
+      <w:pPr>
+        <w:pStyle w:val="Bibliography"/>
+      </w:pPr>
+      <w:r>
+        <w:t xml:space="preserve">6.</w:t>
+      </w:r>
+      <w:r>
+        <w:t xml:space="preserve"> </w:t>
+      </w:r>
+      <w:r>
+        <w:t xml:space="preserve">	</w:t>
+      </w:r>
+      <w:r>
+        <w:t xml:space="preserve">van Kempen, M.</w:t>
+      </w:r>
+      <w:r>
+        <w:t xml:space="preserve"> </w:t>
+      </w:r>
+      <w:r>
+        <w:rPr>
+          <w:i/>
+          <w:iCs/>
+        </w:rPr>
+        <w:t xml:space="preserve">et al.</w:t>
+      </w:r>
+      <w:r>
+        <w:t xml:space="preserve"> </w:t>
+      </w:r>
+      <w:hyperlink r:id="rId66">
+        <w:r>
+          <w:rPr>
+            <w:rStyle w:val="Hyperlink"/>
+          </w:rPr>
+          <w:t xml:space="preserve">Fast and accurate protein structure search with</w:t>
+        </w:r>
+        <w:r>
+          <w:rPr>
+            <w:rStyle w:val="Hyperlink"/>
+          </w:rPr>
+          <w:t xml:space="preserve"> </w:t>
+        </w:r>
+        <w:r>
+          <w:rPr>
+            <w:rStyle w:val="Hyperlink"/>
+          </w:rPr>
+          <w:t xml:space="preserve">Foldseek</w:t>
+        </w:r>
+      </w:hyperlink>
+      <w:r>
+        <w:t xml:space="preserve">.</w:t>
+      </w:r>
+      <w:r>
+        <w:t xml:space="preserve"> </w:t>
+      </w:r>
+      <w:r>
+        <w:rPr>
+          <w:i/>
+          <w:iCs/>
+        </w:rPr>
+        <w:t xml:space="preserve">Nature Biotechnology</w:t>
+      </w:r>
+      <w:r>
+        <w:t xml:space="preserve"> </w:t>
+      </w:r>
+      <w:r>
+        <w:rPr>
+          <w:b/>
+          <w:bCs/>
+        </w:rPr>
+        <w:t xml:space="preserve">42</w:t>
+      </w:r>
+      <w:r>
+        <w:t xml:space="preserve">, 243–246 (2024).</w:t>
+      </w:r>
+    </w:p>
+    <w:bookmarkEnd w:id="67"/>
+    <w:bookmarkStart w:id="69" w:name="ref-bourasBaktfoldSensitiveProtein2026"/>
+    <w:p>
+      <w:pPr>
+        <w:pStyle w:val="Bibliography"/>
+      </w:pPr>
+      <w:r>
+        <w:t xml:space="preserve">7.</w:t>
+      </w:r>
+      <w:r>
+        <w:t xml:space="preserve"> </w:t>
+      </w:r>
+      <w:r>
+        <w:t xml:space="preserve">	</w:t>
+      </w:r>
+      <w:r>
+        <w:t xml:space="preserve">Bouras, G.</w:t>
+      </w:r>
+      <w:r>
+        <w:t xml:space="preserve"> </w:t>
+      </w:r>
+      <w:r>
+        <w:rPr>
+          <w:i/>
+          <w:iCs/>
+        </w:rPr>
+        <w:t xml:space="preserve">et al.</w:t>
+      </w:r>
+      <w:r>
+        <w:t xml:space="preserve"> Baktfold:</w:t>
+      </w:r>
+      <w:r>
+        <w:t xml:space="preserve"> </w:t>
+      </w:r>
+      <w:r>
+        <w:t xml:space="preserve">Sensitive</w:t>
+      </w:r>
+      <w:r>
+        <w:t xml:space="preserve"> </w:t>
+      </w:r>
+      <w:r>
+        <w:t xml:space="preserve">protein functional annotation across the microbial tree of life using structural information. 2026.03.31.715528 (2026) doi:</w:t>
+      </w:r>
+      <w:hyperlink r:id="rId68">
+        <w:r>
+          <w:rPr>
+            <w:rStyle w:val="Hyperlink"/>
+          </w:rPr>
+          <w:t xml:space="preserve">10.64898/2026.03.31.715528</w:t>
+        </w:r>
+      </w:hyperlink>
+      <w:r>
+        <w:t xml:space="preserve">.</w:t>
+      </w:r>
+    </w:p>
+    <w:bookmarkEnd w:id="69"/>
+    <w:bookmarkStart w:id="71" w:name="ref-kotta-loizouICTVVirusTaxonomy2020"/>
+    <w:p>
+      <w:pPr>
+        <w:pStyle w:val="Bibliography"/>
+      </w:pPr>
+      <w:r>
+        <w:t xml:space="preserve">8.</w:t>
+      </w:r>
+      <w:r>
+        <w:t xml:space="preserve"> </w:t>
+      </w:r>
+      <w:r>
+        <w:t xml:space="preserve">	</w:t>
+      </w:r>
+      <w:r>
+        <w:t xml:space="preserve">Kotta-Loizou, I.</w:t>
+      </w:r>
+      <w:r>
+        <w:t xml:space="preserve"> </w:t>
+      </w:r>
+      <w:r>
+        <w:rPr>
+          <w:i/>
+          <w:iCs/>
+        </w:rPr>
+        <w:t xml:space="preserve">et al.</w:t>
+      </w:r>
+      <w:r>
+        <w:t xml:space="preserve"> </w:t>
+      </w:r>
+      <w:hyperlink r:id="rId70">
+        <w:r>
+          <w:rPr>
+            <w:rStyle w:val="Hyperlink"/>
+          </w:rPr>
+          <w:t xml:space="preserve">ICTV</w:t>
+        </w:r>
+        <w:r>
+          <w:rPr>
+            <w:rStyle w:val="Hyperlink"/>
+          </w:rPr>
+          <w:t xml:space="preserve"> </w:t>
+        </w:r>
+        <w:r>
+          <w:rPr>
+            <w:rStyle w:val="Hyperlink"/>
+          </w:rPr>
+          <w:t xml:space="preserve">virus taxonomy profile:</w:t>
+        </w:r>
+        <w:r>
+          <w:rPr>
+            <w:rStyle w:val="Hyperlink"/>
+          </w:rPr>
+          <w:t xml:space="preserve"> </w:t>
+        </w:r>
+        <w:r>
+          <w:rPr>
+            <w:rStyle w:val="Hyperlink"/>
+          </w:rPr>
+          <w:t xml:space="preserve">Chrysoviridae</w:t>
+        </w:r>
+      </w:hyperlink>
+      <w:r>
+        <w:t xml:space="preserve">.</w:t>
+      </w:r>
+      <w:r>
+        <w:t xml:space="preserve"> </w:t>
+      </w:r>
+      <w:r>
+        <w:rPr>
+          <w:i/>
+          <w:iCs/>
+        </w:rPr>
+        <w:t xml:space="preserve">Journal of General Virology</w:t>
+      </w:r>
+      <w:r>
+        <w:t xml:space="preserve"> </w:t>
+      </w:r>
+      <w:r>
+        <w:rPr>
+          <w:b/>
+          <w:bCs/>
+        </w:rPr>
+        <w:t xml:space="preserve">101</w:t>
+      </w:r>
+      <w:r>
+        <w:t xml:space="preserve">, 143–144 (2020).</w:t>
+      </w:r>
+    </w:p>
+    <w:bookmarkEnd w:id="71"/>
+    <w:bookmarkStart w:id="73" w:name="Xf51a0e35be7b1fdad86f58a646a49d02ff6f742"/>
+    <w:p>
+      <w:pPr>
+        <w:pStyle w:val="Bibliography"/>
+      </w:pPr>
+      <w:r>
+        <w:t xml:space="preserve">9.</w:t>
+      </w:r>
+      <w:r>
+        <w:t xml:space="preserve"> </w:t>
+      </w:r>
+      <w:r>
+        <w:t xml:space="preserve">	</w:t>
+      </w:r>
+      <w:r>
+        <w:t xml:space="preserve">Pantolini, L.</w:t>
+      </w:r>
+      <w:r>
+        <w:t xml:space="preserve"> </w:t>
+      </w:r>
+      <w:r>
+        <w:rPr>
+          <w:i/>
+          <w:iCs/>
+        </w:rPr>
+        <w:t xml:space="preserve">et al.</w:t>
+      </w:r>
+      <w:r>
+        <w:t xml:space="preserve"> Rewriting protein alphabets with language models. 2025.11.27.690975 (2026) doi:</w:t>
+      </w:r>
+      <w:hyperlink r:id="rId72">
+        <w:r>
+          <w:rPr>
+            <w:rStyle w:val="Hyperlink"/>
+          </w:rPr>
+          <w:t xml:space="preserve">10.1101/2025.11.27.690975</w:t>
+        </w:r>
+      </w:hyperlink>
+      <w:r>
+        <w:t xml:space="preserve">.</w:t>
+      </w:r>
+    </w:p>
+    <w:bookmarkEnd w:id="73"/>
+    <w:bookmarkStart w:id="75" w:name="ref-passaroBoltz2AccurateEfficient2025"/>
+    <w:p>
+      <w:pPr>
+        <w:pStyle w:val="Bibliography"/>
+      </w:pPr>
+      <w:r>
+        <w:t xml:space="preserve">10.</w:t>
+      </w:r>
+      <w:r>
+        <w:t xml:space="preserve"> </w:t>
+      </w:r>
+      <w:r>
+        <w:t xml:space="preserve">	</w:t>
+      </w:r>
+      <w:r>
+        <w:t xml:space="preserve">Passaro, S.</w:t>
+      </w:r>
+      <w:r>
+        <w:t xml:space="preserve"> </w:t>
+      </w:r>
+      <w:r>
+        <w:rPr>
+          <w:i/>
+          <w:iCs/>
+        </w:rPr>
+        <w:t xml:space="preserve">et al.</w:t>
+      </w:r>
+      <w:r>
+        <w:t xml:space="preserve"> Boltz-2:</w:t>
+      </w:r>
+      <w:r>
+        <w:t xml:space="preserve"> </w:t>
+      </w:r>
+      <w:r>
+        <w:t xml:space="preserve">Towards Accurate</w:t>
+      </w:r>
+      <w:r>
+        <w:t xml:space="preserve"> </w:t>
+      </w:r>
+      <w:r>
+        <w:t xml:space="preserve">and</w:t>
+      </w:r>
+      <w:r>
+        <w:t xml:space="preserve"> </w:t>
+      </w:r>
+      <w:r>
+        <w:t xml:space="preserve">Efficient Binding Affinity Prediction</w:t>
+      </w:r>
+      <w:r>
+        <w:t xml:space="preserve">. 2025.06.14.659707 (2025) doi:</w:t>
+      </w:r>
+      <w:hyperlink r:id="rId74">
+        <w:r>
+          <w:rPr>
+            <w:rStyle w:val="Hyperlink"/>
+          </w:rPr>
+          <w:t xml:space="preserve">10.1101/2025.06.14.659707</w:t>
+        </w:r>
+      </w:hyperlink>
+      <w:r>
+        <w:t xml:space="preserve">.</w:t>
+      </w:r>
+    </w:p>
+    <w:bookmarkEnd w:id="75"/>
+    <w:bookmarkStart w:id="77" w:name="ref-edgarProteinStructureAlignment2024"/>
+    <w:p>
+      <w:pPr>
+        <w:pStyle w:val="Bibliography"/>
+      </w:pPr>
+      <w:r>
+        <w:t xml:space="preserve">11.</w:t>
+      </w:r>
+      <w:r>
+        <w:t xml:space="preserve"> </w:t>
+      </w:r>
+      <w:r>
+        <w:t xml:space="preserve">	</w:t>
+      </w:r>
+      <w:r>
         <w:t xml:space="preserve">Edgar, R. C.</w:t>
       </w:r>
       <w:r>
         <w:t xml:space="preserve"> </w:t>
       </w:r>
-      <w:hyperlink r:id="rId60">
+      <w:hyperlink r:id="rId76">
         <w:r>
           <w:rPr>
             <w:rStyle w:val="Hyperlink"/>
@@ -3363,14 +3895,14 @@
         <w:t xml:space="preserve">, btae687 (2024).</w:t>
       </w:r>
     </w:p>
-    <w:bookmarkEnd w:id="61"/>
-    <w:bookmarkStart w:id="63" w:name="ref-edgarProteinStructureAlignment2025"/>
+    <w:bookmarkEnd w:id="77"/>
+    <w:bookmarkStart w:id="79" w:name="ref-kimBFVDLargeRepository2025"/>
     <w:p>
       <w:pPr>
         <w:pStyle w:val="Bibliography"/>
       </w:pPr>
       <w:r>
-        <w:t xml:space="preserve">3.</w:t>
+        <w:t xml:space="preserve">12.</w:t>
       </w:r>
       <w:r>
         <w:t xml:space="preserve"> </w:t>
@@ -3379,246 +3911,12 @@
         <w:t xml:space="preserve">	</w:t>
       </w:r>
       <w:r>
-        <w:t xml:space="preserve">Edgar, R. C. &amp; Sahakyan, H. Protein structure alignment significance is often exaggerated. 2025.07.17.665375 (2025) doi:</w:t>
-      </w:r>
-      <w:hyperlink r:id="rId62">
-        <w:r>
-          <w:rPr>
-            <w:rStyle w:val="Hyperlink"/>
-          </w:rPr>
-          <w:t xml:space="preserve">10.1101/2025.07.17.665375</w:t>
-        </w:r>
-      </w:hyperlink>
-      <w:r>
-        <w:t xml:space="preserve">.</w:t>
-      </w:r>
-    </w:p>
-    <w:bookmarkEnd w:id="63"/>
-    <w:bookmarkStart w:id="64" w:name="ref-Peter_hyperfine_2023"/>
-    <w:p>
-      <w:pPr>
-        <w:pStyle w:val="Bibliography"/>
-      </w:pPr>
-      <w:r>
-        <w:t xml:space="preserve">4.</w:t>
-      </w:r>
-      <w:r>
-        <w:t xml:space="preserve"> </w:t>
-      </w:r>
-      <w:r>
-        <w:t xml:space="preserve">	</w:t>
-      </w:r>
-      <w:r>
-        <w:t xml:space="preserve">Peter, D. Hyperfine. (2023).</w:t>
-      </w:r>
-    </w:p>
-    <w:bookmarkEnd w:id="64"/>
-    <w:bookmarkStart w:id="66" w:name="ref-vankempenFastAccurateProtein2024"/>
-    <w:p>
-      <w:pPr>
-        <w:pStyle w:val="Bibliography"/>
-      </w:pPr>
-      <w:r>
-        <w:t xml:space="preserve">5.</w:t>
-      </w:r>
-      <w:r>
-        <w:t xml:space="preserve"> </w:t>
-      </w:r>
-      <w:r>
-        <w:t xml:space="preserve">	</w:t>
-      </w:r>
-      <w:r>
-        <w:t xml:space="preserve">van Kempen, M.</w:t>
-      </w:r>
-      <w:r>
-        <w:t xml:space="preserve"> </w:t>
-      </w:r>
-      <w:r>
-        <w:rPr>
-          <w:i/>
-          <w:iCs/>
-        </w:rPr>
-        <w:t xml:space="preserve">et al.</w:t>
-      </w:r>
-      <w:r>
-        <w:t xml:space="preserve"> </w:t>
-      </w:r>
-      <w:hyperlink r:id="rId65">
-        <w:r>
-          <w:rPr>
-            <w:rStyle w:val="Hyperlink"/>
-          </w:rPr>
-          <w:t xml:space="preserve">Fast and accurate protein structure search with</w:t>
-        </w:r>
-        <w:r>
-          <w:rPr>
-            <w:rStyle w:val="Hyperlink"/>
-          </w:rPr>
-          <w:t xml:space="preserve"> </w:t>
-        </w:r>
-        <w:r>
-          <w:rPr>
-            <w:rStyle w:val="Hyperlink"/>
-          </w:rPr>
-          <w:t xml:space="preserve">Foldseek</w:t>
-        </w:r>
-      </w:hyperlink>
-      <w:r>
-        <w:t xml:space="preserve">.</w:t>
-      </w:r>
-      <w:r>
-        <w:t xml:space="preserve"> </w:t>
-      </w:r>
-      <w:r>
-        <w:rPr>
-          <w:i/>
-          <w:iCs/>
-        </w:rPr>
-        <w:t xml:space="preserve">Nature Biotechnology</w:t>
-      </w:r>
-      <w:r>
-        <w:t xml:space="preserve"> </w:t>
-      </w:r>
-      <w:r>
-        <w:rPr>
-          <w:b/>
-          <w:bCs/>
-        </w:rPr>
-        <w:t xml:space="preserve">42</w:t>
-      </w:r>
-      <w:r>
-        <w:t xml:space="preserve">, 243–246 (2024).</w:t>
-      </w:r>
-    </w:p>
-    <w:bookmarkEnd w:id="66"/>
-    <w:bookmarkStart w:id="68" w:name="Xf51a0e35be7b1fdad86f58a646a49d02ff6f742"/>
-    <w:p>
-      <w:pPr>
-        <w:pStyle w:val="Bibliography"/>
-      </w:pPr>
-      <w:r>
-        <w:t xml:space="preserve">6.</w:t>
-      </w:r>
-      <w:r>
-        <w:t xml:space="preserve"> </w:t>
-      </w:r>
-      <w:r>
-        <w:t xml:space="preserve">	</w:t>
-      </w:r>
-      <w:r>
-        <w:t xml:space="preserve">Pantolini, L.</w:t>
-      </w:r>
-      <w:r>
-        <w:t xml:space="preserve"> </w:t>
-      </w:r>
-      <w:r>
-        <w:rPr>
-          <w:i/>
-          <w:iCs/>
-        </w:rPr>
-        <w:t xml:space="preserve">et al.</w:t>
-      </w:r>
-      <w:r>
-        <w:t xml:space="preserve"> Rewriting protein alphabets with language models. 2025.11.27.690975 (2026) doi:</w:t>
-      </w:r>
-      <w:hyperlink r:id="rId67">
-        <w:r>
-          <w:rPr>
-            <w:rStyle w:val="Hyperlink"/>
-          </w:rPr>
-          <w:t xml:space="preserve">10.1101/2025.11.27.690975</w:t>
-        </w:r>
-      </w:hyperlink>
-      <w:r>
-        <w:t xml:space="preserve">.</w:t>
-      </w:r>
-    </w:p>
-    <w:bookmarkEnd w:id="68"/>
-    <w:bookmarkStart w:id="70" w:name="ref-passaroBoltz2AccurateEfficient2025"/>
-    <w:p>
-      <w:pPr>
-        <w:pStyle w:val="Bibliography"/>
-      </w:pPr>
-      <w:r>
-        <w:t xml:space="preserve">7.</w:t>
-      </w:r>
-      <w:r>
-        <w:t xml:space="preserve"> </w:t>
-      </w:r>
-      <w:r>
-        <w:t xml:space="preserve">	</w:t>
-      </w:r>
-      <w:r>
-        <w:t xml:space="preserve">Passaro, S.</w:t>
-      </w:r>
-      <w:r>
-        <w:t xml:space="preserve"> </w:t>
-      </w:r>
-      <w:r>
-        <w:rPr>
-          <w:i/>
-          <w:iCs/>
-        </w:rPr>
-        <w:t xml:space="preserve">et al.</w:t>
-      </w:r>
-      <w:r>
-        <w:t xml:space="preserve"> Boltz-2:</w:t>
-      </w:r>
-      <w:r>
-        <w:t xml:space="preserve"> </w:t>
-      </w:r>
-      <w:r>
-        <w:t xml:space="preserve">Towards Accurate</w:t>
-      </w:r>
-      <w:r>
-        <w:t xml:space="preserve"> </w:t>
-      </w:r>
-      <w:r>
-        <w:t xml:space="preserve">and</w:t>
-      </w:r>
-      <w:r>
-        <w:t xml:space="preserve"> </w:t>
-      </w:r>
-      <w:r>
-        <w:t xml:space="preserve">Efficient Binding Affinity Prediction</w:t>
-      </w:r>
-      <w:r>
-        <w:t xml:space="preserve">. 2025.06.14.659707 (2025) doi:</w:t>
-      </w:r>
-      <w:hyperlink r:id="rId69">
-        <w:r>
-          <w:rPr>
-            <w:rStyle w:val="Hyperlink"/>
-          </w:rPr>
-          <w:t xml:space="preserve">10.1101/2025.06.14.659707</w:t>
-        </w:r>
-      </w:hyperlink>
-      <w:r>
-        <w:t xml:space="preserve">.</w:t>
-      </w:r>
-    </w:p>
-    <w:bookmarkEnd w:id="70"/>
-    <w:bookmarkStart w:id="72" w:name="ref-kimBFVDLargeRepository2025"/>
-    <w:p>
-      <w:pPr>
-        <w:pStyle w:val="Bibliography"/>
-      </w:pPr>
-      <w:r>
-        <w:t xml:space="preserve">8.</w:t>
-      </w:r>
-      <w:r>
-        <w:t xml:space="preserve"> </w:t>
-      </w:r>
-      <w:r>
-        <w:t xml:space="preserve">	</w:t>
-      </w:r>
-      <w:r>
         <w:t xml:space="preserve">Kim, R. S., Levy Karin, E., Mirdita, M., Chikhi, R. &amp; Steinegger, M.</w:t>
       </w:r>
       <w:r>
         <w:t xml:space="preserve"> </w:t>
       </w:r>
-      <w:hyperlink r:id="rId71">
+      <w:hyperlink r:id="rId78">
         <w:r>
           <w:rPr>
             <w:rStyle w:val="Hyperlink"/>
@@ -3659,14 +3957,63 @@
         <w:t xml:space="preserve">, D340–D347 (2025).</w:t>
       </w:r>
     </w:p>
-    <w:bookmarkEnd w:id="72"/>
-    <w:bookmarkStart w:id="74" w:name="ref-terzianPHROGFamiliesProkaryotic2021"/>
+    <w:bookmarkEnd w:id="79"/>
+    <w:bookmarkStart w:id="81" w:name="ref-edgarProteinStructureAlignment2025"/>
     <w:p>
       <w:pPr>
         <w:pStyle w:val="Bibliography"/>
       </w:pPr>
       <w:r>
-        <w:t xml:space="preserve">9.</w:t>
+        <w:t xml:space="preserve">13.</w:t>
+      </w:r>
+      <w:r>
+        <w:t xml:space="preserve"> </w:t>
+      </w:r>
+      <w:r>
+        <w:t xml:space="preserve">	</w:t>
+      </w:r>
+      <w:r>
+        <w:t xml:space="preserve">Edgar, R. C. &amp; Sahakyan, H. Protein structure alignment significance is often exaggerated. 2025.07.17.665375 (2025) doi:</w:t>
+      </w:r>
+      <w:hyperlink r:id="rId80">
+        <w:r>
+          <w:rPr>
+            <w:rStyle w:val="Hyperlink"/>
+          </w:rPr>
+          <w:t xml:space="preserve">10.1101/2025.07.17.665375</w:t>
+        </w:r>
+      </w:hyperlink>
+      <w:r>
+        <w:t xml:space="preserve">.</w:t>
+      </w:r>
+    </w:p>
+    <w:bookmarkEnd w:id="81"/>
+    <w:bookmarkStart w:id="82" w:name="ref-Peter_hyperfine_2023"/>
+    <w:p>
+      <w:pPr>
+        <w:pStyle w:val="Bibliography"/>
+      </w:pPr>
+      <w:r>
+        <w:t xml:space="preserve">14.</w:t>
+      </w:r>
+      <w:r>
+        <w:t xml:space="preserve"> </w:t>
+      </w:r>
+      <w:r>
+        <w:t xml:space="preserve">	</w:t>
+      </w:r>
+      <w:r>
+        <w:t xml:space="preserve">Peter, D. Hyperfine. (2023).</w:t>
+      </w:r>
+    </w:p>
+    <w:bookmarkEnd w:id="82"/>
+    <w:bookmarkStart w:id="84" w:name="ref-terzianPHROGFamiliesProkaryotic2021"/>
+    <w:p>
+      <w:pPr>
+        <w:pStyle w:val="Bibliography"/>
+      </w:pPr>
+      <w:r>
+        <w:t xml:space="preserve">15.</w:t>
       </w:r>
       <w:r>
         <w:t xml:space="preserve"> </w:t>
@@ -3690,7 +4037,7 @@
       <w:r>
         <w:t xml:space="preserve"> </w:t>
       </w:r>
-      <w:hyperlink r:id="rId73">
+      <w:hyperlink r:id="rId83">
         <w:r>
           <w:rPr>
             <w:rStyle w:val="Hyperlink"/>
@@ -3731,14 +4078,14 @@
         <w:t xml:space="preserve">, lqab067 (2021).</w:t>
       </w:r>
     </w:p>
-    <w:bookmarkEnd w:id="74"/>
-    <w:bookmarkStart w:id="76" w:name="ref-boulayEmpathiEmbeddingbasedPhage2025"/>
+    <w:bookmarkEnd w:id="84"/>
+    <w:bookmarkStart w:id="86" w:name="ref-boulayEmpathiEmbeddingbasedPhage2025"/>
     <w:p>
       <w:pPr>
         <w:pStyle w:val="Bibliography"/>
       </w:pPr>
       <w:r>
-        <w:t xml:space="preserve">10.</w:t>
+        <w:t xml:space="preserve">16.</w:t>
       </w:r>
       <w:r>
         <w:t xml:space="preserve"> </w:t>
@@ -3752,7 +4099,7 @@
       <w:r>
         <w:t xml:space="preserve"> </w:t>
       </w:r>
-      <w:hyperlink r:id="rId75">
+      <w:hyperlink r:id="rId85">
         <w:r>
           <w:rPr>
             <w:rStyle w:val="Hyperlink"/>
@@ -3787,14 +4134,14 @@
         <w:t xml:space="preserve">, 9114 (2025).</w:t>
       </w:r>
     </w:p>
-    <w:bookmarkEnd w:id="76"/>
-    <w:bookmarkStart w:id="78" w:name="ref-altschulBasicLocalAlignment1990"/>
+    <w:bookmarkEnd w:id="86"/>
+    <w:bookmarkStart w:id="88" w:name="Xa956458ae3e05b5069e24cca7d937b4d5bcb564"/>
     <w:p>
       <w:pPr>
         <w:pStyle w:val="Bibliography"/>
       </w:pPr>
       <w:r>
-        <w:t xml:space="preserve">11.</w:t>
+        <w:t xml:space="preserve">17.</w:t>
       </w:r>
       <w:r>
         <w:t xml:space="preserve"> </w:t>
@@ -3803,58 +4150,12 @@
         <w:t xml:space="preserve">	</w:t>
       </w:r>
       <w:r>
-        <w:t xml:space="preserve">Altschul, S. F., Gish, W., Miller, W., Myers, E. W. &amp; Lipman, D. J.</w:t>
-      </w:r>
-      <w:r>
-        <w:t xml:space="preserve"> </w:t>
-      </w:r>
-      <w:hyperlink r:id="rId77">
-        <w:r>
-          <w:rPr>
-            <w:rStyle w:val="Hyperlink"/>
-          </w:rPr>
-          <w:t xml:space="preserve">Basic local alignment search tool</w:t>
-        </w:r>
-      </w:hyperlink>
-      <w:r>
-        <w:t xml:space="preserve">.</w:t>
-      </w:r>
-      <w:r>
-        <w:t xml:space="preserve"> </w:t>
-      </w:r>
-      <w:r>
-        <w:rPr>
-          <w:b/>
-          <w:bCs/>
-        </w:rPr>
-        <w:t xml:space="preserve">215</w:t>
-      </w:r>
-      <w:r>
-        <w:t xml:space="preserve">, 403–410 (1990).</w:t>
-      </w:r>
-    </w:p>
-    <w:bookmarkEnd w:id="78"/>
-    <w:bookmarkStart w:id="80" w:name="Xa956458ae3e05b5069e24cca7d937b4d5bcb564"/>
-    <w:p>
-      <w:pPr>
-        <w:pStyle w:val="Bibliography"/>
-      </w:pPr>
-      <w:r>
-        <w:t xml:space="preserve">12.</w:t>
-      </w:r>
-      <w:r>
-        <w:t xml:space="preserve"> </w:t>
-      </w:r>
-      <w:r>
-        <w:t xml:space="preserve">	</w:t>
-      </w:r>
-      <w:r>
         <w:t xml:space="preserve">Buchfink, B., Reuter, K. &amp; Drost, H.-G.</w:t>
       </w:r>
       <w:r>
         <w:t xml:space="preserve"> </w:t>
       </w:r>
-      <w:hyperlink r:id="rId79">
+      <w:hyperlink r:id="rId87">
         <w:r>
           <w:rPr>
             <w:rStyle w:val="Hyperlink"/>
@@ -3901,14 +4202,14 @@
         <w:t xml:space="preserve">, 366–368 (2021).</w:t>
       </w:r>
     </w:p>
-    <w:bookmarkEnd w:id="80"/>
-    <w:bookmarkStart w:id="82" w:name="Xb1871b972aac70d2d99b56311e901dbd11f244c"/>
+    <w:bookmarkEnd w:id="88"/>
+    <w:bookmarkStart w:id="90" w:name="Xab23086715934bcc0f018ee599e230e9d872dae"/>
     <w:p>
       <w:pPr>
         <w:pStyle w:val="Bibliography"/>
       </w:pPr>
       <w:r>
-        <w:t xml:space="preserve">13.</w:t>
+        <w:t xml:space="preserve">18.</w:t>
       </w:r>
       <w:r>
         <w:t xml:space="preserve"> </w:t>
@@ -3917,33 +4218,7 @@
         <w:t xml:space="preserve">	</w:t>
       </w:r>
       <w:r>
-        <w:t xml:space="preserve">Steinegger, M. &amp; Söding, J.</w:t>
-      </w:r>
-      <w:r>
-        <w:t xml:space="preserve"> </w:t>
-      </w:r>
-      <w:hyperlink r:id="rId81">
-        <w:r>
-          <w:rPr>
-            <w:rStyle w:val="Hyperlink"/>
-          </w:rPr>
-          <w:t xml:space="preserve">MMseqs2</w:t>
-        </w:r>
-        <w:r>
-          <w:rPr>
-            <w:rStyle w:val="Hyperlink"/>
-          </w:rPr>
-          <w:t xml:space="preserve"> </w:t>
-        </w:r>
-        <w:r>
-          <w:rPr>
-            <w:rStyle w:val="Hyperlink"/>
-          </w:rPr>
-          <w:t xml:space="preserve">enables sensitive protein sequence searching for the analysis of massive data sets</w:t>
-        </w:r>
-      </w:hyperlink>
-      <w:r>
-        <w:t xml:space="preserve">.</w:t>
+        <w:t xml:space="preserve">Elnaggar, A.</w:t>
       </w:r>
       <w:r>
         <w:t xml:space="preserve"> </w:t>
@@ -3953,120 +4228,12 @@
           <w:i/>
           <w:iCs/>
         </w:rPr>
-        <w:t xml:space="preserve">Nature Biotechnology</w:t>
-      </w:r>
-      <w:r>
-        <w:t xml:space="preserve"> </w:t>
-      </w:r>
-      <w:r>
-        <w:rPr>
-          <w:b/>
-          <w:bCs/>
-        </w:rPr>
-        <w:t xml:space="preserve">35</w:t>
-      </w:r>
-      <w:r>
-        <w:t xml:space="preserve">, 1026–1028 (2017).</w:t>
-      </w:r>
-    </w:p>
-    <w:bookmarkEnd w:id="82"/>
-    <w:bookmarkStart w:id="84" w:name="ref-heinzingerBilingualLanguageModel2024"/>
-    <w:p>
-      <w:pPr>
-        <w:pStyle w:val="Bibliography"/>
-      </w:pPr>
-      <w:r>
-        <w:t xml:space="preserve">14.</w:t>
-      </w:r>
-      <w:r>
-        <w:t xml:space="preserve"> </w:t>
-      </w:r>
-      <w:r>
-        <w:t xml:space="preserve">	</w:t>
-      </w:r>
-      <w:r>
-        <w:t xml:space="preserve">Heinzinger, M.</w:t>
-      </w:r>
-      <w:r>
-        <w:t xml:space="preserve"> </w:t>
-      </w:r>
-      <w:r>
-        <w:rPr>
-          <w:i/>
-          <w:iCs/>
-        </w:rPr>
         <w:t xml:space="preserve">et al.</w:t>
       </w:r>
       <w:r>
         <w:t xml:space="preserve"> </w:t>
       </w:r>
-      <w:hyperlink r:id="rId83">
-        <w:r>
-          <w:rPr>
-            <w:rStyle w:val="Hyperlink"/>
-          </w:rPr>
-          <w:t xml:space="preserve">Bilingual language model for protein sequence and structure</w:t>
-        </w:r>
-      </w:hyperlink>
-      <w:r>
-        <w:t xml:space="preserve">.</w:t>
-      </w:r>
-      <w:r>
-        <w:t xml:space="preserve"> </w:t>
-      </w:r>
-      <w:r>
-        <w:rPr>
-          <w:i/>
-          <w:iCs/>
-        </w:rPr>
-        <w:t xml:space="preserve">NAR Genomics and Bioinformatics</w:t>
-      </w:r>
-      <w:r>
-        <w:t xml:space="preserve"> </w:t>
-      </w:r>
-      <w:r>
-        <w:rPr>
-          <w:b/>
-          <w:bCs/>
-        </w:rPr>
-        <w:t xml:space="preserve">6</w:t>
-      </w:r>
-      <w:r>
-        <w:t xml:space="preserve">, lqae150 (2024).</w:t>
-      </w:r>
-    </w:p>
-    <w:bookmarkEnd w:id="84"/>
-    <w:bookmarkStart w:id="86" w:name="Xab23086715934bcc0f018ee599e230e9d872dae"/>
-    <w:p>
-      <w:pPr>
-        <w:pStyle w:val="Bibliography"/>
-      </w:pPr>
-      <w:r>
-        <w:t xml:space="preserve">15.</w:t>
-      </w:r>
-      <w:r>
-        <w:t xml:space="preserve"> </w:t>
-      </w:r>
-      <w:r>
-        <w:t xml:space="preserve">	</w:t>
-      </w:r>
-      <w:r>
-        <w:t xml:space="preserve">Elnaggar, A.</w:t>
-      </w:r>
-      <w:r>
-        <w:t xml:space="preserve"> </w:t>
-      </w:r>
-      <w:r>
-        <w:rPr>
-          <w:i/>
-          <w:iCs/>
-        </w:rPr>
-        <w:t xml:space="preserve">et al.</w:t>
-      </w:r>
-      <w:r>
-        <w:t xml:space="preserve"> </w:t>
-      </w:r>
-      <w:hyperlink r:id="rId85">
+      <w:hyperlink r:id="rId89">
         <w:r>
           <w:rPr>
             <w:rStyle w:val="Hyperlink"/>
@@ -4167,14 +4334,14 @@
         <w:t xml:space="preserve">, 7112–7127 (2022).</w:t>
       </w:r>
     </w:p>
-    <w:bookmarkEnd w:id="86"/>
-    <w:bookmarkStart w:id="88" w:name="X5f1b8907d6a3bec1b0fabfc5f84c6d1da0a2a36"/>
+    <w:bookmarkEnd w:id="90"/>
+    <w:bookmarkStart w:id="92" w:name="X5f1b8907d6a3bec1b0fabfc5f84c6d1da0a2a36"/>
     <w:p>
       <w:pPr>
         <w:pStyle w:val="Bibliography"/>
       </w:pPr>
       <w:r>
-        <w:t xml:space="preserve">16.</w:t>
+        <w:t xml:space="preserve">19.</w:t>
       </w:r>
       <w:r>
         <w:t xml:space="preserve"> </w:t>
@@ -4198,7 +4365,7 @@
       <w:r>
         <w:t xml:space="preserve"> </w:t>
       </w:r>
-      <w:hyperlink r:id="rId87">
+      <w:hyperlink r:id="rId91">
         <w:r>
           <w:rPr>
             <w:rStyle w:val="Hyperlink"/>
@@ -4233,14 +4400,14 @@
         <w:t xml:space="preserve">, 1123–1130 (2023).</w:t>
       </w:r>
     </w:p>
-    <w:bookmarkEnd w:id="88"/>
-    <w:bookmarkStart w:id="90" w:name="ref-mirditaColabFoldMakingProtein2022"/>
+    <w:bookmarkEnd w:id="92"/>
+    <w:bookmarkStart w:id="94" w:name="ref-mirditaColabFoldMakingProtein2022"/>
     <w:p>
       <w:pPr>
         <w:pStyle w:val="Bibliography"/>
       </w:pPr>
       <w:r>
-        <w:t xml:space="preserve">17.</w:t>
+        <w:t xml:space="preserve">20.</w:t>
       </w:r>
       <w:r>
         <w:t xml:space="preserve"> </w:t>
@@ -4264,7 +4431,7 @@
       <w:r>
         <w:t xml:space="preserve"> </w:t>
       </w:r>
-      <w:hyperlink r:id="rId89">
+      <w:hyperlink r:id="rId93">
         <w:r>
           <w:rPr>
             <w:rStyle w:val="Hyperlink"/>
@@ -4305,14 +4472,14 @@
         <w:t xml:space="preserve">, 679–682 (2022).</w:t>
       </w:r>
     </w:p>
-    <w:bookmarkEnd w:id="90"/>
-    <w:bookmarkStart w:id="92" w:name="X970de467fd5d06c167b475b1295fef72fd3ada6"/>
+    <w:bookmarkEnd w:id="94"/>
+    <w:bookmarkStart w:id="96" w:name="X970de467fd5d06c167b475b1295fef72fd3ada6"/>
     <w:p>
       <w:pPr>
         <w:pStyle w:val="Bibliography"/>
       </w:pPr>
       <w:r>
-        <w:t xml:space="preserve">18.</w:t>
+        <w:t xml:space="preserve">21.</w:t>
       </w:r>
       <w:r>
         <w:t xml:space="preserve"> </w:t>
@@ -4336,7 +4503,7 @@
       <w:r>
         <w:t xml:space="preserve"> </w:t>
       </w:r>
-      <w:hyperlink r:id="rId91">
+      <w:hyperlink r:id="rId95">
         <w:r>
           <w:rPr>
             <w:rStyle w:val="Hyperlink"/>
@@ -4395,15 +4562,15 @@
         <w:t xml:space="preserve">, e03200–24 (2024).</w:t>
       </w:r>
     </w:p>
-    <w:bookmarkEnd w:id="92"/>
-    <w:bookmarkEnd w:id="93"/>
+    <w:bookmarkEnd w:id="96"/>
+    <w:bookmarkEnd w:id="97"/>
     <w:p>
       <w:r>
         <w:br w:type="page"/>
       </w:r>
     </w:p>
-    <w:bookmarkEnd w:id="94"/>
-    <w:bookmarkStart w:id="113" w:name="supplementary-figures"/>
+    <w:bookmarkEnd w:id="98"/>
+    <w:bookmarkStart w:id="117" w:name="supplementary-figures"/>
     <w:p>
       <w:pPr>
         <w:pStyle w:val="Heading1"/>
@@ -4425,7 +4592,7 @@
       <w:tr>
         <w:tc>
           <w:tcPr/>
-          <w:bookmarkStart w:id="98" w:name="suppfig-kingdom"/>
+          <w:bookmarkStart w:id="102" w:name="suppfig-kingdom"/>
           <w:p>
             <w:pPr>
               <w:pStyle w:val="Compact"/>
@@ -4436,18 +4603,18 @@
                 <wp:inline>
                   <wp:extent cx="3657600" cy="2743200"/>
                   <wp:effectExtent b="0" l="0" r="0" t="0"/>
-                  <wp:docPr descr="" title="" id="96" name="Picture"/>
+                  <wp:docPr descr="" title="" id="100" name="Picture"/>
                   <a:graphic>
                     <a:graphicData uri="http://schemas.openxmlformats.org/drawingml/2006/picture">
                       <pic:pic>
                         <pic:nvPicPr>
-                          <pic:cNvPr descr="../figures/data_info/kingdom_distribution.pdf" id="97" name="Picture"/>
+                          <pic:cNvPr descr="../figures/data_info/kingdom_distribution.pdf" id="101" name="Picture"/>
                           <pic:cNvPicPr>
                             <a:picLocks noChangeArrowheads="1" noChangeAspect="1"/>
                           </pic:cNvPicPr>
                         </pic:nvPicPr>
                         <pic:blipFill>
-                          <a:blip r:embed="rId95"/>
+                          <a:blip r:embed="rId99"/>
                           <a:stretch>
                             <a:fillRect/>
                           </a:stretch>
@@ -4487,7 +4654,7 @@
               <w:t xml:space="preserve">Supplemental Figure 1: The distribution of the number of genomes from the different viral Kingdoms in the test set.</w:t>
             </w:r>
           </w:p>
-          <w:bookmarkEnd w:id="98"/>
+          <w:bookmarkEnd w:id="102"/>
         </w:tc>
       </w:tr>
     </w:tbl>
@@ -4512,7 +4679,7 @@
       <w:tr>
         <w:tc>
           <w:tcPr/>
-          <w:bookmarkStart w:id="102" w:name="suppfig-query-vs-evalue"/>
+          <w:bookmarkStart w:id="106" w:name="suppfig-query-vs-evalue"/>
           <w:p>
             <w:pPr>
               <w:pStyle w:val="Compact"/>
@@ -4523,18 +4690,18 @@
                 <wp:inline>
                   <wp:extent cx="5486400" cy="3657600"/>
                   <wp:effectExtent b="0" l="0" r="0" t="0"/>
-                  <wp:docPr descr="" title="" id="100" name="Picture"/>
+                  <wp:docPr descr="" title="" id="104" name="Picture"/>
                   <a:graphic>
                     <a:graphicData uri="http://schemas.openxmlformats.org/drawingml/2006/picture">
                       <pic:pic>
                         <pic:nvPicPr>
-                          <pic:cNvPr descr="../figures/search_results/unique_queries_vs_evalue.pdf" id="101" name="Picture"/>
+                          <pic:cNvPr descr="../figures/search_results/unique_queries_vs_evalue.pdf" id="105" name="Picture"/>
                           <pic:cNvPicPr>
                             <a:picLocks noChangeArrowheads="1" noChangeAspect="1"/>
                           </pic:cNvPicPr>
                         </pic:nvPicPr>
                         <pic:blipFill>
-                          <a:blip r:embed="rId99"/>
+                          <a:blip r:embed="rId103"/>
                           <a:stretch>
                             <a:fillRect/>
                           </a:stretch>
@@ -4574,7 +4741,7 @@
               <w:t xml:space="preserve">Supplemental Figure 2: The number of test proteins with at least 1 hit for each method across different E-value thresholds.</w:t>
             </w:r>
           </w:p>
-          <w:bookmarkEnd w:id="102"/>
+          <w:bookmarkEnd w:id="106"/>
         </w:tc>
       </w:tr>
     </w:tbl>
@@ -4599,7 +4766,7 @@
       <w:tr>
         <w:tc>
           <w:tcPr/>
-          <w:bookmarkStart w:id="106" w:name="suppfig-pairwise-method"/>
+          <w:bookmarkStart w:id="110" w:name="suppfig-pairwise-method"/>
           <w:p>
             <w:pPr>
               <w:pStyle w:val="Compact"/>
@@ -4610,18 +4777,18 @@
                 <wp:inline>
                   <wp:extent cx="5943600" cy="1981200"/>
                   <wp:effectExtent b="0" l="0" r="0" t="0"/>
-                  <wp:docPr descr="" title="" id="104" name="Picture"/>
+                  <wp:docPr descr="" title="" id="108" name="Picture"/>
                   <a:graphic>
                     <a:graphicData uri="http://schemas.openxmlformats.org/drawingml/2006/picture">
                       <pic:pic>
                         <pic:nvPicPr>
-                          <pic:cNvPr descr="../figures/search_results/hit_overlap_methods.pdf" id="105" name="Picture"/>
+                          <pic:cNvPr descr="../figures/search_results/hit_overlap_methods.pdf" id="109" name="Picture"/>
                           <pic:cNvPicPr>
                             <a:picLocks noChangeArrowheads="1" noChangeAspect="1"/>
                           </pic:cNvPicPr>
                         </pic:nvPicPr>
                         <pic:blipFill>
-                          <a:blip r:embed="rId103"/>
+                          <a:blip r:embed="rId107"/>
                           <a:stretch>
                             <a:fillRect/>
                           </a:stretch>
@@ -4661,7 +4828,7 @@
               <w:t xml:space="preserve">Supplemental Figure 3: Pairwise comparisons of shared hits between search methods for (A) the best 25 hits, (B) the best 25 hits after filtering on E-value (E &lt; 1e-03), and (C) the top hits for each query.</w:t>
             </w:r>
           </w:p>
-          <w:bookmarkEnd w:id="106"/>
+          <w:bookmarkEnd w:id="110"/>
         </w:tc>
       </w:tr>
     </w:tbl>
@@ -4686,7 +4853,7 @@
       <w:tr>
         <w:tc>
           <w:tcPr/>
-          <w:bookmarkStart w:id="110" w:name="suppfig-time-increase"/>
+          <w:bookmarkStart w:id="114" w:name="suppfig-time-increase"/>
           <w:p>
             <w:pPr>
               <w:pStyle w:val="Compact"/>
@@ -4697,18 +4864,18 @@
                 <wp:inline>
                   <wp:extent cx="3238500" cy="3238500"/>
                   <wp:effectExtent b="0" l="0" r="0" t="0"/>
-                  <wp:docPr descr="" title="" id="108" name="Picture"/>
+                  <wp:docPr descr="" title="" id="112" name="Picture"/>
                   <a:graphic>
                     <a:graphicData uri="http://schemas.openxmlformats.org/drawingml/2006/picture">
                       <pic:pic>
                         <pic:nvPicPr>
-                          <pic:cNvPr descr="../figures/computational_benchmark/time_fold_increase.pdf" id="109" name="Picture"/>
+                          <pic:cNvPr descr="../figures/computational_benchmark/time_fold_increase.pdf" id="113" name="Picture"/>
                           <pic:cNvPicPr>
                             <a:picLocks noChangeArrowheads="1" noChangeAspect="1"/>
                           </pic:cNvPicPr>
                         </pic:nvPicPr>
                         <pic:blipFill>
-                          <a:blip r:embed="rId107"/>
+                          <a:blip r:embed="rId111"/>
                           <a:stretch>
                             <a:fillRect/>
                           </a:stretch>
@@ -4748,7 +4915,7 @@
               <w:t xml:space="preserve">Supplemental Figure 4: Workflow runtime increase compared to the fastest workflow (MMseqs2).</w:t>
             </w:r>
           </w:p>
-          <w:bookmarkEnd w:id="110"/>
+          <w:bookmarkEnd w:id="114"/>
         </w:tc>
       </w:tr>
     </w:tbl>
@@ -4762,7 +4929,7 @@
         <w:sectPr/>
       </w:pPr>
     </w:p>
-    <w:bookmarkStart w:id="112" w:name="supplementary-tables"/>
+    <w:bookmarkStart w:id="116" w:name="supplementary-tables"/>
     <w:p>
       <w:pPr>
         <w:pStyle w:val="Heading1"/>
@@ -4784,7 +4951,7 @@
       <w:tr>
         <w:tc>
           <w:tcPr/>
-          <w:bookmarkStart w:id="111" w:name="tbl-supp-functional-categories"/>
+          <w:bookmarkStart w:id="115" w:name="tbl-supp-functional-categories"/>
           <w:p>
             <w:pPr>
               <w:jc w:val="center"/>
@@ -7137,7 +7304,7 @@
               </w:tc>
             </w:tr>
           </w:tbl>
-          <w:bookmarkEnd w:id="111"/>
+          <w:bookmarkEnd w:id="115"/>
           <w:p/>
         </w:tc>
       </w:tr>
@@ -7149,8 +7316,8 @@
         </w:sectPr>
       </w:pPr>
     </w:p>
-    <w:bookmarkEnd w:id="112"/>
-    <w:bookmarkEnd w:id="113"/>
+    <w:bookmarkEnd w:id="116"/>
+    <w:bookmarkEnd w:id="117"/>
     <w:sectPr>
       <w:footnotePr>
         <w:numRestart w:val="eachSect"/>
@@ -7471,158 +7638,6 @@
       </w:rPr>
     </w:lvl>
   </w:abstractNum>
-  <w:abstractNum w:abstractNumId="992">
-    <w:nsid w:val="0000A992"/>
-    <w:multiLevelType w:val="multilevel"/>
-    <w:lvl w:ilvl="0">
-      <w:numFmt w:val="bullet"/>
-      <w:lvlText w:val="☐"/>
-      <w:lvlJc w:val="left"/>
-      <w:pPr>
-        <w:ind w:left="720" w:hanging="360"/>
-      </w:pPr>
-    </w:lvl>
-    <w:lvl w:ilvl="1">
-      <w:numFmt w:val="bullet"/>
-      <w:lvlText w:val="☐"/>
-      <w:lvlJc w:val="left"/>
-      <w:pPr>
-        <w:ind w:left="1440" w:hanging="360"/>
-      </w:pPr>
-    </w:lvl>
-    <w:lvl w:ilvl="2">
-      <w:numFmt w:val="bullet"/>
-      <w:lvlText w:val="☐"/>
-      <w:lvlJc w:val="left"/>
-      <w:pPr>
-        <w:ind w:left="2160" w:hanging="360"/>
-      </w:pPr>
-    </w:lvl>
-    <w:lvl w:ilvl="3">
-      <w:numFmt w:val="bullet"/>
-      <w:lvlText w:val="☐"/>
-      <w:lvlJc w:val="left"/>
-      <w:pPr>
-        <w:ind w:left="2880" w:hanging="360"/>
-      </w:pPr>
-    </w:lvl>
-    <w:lvl w:ilvl="4">
-      <w:numFmt w:val="bullet"/>
-      <w:lvlText w:val="☐"/>
-      <w:lvlJc w:val="left"/>
-      <w:pPr>
-        <w:ind w:left="3600" w:hanging="360"/>
-      </w:pPr>
-    </w:lvl>
-    <w:lvl w:ilvl="5">
-      <w:numFmt w:val="bullet"/>
-      <w:lvlText w:val="☐"/>
-      <w:lvlJc w:val="left"/>
-      <w:pPr>
-        <w:ind w:left="4320" w:hanging="360"/>
-      </w:pPr>
-    </w:lvl>
-    <w:lvl w:ilvl="6">
-      <w:numFmt w:val="bullet"/>
-      <w:lvlText w:val="☐"/>
-      <w:lvlJc w:val="left"/>
-      <w:pPr>
-        <w:ind w:left="5040" w:hanging="360"/>
-      </w:pPr>
-    </w:lvl>
-    <w:lvl w:ilvl="7">
-      <w:numFmt w:val="bullet"/>
-      <w:lvlText w:val="☐"/>
-      <w:lvlJc w:val="left"/>
-      <w:pPr>
-        <w:ind w:left="5760" w:hanging="360"/>
-      </w:pPr>
-    </w:lvl>
-    <w:lvl w:ilvl="8">
-      <w:numFmt w:val="bullet"/>
-      <w:lvlText w:val="☐"/>
-      <w:lvlJc w:val="left"/>
-      <w:pPr>
-        <w:ind w:left="6480" w:hanging="360"/>
-      </w:pPr>
-    </w:lvl>
-  </w:abstractNum>
-  <w:abstractNum w:abstractNumId="993">
-    <w:nsid w:val="0000A993"/>
-    <w:multiLevelType w:val="multilevel"/>
-    <w:lvl w:ilvl="0">
-      <w:numFmt w:val="bullet"/>
-      <w:lvlText w:val="☒"/>
-      <w:lvlJc w:val="left"/>
-      <w:pPr>
-        <w:ind w:left="720" w:hanging="360"/>
-      </w:pPr>
-    </w:lvl>
-    <w:lvl w:ilvl="1">
-      <w:numFmt w:val="bullet"/>
-      <w:lvlText w:val="☒"/>
-      <w:lvlJc w:val="left"/>
-      <w:pPr>
-        <w:ind w:left="1440" w:hanging="360"/>
-      </w:pPr>
-    </w:lvl>
-    <w:lvl w:ilvl="2">
-      <w:numFmt w:val="bullet"/>
-      <w:lvlText w:val="☒"/>
-      <w:lvlJc w:val="left"/>
-      <w:pPr>
-        <w:ind w:left="2160" w:hanging="360"/>
-      </w:pPr>
-    </w:lvl>
-    <w:lvl w:ilvl="3">
-      <w:numFmt w:val="bullet"/>
-      <w:lvlText w:val="☒"/>
-      <w:lvlJc w:val="left"/>
-      <w:pPr>
-        <w:ind w:left="2880" w:hanging="360"/>
-      </w:pPr>
-    </w:lvl>
-    <w:lvl w:ilvl="4">
-      <w:numFmt w:val="bullet"/>
-      <w:lvlText w:val="☒"/>
-      <w:lvlJc w:val="left"/>
-      <w:pPr>
-        <w:ind w:left="3600" w:hanging="360"/>
-      </w:pPr>
-    </w:lvl>
-    <w:lvl w:ilvl="5">
-      <w:numFmt w:val="bullet"/>
-      <w:lvlText w:val="☒"/>
-      <w:lvlJc w:val="left"/>
-      <w:pPr>
-        <w:ind w:left="4320" w:hanging="360"/>
-      </w:pPr>
-    </w:lvl>
-    <w:lvl w:ilvl="6">
-      <w:numFmt w:val="bullet"/>
-      <w:lvlText w:val="☒"/>
-      <w:lvlJc w:val="left"/>
-      <w:pPr>
-        <w:ind w:left="5040" w:hanging="360"/>
-      </w:pPr>
-    </w:lvl>
-    <w:lvl w:ilvl="7">
-      <w:numFmt w:val="bullet"/>
-      <w:lvlText w:val="☒"/>
-      <w:lvlJc w:val="left"/>
-      <w:pPr>
-        <w:ind w:left="5760" w:hanging="360"/>
-      </w:pPr>
-    </w:lvl>
-    <w:lvl w:ilvl="8">
-      <w:numFmt w:val="bullet"/>
-      <w:lvlText w:val="☒"/>
-      <w:lvlJc w:val="left"/>
-      <w:pPr>
-        <w:ind w:left="6480" w:hanging="360"/>
-      </w:pPr>
-    </w:lvl>
-  </w:abstractNum>
   <w:num w16cid:durableId="1189947306" w:numId="1">
     <w:abstractNumId w:val="0"/>
   </w:num>
@@ -7633,18 +7648,6 @@
     <w:abstractNumId w:val="991"/>
   </w:num>
   <w:num w:numId="1002">
-    <w:abstractNumId w:val="992"/>
-  </w:num>
-  <w:num w:numId="1003">
-    <w:abstractNumId w:val="992"/>
-  </w:num>
-  <w:num w:numId="1004">
-    <w:abstractNumId w:val="993"/>
-  </w:num>
-  <w:num w:numId="1005">
-    <w:abstractNumId w:val="991"/>
-  </w:num>
-  <w:num w:numId="1006">
     <w:abstractNumId w:val="991"/>
   </w:num>
 </w:numbering>

</xml_diff>

<commit_message>
Update functional category assignment logic and improve plot formatting
</commit_message>
<xml_diff>
--- a/manuscript/_manuscript/manuscript.docx
+++ b/manuscript/_manuscript/manuscript.docx
@@ -1083,14 +1083,13 @@
               <w:tblLook w:firstRow="1" w:lastRow="0" w:firstColumn="0" w:lastColumn="0" w:noHBand="0" w:noVBand="0" w:val="0020"/>
             </w:tblPr>
             <w:tblGrid>
-              <w:gridCol w:w="743"/>
-              <w:gridCol w:w="875"/>
-              <w:gridCol w:w="787"/>
-              <w:gridCol w:w="918"/>
-              <w:gridCol w:w="1006"/>
-              <w:gridCol w:w="1050"/>
-              <w:gridCol w:w="1225"/>
-              <w:gridCol w:w="1312"/>
+              <w:gridCol w:w="826"/>
+              <w:gridCol w:w="971"/>
+              <w:gridCol w:w="1020"/>
+              <w:gridCol w:w="1117"/>
+              <w:gridCol w:w="1166"/>
+              <w:gridCol w:w="1360"/>
+              <w:gridCol w:w="1457"/>
             </w:tblGrid>
             <w:tr>
               <w:trPr>
@@ -1134,22 +1133,6 @@
                     <w:jc w:val="center"/>
                   </w:pPr>
                   <w:r>
-                    <w:t xml:space="preserve">Complete</w:t>
-                  </w:r>
-                  <w:r>
-                    <w:t xml:space="preserve">match</w:t>
-                  </w:r>
-                </w:p>
-              </w:tc>
-              <w:tc>
-                <w:tcPr/>
-                <w:p>
-                  <w:pPr>
-                    <w:pStyle w:val="Compact"/>
-                    <w:jc w:val="right"/>
-                    <w:jc w:val="center"/>
-                  </w:pPr>
-                  <w:r>
                     <w:t xml:space="preserve">Informative</w:t>
                   </w:r>
                   <w:r>
@@ -1258,7 +1241,7 @@
                     <w:jc w:val="center"/>
                   </w:pPr>
                   <w:r>
-                    <w:t xml:space="preserve">8352</w:t>
+                    <w:t xml:space="preserve">2331</w:t>
                   </w:r>
                 </w:p>
               </w:tc>
@@ -1271,7 +1254,7 @@
                     <w:jc w:val="center"/>
                   </w:pPr>
                   <w:r>
-                    <w:t xml:space="preserve">2331</w:t>
+                    <w:t xml:space="preserve">7003</w:t>
                   </w:r>
                 </w:p>
               </w:tc>
@@ -1284,20 +1267,7 @@
                     <w:jc w:val="center"/>
                   </w:pPr>
                   <w:r>
-                    <w:t xml:space="preserve">6021</w:t>
-                  </w:r>
-                </w:p>
-              </w:tc>
-              <w:tc>
-                <w:tcPr/>
-                <w:p>
-                  <w:pPr>
-                    <w:pStyle w:val="Compact"/>
-                    <w:jc w:val="right"/>
-                    <w:jc w:val="center"/>
-                  </w:pPr>
-                  <w:r>
-                    <w:t xml:space="preserve">1216</w:t>
+                    <w:t xml:space="preserve">234</w:t>
                   </w:r>
                 </w:p>
               </w:tc>
@@ -1364,7 +1334,7 @@
                     <w:jc w:val="center"/>
                   </w:pPr>
                   <w:r>
-                    <w:t xml:space="preserve">8300</w:t>
+                    <w:t xml:space="preserve">2332</w:t>
                   </w:r>
                 </w:p>
               </w:tc>
@@ -1377,7 +1347,7 @@
                     <w:jc w:val="center"/>
                   </w:pPr>
                   <w:r>
-                    <w:t xml:space="preserve">2332</w:t>
+                    <w:t xml:space="preserve">6938</w:t>
                   </w:r>
                 </w:p>
               </w:tc>
@@ -1390,20 +1360,7 @@
                     <w:jc w:val="center"/>
                   </w:pPr>
                   <w:r>
-                    <w:t xml:space="preserve">5968</w:t>
-                  </w:r>
-                </w:p>
-              </w:tc>
-              <w:tc>
-                <w:tcPr/>
-                <w:p>
-                  <w:pPr>
-                    <w:pStyle w:val="Compact"/>
-                    <w:jc w:val="right"/>
-                    <w:jc w:val="center"/>
-                  </w:pPr>
-                  <w:r>
-                    <w:t xml:space="preserve">1206</w:t>
+                    <w:t xml:space="preserve">236</w:t>
                   </w:r>
                 </w:p>
               </w:tc>
@@ -1470,7 +1427,7 @@
                     <w:jc w:val="center"/>
                   </w:pPr>
                   <w:r>
-                    <w:t xml:space="preserve">8314</w:t>
+                    <w:t xml:space="preserve">2335</w:t>
                   </w:r>
                 </w:p>
               </w:tc>
@@ -1483,7 +1440,7 @@
                     <w:jc w:val="center"/>
                   </w:pPr>
                   <w:r>
-                    <w:t xml:space="preserve">2335</w:t>
+                    <w:t xml:space="preserve">6954</w:t>
                   </w:r>
                 </w:p>
               </w:tc>
@@ -1496,20 +1453,7 @@
                     <w:jc w:val="center"/>
                   </w:pPr>
                   <w:r>
-                    <w:t xml:space="preserve">5979</w:t>
-                  </w:r>
-                </w:p>
-              </w:tc>
-              <w:tc>
-                <w:tcPr/>
-                <w:p>
-                  <w:pPr>
-                    <w:pStyle w:val="Compact"/>
-                    <w:jc w:val="right"/>
-                    <w:jc w:val="center"/>
-                  </w:pPr>
-                  <w:r>
-                    <w:t xml:space="preserve">1213</w:t>
+                    <w:t xml:space="preserve">238</w:t>
                   </w:r>
                 </w:p>
               </w:tc>
@@ -1576,7 +1520,7 @@
                     <w:jc w:val="center"/>
                   </w:pPr>
                   <w:r>
-                    <w:t xml:space="preserve">4923</w:t>
+                    <w:t xml:space="preserve">1810</w:t>
                   </w:r>
                 </w:p>
               </w:tc>
@@ -1589,7 +1533,7 @@
                     <w:jc w:val="center"/>
                   </w:pPr>
                   <w:r>
-                    <w:t xml:space="preserve">1810</w:t>
+                    <w:t xml:space="preserve">3728</w:t>
                   </w:r>
                 </w:p>
               </w:tc>
@@ -1602,20 +1546,7 @@
                     <w:jc w:val="center"/>
                   </w:pPr>
                   <w:r>
-                    <w:t xml:space="preserve">3113</w:t>
-                  </w:r>
-                </w:p>
-              </w:tc>
-              <w:tc>
-                <w:tcPr/>
-                <w:p>
-                  <w:pPr>
-                    <w:pStyle w:val="Compact"/>
-                    <w:jc w:val="right"/>
-                    <w:jc w:val="center"/>
-                  </w:pPr>
-                  <w:r>
-                    <w:t xml:space="preserve">916</w:t>
+                    <w:t xml:space="preserve">301</w:t>
                   </w:r>
                 </w:p>
               </w:tc>
@@ -1682,7 +1613,7 @@
                     <w:jc w:val="center"/>
                   </w:pPr>
                   <w:r>
-                    <w:t xml:space="preserve">5703</w:t>
+                    <w:t xml:space="preserve">1881</w:t>
                   </w:r>
                 </w:p>
               </w:tc>
@@ -1695,7 +1626,7 @@
                     <w:jc w:val="center"/>
                   </w:pPr>
                   <w:r>
-                    <w:t xml:space="preserve">1881</w:t>
+                    <w:t xml:space="preserve">6025</w:t>
                   </w:r>
                 </w:p>
               </w:tc>
@@ -1708,20 +1639,7 @@
                     <w:jc w:val="center"/>
                   </w:pPr>
                   <w:r>
-                    <w:t xml:space="preserve">3822</w:t>
-                  </w:r>
-                </w:p>
-              </w:tc>
-              <w:tc>
-                <w:tcPr/>
-                <w:p>
-                  <w:pPr>
-                    <w:pStyle w:val="Compact"/>
-                    <w:jc w:val="right"/>
-                    <w:jc w:val="center"/>
-                  </w:pPr>
-                  <w:r>
-                    <w:t xml:space="preserve">2725</w:t>
+                    <w:t xml:space="preserve">522</w:t>
                   </w:r>
                 </w:p>
               </w:tc>
@@ -1788,7 +1706,7 @@
                     <w:jc w:val="center"/>
                   </w:pPr>
                   <w:r>
-                    <w:t xml:space="preserve">6112</w:t>
+                    <w:t xml:space="preserve">2176</w:t>
                   </w:r>
                 </w:p>
               </w:tc>
@@ -1801,7 +1719,7 @@
                     <w:jc w:val="center"/>
                   </w:pPr>
                   <w:r>
-                    <w:t xml:space="preserve">2176</w:t>
+                    <w:t xml:space="preserve">4682</w:t>
                   </w:r>
                 </w:p>
               </w:tc>
@@ -1814,20 +1732,7 @@
                     <w:jc w:val="center"/>
                   </w:pPr>
                   <w:r>
-                    <w:t xml:space="preserve">3936</w:t>
-                  </w:r>
-                </w:p>
-              </w:tc>
-              <w:tc>
-                <w:tcPr/>
-                <w:p>
-                  <w:pPr>
-                    <w:pStyle w:val="Compact"/>
-                    <w:jc w:val="right"/>
-                    <w:jc w:val="center"/>
-                  </w:pPr>
-                  <w:r>
-                    <w:t xml:space="preserve">1054</w:t>
+                    <w:t xml:space="preserve">308</w:t>
                   </w:r>
                 </w:p>
               </w:tc>
@@ -1894,7 +1799,7 @@
                     <w:jc w:val="center"/>
                   </w:pPr>
                   <w:r>
-                    <w:t xml:space="preserve">5119</w:t>
+                    <w:t xml:space="preserve">1996</w:t>
                   </w:r>
                 </w:p>
               </w:tc>
@@ -1907,7 +1812,7 @@
                     <w:jc w:val="center"/>
                   </w:pPr>
                   <w:r>
-                    <w:t xml:space="preserve">1996</w:t>
+                    <w:t xml:space="preserve">3630</w:t>
                   </w:r>
                 </w:p>
               </w:tc>
@@ -1920,20 +1825,7 @@
                     <w:jc w:val="center"/>
                   </w:pPr>
                   <w:r>
-                    <w:t xml:space="preserve">3123</w:t>
-                  </w:r>
-                </w:p>
-              </w:tc>
-              <w:tc>
-                <w:tcPr/>
-                <w:p>
-                  <w:pPr>
-                    <w:pStyle w:val="Compact"/>
-                    <w:jc w:val="right"/>
-                    <w:jc w:val="center"/>
-                  </w:pPr>
-                  <w:r>
-                    <w:t xml:space="preserve">723</w:t>
+                    <w:t xml:space="preserve">216</w:t>
                   </w:r>
                 </w:p>
               </w:tc>

</xml_diff>

<commit_message>
Update manuscript with author additions, structural flowchart, and minor discussion points
</commit_message>
<xml_diff>
--- a/manuscript/_manuscript/manuscript.docx
+++ b/manuscript/_manuscript/manuscript.docx
@@ -25,6 +25,15 @@
       </w:r>
       <w:r>
         <w:t xml:space="preserve">, Uri Neri</w:t>
+      </w:r>
+      <w:r>
+        <w:rPr>
+          <w:vertAlign w:val="superscript"/>
+        </w:rPr>
+        <w:t xml:space="preserve">2</w:t>
+      </w:r>
+      <w:r>
+        <w:t xml:space="preserve">, Susie Grigson</w:t>
       </w:r>
       <w:r>
         <w:rPr>
@@ -272,7 +281,7 @@
           <w:i/>
           <w:iCs/>
         </w:rPr>
-        <w:t xml:space="preserve">et al</w:t>
+        <w:t xml:space="preserve">et al.</w:t>
       </w:r>
       <w:r>
         <w:t xml:space="preserve"> </w:t>
@@ -337,13 +346,13 @@
       </w:r>
     </w:p>
     <w:bookmarkEnd w:id="10"/>
-    <w:bookmarkStart w:id="32" w:name="results-discussion"/>
+    <w:bookmarkStart w:id="32" w:name="results"/>
     <w:p>
       <w:pPr>
         <w:pStyle w:val="Heading1"/>
       </w:pPr>
       <w:r>
-        <w:t xml:space="preserve">Results &amp; Discussion</w:t>
+        <w:t xml:space="preserve">Results</w:t>
       </w:r>
     </w:p>
     <w:bookmarkStart w:id="15" w:name="dataset-overview"/>
@@ -2095,13 +2104,13 @@
     </w:tbl>
     <w:bookmarkEnd w:id="31"/>
     <w:bookmarkEnd w:id="32"/>
-    <w:bookmarkStart w:id="33" w:name="conclusion"/>
+    <w:bookmarkStart w:id="33" w:name="discussion"/>
     <w:p>
       <w:pPr>
         <w:pStyle w:val="Heading1"/>
       </w:pPr>
       <w:r>
-        <w:t xml:space="preserve">Conclusion</w:t>
+        <w:t xml:space="preserve">Discussion</w:t>
       </w:r>
     </w:p>
     <w:p>
@@ -2175,7 +2184,7 @@
         </w:numPr>
       </w:pPr>
       <w:r>
-        <w:t xml:space="preserve">add note on latest papers showing decreased performance of pLMs for viruses (eg. mutation scanning)</w:t>
+        <w:t xml:space="preserve">lack of virus representation in training data is a hurdle for the pLMs</w:t>
       </w:r>
     </w:p>
     <w:p>
@@ -2187,7 +2196,39 @@
         </w:numPr>
       </w:pPr>
       <w:r>
+        <w:t xml:space="preserve">add note on latest papers showing decreased performance of pLMs for viruses (eg. mutation scanning)</w:t>
+      </w:r>
+    </w:p>
+    <w:p>
+      <w:pPr>
+        <w:pStyle w:val="Compact"/>
+        <w:numPr>
+          <w:ilvl w:val="0"/>
+          <w:numId w:val="1002"/>
+        </w:numPr>
+      </w:pPr>
+      <w:r>
         <w:t xml:space="preserve">considerably higher runtime for little reward</w:t>
+      </w:r>
+    </w:p>
+    <w:p>
+      <w:pPr>
+        <w:pStyle w:val="FirstParagraph"/>
+      </w:pPr>
+      <w:r>
+        <w:t xml:space="preserve">Limitations:</w:t>
+      </w:r>
+      <w:r>
+        <w:t xml:space="preserve"> </w:t>
+      </w:r>
+      <w:r>
+        <w:t xml:space="preserve">- polyproteins: cutting in pieces, not real function (collection of proteins with different functions)</w:t>
+      </w:r>
+      <w:r>
+        <w:t xml:space="preserve"> </w:t>
+      </w:r>
+      <w:r>
+        <w:t xml:space="preserve">- classification (eg. nsp5), proteins same name different function -&gt; finetune LLM on scientific papers</w:t>
       </w:r>
     </w:p>
     <w:bookmarkEnd w:id="33"/>
@@ -4517,7 +4558,7 @@
       </w:r>
     </w:p>
     <w:bookmarkEnd w:id="97"/>
-    <w:bookmarkStart w:id="116" w:name="supplementary-figures"/>
+    <w:bookmarkStart w:id="120" w:name="supplementary-figures"/>
     <w:p>
       <w:pPr>
         <w:pStyle w:val="Heading1"/>
@@ -4866,25 +4907,7 @@
         </w:tc>
       </w:tr>
     </w:tbl>
-    <w:p>
-      <w:r>
-        <w:br w:type="page"/>
-      </w:r>
-    </w:p>
-    <w:p>
-      <w:pPr>
-        <w:sectPr/>
-      </w:pPr>
-    </w:p>
-    <w:bookmarkStart w:id="115" w:name="supplementary-tables"/>
-    <w:p>
-      <w:pPr>
-        <w:pStyle w:val="Heading1"/>
-      </w:pPr>
-      <w:r>
-        <w:t xml:space="preserve">Supplementary Tables</w:t>
-      </w:r>
-    </w:p>
+    <w:p/>
     <w:tbl>
       <w:tblPr>
         <w:tblStyle w:val="Table"/>
@@ -4898,7 +4921,114 @@
       <w:tr>
         <w:tc>
           <w:tcPr/>
-          <w:bookmarkStart w:id="114" w:name="tbl-supp-functional-categories"/>
+          <w:bookmarkStart w:id="117" w:name="suppfig-method-diagram"/>
+          <w:p>
+            <w:pPr>
+              <w:jc w:val="center"/>
+            </w:pPr>
+          </w:p>
+          <w:p>
+            <w:pPr>
+              <w:jc w:val="center"/>
+            </w:pPr>
+            <w:r>
+              <w:drawing>
+                <wp:inline>
+                  <wp:extent cx="5943600" cy="7641771"/>
+                  <wp:effectExtent b="0" l="0" r="0" t="0"/>
+                  <wp:docPr descr="" title="" id="115" name="Picture"/>
+                  <a:graphic>
+                    <a:graphicData uri="http://schemas.openxmlformats.org/drawingml/2006/picture">
+                      <pic:pic>
+                        <pic:nvPicPr>
+                          <pic:cNvPr descr="manuscript_files/figure-docx/mermaid-figure-2.png" id="116" name="Picture"/>
+                          <pic:cNvPicPr>
+                            <a:picLocks noChangeArrowheads="1" noChangeAspect="1"/>
+                          </pic:cNvPicPr>
+                        </pic:nvPicPr>
+                        <pic:blipFill>
+                          <a:blip r:embed="rId114"/>
+                          <a:stretch>
+                            <a:fillRect/>
+                          </a:stretch>
+                        </pic:blipFill>
+                        <pic:spPr bwMode="auto">
+                          <a:xfrm>
+                            <a:off x="0" y="0"/>
+                            <a:ext cx="5943600" cy="7641771"/>
+                          </a:xfrm>
+                          <a:prstGeom prst="rect">
+                            <a:avLst/>
+                          </a:prstGeom>
+                          <a:noFill/>
+                          <a:ln w="9525">
+                            <a:noFill/>
+                            <a:headEnd/>
+                            <a:tailEnd/>
+                          </a:ln>
+                        </pic:spPr>
+                      </pic:pic>
+                    </a:graphicData>
+                  </a:graphic>
+                </wp:inline>
+              </w:drawing>
+            </w:r>
+          </w:p>
+          <w:p>
+            <w:pPr>
+              <w:jc w:val="center"/>
+            </w:pPr>
+          </w:p>
+          <w:p>
+            <w:pPr>
+              <w:jc w:val="center"/>
+            </w:pPr>
+            <w:pPr>
+              <w:jc w:val="left"/>
+              <w:spacing w:before="200"/>
+              <w:pStyle w:val="ImageCaption"/>
+            </w:pPr>
+            <w:r>
+              <w:t xml:space="preserve">Supplemental Figure 5: Flowchart of the annotation pipeline used in this study. Eukaryotic virus proteins were selected from ICTV VMR v40.2, filtered to exclude bacteria- and archaea-hosted entries, and expanded into a final test set after retrieving all associated protein sequences and splitting very long proteins for structure prediction. The BFVD reference database was prepared separately by assigning functional categories to its entries using a custom name-based classifier for eukaryotic virus proteins and PHROG-like categories for bacteriophage proteins by Empathi. The test proteins were then compared against BFVD using three sequence methods (BLASTp, DIAMOND, MMseqs2), two embedding-based methods (ProstT5-3Di and TEA), and two structure-based methods (Foldseek and Reseek after Boltz-2 structure prediction). Hits were filtered by E-value, converted into weighted category scores, summed per functional category, and the highest-scoring category was chosen for each test protein, with a rule that preserves informative categories when they are sufficiently supported over uninformative ones.</w:t>
+            </w:r>
+          </w:p>
+          <w:bookmarkEnd w:id="117"/>
+        </w:tc>
+      </w:tr>
+    </w:tbl>
+    <w:p>
+      <w:r>
+        <w:br w:type="page"/>
+      </w:r>
+    </w:p>
+    <w:p>
+      <w:pPr>
+        <w:sectPr/>
+      </w:pPr>
+    </w:p>
+    <w:bookmarkStart w:id="119" w:name="supplementary-tables"/>
+    <w:p>
+      <w:pPr>
+        <w:pStyle w:val="Heading1"/>
+      </w:pPr>
+      <w:r>
+        <w:t xml:space="preserve">Supplementary Tables</w:t>
+      </w:r>
+    </w:p>
+    <w:tbl>
+      <w:tblPr>
+        <w:tblStyle w:val="Table"/>
+        <w:tblW w:type="pct" w:w="5000"/>
+        <w:tblLayout w:type="fixed"/>
+        <w:tblLook w:firstRow="0" w:lastRow="0" w:firstColumn="0" w:lastColumn="0" w:noHBand="0" w:noVBand="0" w:val="0000"/>
+      </w:tblPr>
+      <w:tblGrid>
+        <w:gridCol w:w="7920"/>
+      </w:tblGrid>
+      <w:tr>
+        <w:tc>
+          <w:tcPr/>
+          <w:bookmarkStart w:id="118" w:name="tbl-supp-functional-categories"/>
           <w:p>
             <w:pPr>
               <w:jc w:val="center"/>
@@ -7251,7 +7381,7 @@
               </w:tc>
             </w:tr>
           </w:tbl>
-          <w:bookmarkEnd w:id="114"/>
+          <w:bookmarkEnd w:id="118"/>
           <w:p/>
         </w:tc>
       </w:tr>
@@ -7263,8 +7393,8 @@
         </w:sectPr>
       </w:pPr>
     </w:p>
-    <w:bookmarkEnd w:id="115"/>
-    <w:bookmarkEnd w:id="116"/>
+    <w:bookmarkEnd w:id="119"/>
+    <w:bookmarkEnd w:id="120"/>
     <w:sectPr>
       <w:footnotePr>
         <w:numRestart w:val="eachSect"/>

</xml_diff>